<commit_message>
Replace portfolio documents with privacy-safe versions
</commit_message>
<xml_diff>
--- a/public/documents/campus-food-plan.docx
+++ b/public/documents/campus-food-plan.docx
@@ -1,13 +1,13 @@
 
 <file path=word/document.xml><?xml version="1.0" encoding="utf-8"?>
-<w:document xmlns:wpc="http://schemas.microsoft.com/office/word/2010/wordprocessingCanvas" xmlns:cx="http://schemas.microsoft.com/office/drawing/2014/chartex" xmlns:cx1="http://schemas.microsoft.com/office/drawing/2015/9/8/chartex" xmlns:cx2="http://schemas.microsoft.com/office/drawing/2015/10/21/chartex" xmlns:cx3="http://schemas.microsoft.com/office/drawing/2016/5/9/chartex" xmlns:cx4="http://schemas.microsoft.com/office/drawing/2016/5/10/chartex" xmlns:cx5="http://schemas.microsoft.com/office/drawing/2016/5/11/chartex" xmlns:cx6="http://schemas.microsoft.com/office/drawing/2016/5/12/chartex" xmlns:cx7="http://schemas.microsoft.com/office/drawing/2016/5/13/chartex" xmlns:cx8="http://schemas.microsoft.com/office/drawing/2016/5/14/chartex" xmlns:mc="http://schemas.openxmlformats.org/markup-compatibility/2006" xmlns:aink="http://schemas.microsoft.com/office/drawing/2016/ink" xmlns:am3d="http://schemas.microsoft.com/office/drawing/2017/model3d" xmlns:o="urn:schemas-microsoft-com:office:office" xmlns:oel="http://schemas.microsoft.com/office/2019/extlst" xmlns:r="http://schemas.openxmlformats.org/officeDocument/2006/relationships" xmlns:m="http://schemas.openxmlformats.org/officeDocument/2006/math" xmlns:v="urn:schemas-microsoft-com:vml" xmlns:wp14="http://schemas.microsoft.com/office/word/2010/wordprocessingDrawing" xmlns:wp="http://schemas.openxmlformats.org/drawingml/2006/wordprocessingDrawing" xmlns:w10="urn:schemas-microsoft-com:office:word" xmlns:w="http://schemas.openxmlformats.org/wordprocessingml/2006/main" xmlns:w14="http://schemas.microsoft.com/office/word/2010/wordml" xmlns:w15="http://schemas.microsoft.com/office/word/2012/wordml" xmlns:w16cex="http://schemas.microsoft.com/office/word/2018/wordml/cex" xmlns:w16cid="http://schemas.microsoft.com/office/word/2016/wordml/cid" xmlns:w16="http://schemas.microsoft.com/office/word/2018/wordml" xmlns:w16du="http://schemas.microsoft.com/office/word/2023/wordml/word16du" xmlns:w16sdtdh="http://schemas.microsoft.com/office/word/2020/wordml/sdtdatahash" xmlns:w16se="http://schemas.microsoft.com/office/word/2015/wordml/symex" xmlns:wpg="http://schemas.microsoft.com/office/word/2010/wordprocessingGroup" xmlns:wpi="http://schemas.microsoft.com/office/word/2010/wordprocessingInk" xmlns:wne="http://schemas.microsoft.com/office/word/2006/wordml" xmlns:wps="http://schemas.microsoft.com/office/word/2010/wordprocessingShape" mc:Ignorable="w14 w15 w16se w16cid w16 w16cex w16sdtdh w16du wp14">
+<w:document xmlns:wpc="http://schemas.microsoft.com/office/word/2010/wordprocessingCanvas" xmlns:cx="http://schemas.microsoft.com/office/drawing/2014/chartex" xmlns:cx1="http://schemas.microsoft.com/office/drawing/2015/9/8/chartex" xmlns:cx2="http://schemas.microsoft.com/office/drawing/2015/10/21/chartex" xmlns:cx3="http://schemas.microsoft.com/office/drawing/2016/5/9/chartex" xmlns:cx4="http://schemas.microsoft.com/office/drawing/2016/5/10/chartex" xmlns:cx5="http://schemas.microsoft.com/office/drawing/2016/5/11/chartex" xmlns:cx6="http://schemas.microsoft.com/office/drawing/2016/5/12/chartex" xmlns:cx7="http://schemas.microsoft.com/office/drawing/2016/5/13/chartex" xmlns:cx8="http://schemas.microsoft.com/office/drawing/2016/5/14/chartex" xmlns:mc="http://schemas.openxmlformats.org/markup-compatibility/2006" xmlns:aink="http://schemas.microsoft.com/office/drawing/2016/ink" xmlns:am3d="http://schemas.microsoft.com/office/drawing/2017/model3d" xmlns:o="urn:schemas-microsoft-com:office:office" xmlns:oel="http://schemas.microsoft.com/office/2019/extlst" xmlns:r="http://schemas.openxmlformats.org/officeDocument/2006/relationships" xmlns:m="http://schemas.openxmlformats.org/officeDocument/2006/math" xmlns:v="urn:schemas-microsoft-com:vml" xmlns:wp14="http://schemas.microsoft.com/office/word/2010/wordprocessingDrawing" xmlns:wp="http://schemas.openxmlformats.org/drawingml/2006/wordprocessingDrawing" xmlns:w10="urn:schemas-microsoft-com:office:word" xmlns:w="http://schemas.openxmlformats.org/wordprocessingml/2006/main" xmlns:w14="http://schemas.microsoft.com/office/word/2010/wordml" xmlns:w15="http://schemas.microsoft.com/office/word/2012/wordml" xmlns:w16cex="http://schemas.microsoft.com/office/word/2018/wordml/cex" xmlns:w16cid="http://schemas.microsoft.com/office/word/2016/wordml/cid" xmlns:w16="http://schemas.microsoft.com/office/word/2018/wordml" xmlns:w16du="http://schemas.microsoft.com/office/word/2023/wordml/word16du" xmlns:w16sdtdh="http://schemas.microsoft.com/office/word/2020/wordml/sdtdatahash" xmlns:w16sdtfl="http://schemas.microsoft.com/office/word/2024/wordml/sdtformatlock" xmlns:w16se="http://schemas.microsoft.com/office/word/2015/wordml/symex" xmlns:wpg="http://schemas.microsoft.com/office/word/2010/wordprocessingGroup" xmlns:wpi="http://schemas.microsoft.com/office/word/2010/wordprocessingInk" xmlns:wne="http://schemas.microsoft.com/office/word/2006/wordml" xmlns:wps="http://schemas.microsoft.com/office/word/2010/wordprocessingShape" mc:Ignorable="w14 w15 w16se w16cid w16 w16cex w16sdtdh w16sdtfl w16du wp14">
   <w:body>
     <w:p>
       <w:pPr>
         <w:spacing w:line="360" w:lineRule="auto"/>
         <w:jc w:val="center"/>
         <w:rPr>
-          <w:rFonts w:ascii="黑体" w:eastAsia="黑体" w:hAnsi="黑体" w:cs="黑体"/>
+          <w:rFonts w:ascii="黑体" w:eastAsia="黑体" w:hAnsi="黑体" w:cs="黑体" w:hint="eastAsia"/>
           <w:b/>
           <w:bCs/>
           <w:sz w:val="48"/>
@@ -16,549 +16,21 @@
       </w:pPr>
       <w:r>
         <w:rPr>
-          <w:rFonts w:ascii="宋体" w:eastAsia="宋体" w:hAnsi="宋体" w:cs="Times New Roman"/>
-          <w:b/>
-          <w:bCs/>
-          <w:noProof/>
-          <w:sz w:val="72"/>
-          <w:szCs w:val="72"/>
-        </w:rPr>
-        <w:drawing>
-          <wp:inline distT="0" distB="0" distL="0" distR="0" wp14:anchorId="0788DDA9" wp14:editId="28AC5AF6">
-            <wp:extent cx="4828540" cy="1304925"/>
-            <wp:effectExtent l="0" t="0" r="2540" b="5715"/>
-            <wp:docPr id="1061048165" name="图片 1"/>
-            <wp:cNvGraphicFramePr>
-              <a:graphicFrameLocks xmlns:a="http://schemas.openxmlformats.org/drawingml/2006/main" noChangeAspect="1"/>
-            </wp:cNvGraphicFramePr>
-            <a:graphic xmlns:a="http://schemas.openxmlformats.org/drawingml/2006/main">
-              <a:graphicData uri="http://schemas.openxmlformats.org/drawingml/2006/picture">
-                <pic:pic xmlns:pic="http://schemas.openxmlformats.org/drawingml/2006/picture">
-                  <pic:nvPicPr>
-                    <pic:cNvPr id="1061048165" name="图片 1"/>
-                    <pic:cNvPicPr>
-                      <a:picLocks noChangeAspect="1" noChangeArrowheads="1"/>
-                    </pic:cNvPicPr>
-                  </pic:nvPicPr>
-                  <pic:blipFill>
-                    <a:blip r:embed="rId7">
-                      <a:extLst>
-                        <a:ext uri="{28A0092B-C50C-407E-A947-70E740481C1C}">
-                          <a14:useLocalDpi xmlns:a14="http://schemas.microsoft.com/office/drawing/2010/main" val="0"/>
-                        </a:ext>
-                      </a:extLst>
-                    </a:blip>
-                    <a:srcRect/>
-                    <a:stretch>
-                      <a:fillRect/>
-                    </a:stretch>
-                  </pic:blipFill>
-                  <pic:spPr>
-                    <a:xfrm>
-                      <a:off x="0" y="0"/>
-                      <a:ext cx="4828540" cy="1304925"/>
-                    </a:xfrm>
-                    <a:prstGeom prst="rect">
-                      <a:avLst/>
-                    </a:prstGeom>
-                    <a:noFill/>
-                  </pic:spPr>
-                </pic:pic>
-              </a:graphicData>
-            </a:graphic>
-          </wp:inline>
-        </w:drawing>
-      </w:r>
-    </w:p>
-    <w:p>
-      <w:pPr>
-        <w:spacing w:line="360" w:lineRule="auto"/>
-        <w:rPr>
-          <w:rFonts w:ascii="黑体" w:eastAsia="黑体" w:hAnsi="黑体" w:cs="黑体"/>
-          <w:b/>
-          <w:bCs/>
-          <w:sz w:val="72"/>
-          <w:szCs w:val="72"/>
-        </w:rPr>
-      </w:pPr>
-    </w:p>
-    <w:p>
-      <w:pPr>
-        <w:spacing w:line="360" w:lineRule="auto"/>
-        <w:jc w:val="center"/>
-        <w:rPr>
-          <w:rFonts w:ascii="黑体" w:eastAsia="黑体" w:hAnsi="黑体" w:cs="黑体"/>
-          <w:b/>
-          <w:bCs/>
-          <w:sz w:val="72"/>
-          <w:szCs w:val="72"/>
-        </w:rPr>
-      </w:pPr>
-      <w:r>
-        <w:rPr>
           <w:rFonts w:ascii="黑体" w:eastAsia="黑体" w:hAnsi="黑体" w:cs="黑体" w:hint="eastAsia"/>
-          <w:b/>
-          <w:bCs/>
-          <w:sz w:val="72"/>
-          <w:szCs w:val="72"/>
-        </w:rPr>
-        <w:t>悦味之家——高校餐饮休闲娱乐一体化食堂</w:t>
-      </w:r>
-    </w:p>
-    <w:p>
-      <w:pPr>
-        <w:spacing w:line="360" w:lineRule="auto"/>
-        <w:jc w:val="center"/>
-        <w:rPr>
-          <w:rFonts w:ascii="黑体" w:eastAsia="黑体" w:hAnsi="黑体" w:cs="黑体"/>
           <w:b/>
           <w:bCs/>
           <w:sz w:val="48"/>
           <w:szCs w:val="48"/>
         </w:rPr>
-      </w:pPr>
-    </w:p>
-    <w:p>
-      <w:pPr>
+        <w:t>悦味之家——高校餐饮休闲娱乐一体化食堂</w:t>
+      </w:r>
+    </w:p>
+    <w:p>
+      <w:pPr>
+        <w:spacing w:line="360" w:lineRule="auto"/>
         <w:jc w:val="center"/>
         <w:rPr>
-          <w:rFonts w:ascii="宋体" w:eastAsia="宋体" w:hAnsi="宋体" w:cs="Times New Roman"/>
-          <w:b/>
-          <w:bCs/>
-          <w:sz w:val="36"/>
-          <w:szCs w:val="36"/>
-        </w:rPr>
-      </w:pPr>
-      <w:r>
-        <w:rPr>
-          <w:rFonts w:ascii="宋体" w:eastAsia="宋体" w:hAnsi="宋体" w:cs="Times New Roman" w:hint="eastAsia"/>
-          <w:b/>
-          <w:bCs/>
-          <w:sz w:val="36"/>
-          <w:szCs w:val="36"/>
-        </w:rPr>
-        <w:t>《人力资源管理》课程作业</w:t>
-      </w:r>
-    </w:p>
-    <w:p>
-      <w:pPr>
-        <w:jc w:val="center"/>
-        <w:rPr>
-          <w:rFonts w:ascii="宋体" w:eastAsia="宋体" w:hAnsi="宋体" w:cs="Times New Roman"/>
-          <w:b/>
-          <w:bCs/>
-          <w:sz w:val="36"/>
-          <w:szCs w:val="36"/>
-        </w:rPr>
-      </w:pPr>
-      <w:r>
-        <w:rPr>
-          <w:rFonts w:ascii="宋体" w:eastAsia="宋体" w:hAnsi="宋体" w:cs="Times New Roman" w:hint="eastAsia"/>
-          <w:b/>
-          <w:bCs/>
-          <w:sz w:val="36"/>
-          <w:szCs w:val="36"/>
-        </w:rPr>
-        <w:t>（2</w:t>
-      </w:r>
-      <w:r>
-        <w:rPr>
-          <w:rFonts w:ascii="宋体" w:eastAsia="宋体" w:hAnsi="宋体" w:cs="Times New Roman"/>
-          <w:b/>
-          <w:bCs/>
-          <w:sz w:val="36"/>
-          <w:szCs w:val="36"/>
-        </w:rPr>
-        <w:t>023-2024</w:t>
-      </w:r>
-      <w:r>
-        <w:rPr>
-          <w:rFonts w:ascii="宋体" w:eastAsia="宋体" w:hAnsi="宋体" w:cs="Times New Roman" w:hint="eastAsia"/>
-          <w:b/>
-          <w:bCs/>
-          <w:sz w:val="36"/>
-          <w:szCs w:val="36"/>
-        </w:rPr>
-        <w:t>学年第二学期）</w:t>
-      </w:r>
-    </w:p>
-    <w:p>
-      <w:pPr>
-        <w:jc w:val="center"/>
-        <w:rPr>
-          <w:rFonts w:ascii="宋体" w:eastAsia="宋体" w:hAnsi="宋体" w:cs="Times New Roman"/>
-          <w:b/>
-          <w:bCs/>
-          <w:sz w:val="36"/>
-          <w:szCs w:val="36"/>
-        </w:rPr>
-      </w:pPr>
-    </w:p>
-    <w:tbl>
-      <w:tblPr>
-        <w:tblStyle w:val="aa"/>
-        <w:tblW w:w="0" w:type="auto"/>
-        <w:tblBorders>
-          <w:top w:val="none" w:sz="0" w:space="0" w:color="auto"/>
-          <w:left w:val="none" w:sz="0" w:space="0" w:color="auto"/>
-          <w:bottom w:val="none" w:sz="0" w:space="0" w:color="auto"/>
-          <w:right w:val="none" w:sz="0" w:space="0" w:color="auto"/>
-          <w:insideH w:val="none" w:sz="0" w:space="0" w:color="auto"/>
-          <w:insideV w:val="none" w:sz="0" w:space="0" w:color="auto"/>
-        </w:tblBorders>
-        <w:tblLook w:val="04A0" w:firstRow="1" w:lastRow="0" w:firstColumn="1" w:lastColumn="0" w:noHBand="0" w:noVBand="1"/>
-      </w:tblPr>
-      <w:tblGrid>
-        <w:gridCol w:w="2689"/>
-        <w:gridCol w:w="5607"/>
-      </w:tblGrid>
-      <w:tr>
-        <w:tc>
-          <w:tcPr>
-            <w:tcW w:w="2689" w:type="dxa"/>
-            <w:tcBorders>
-              <w:top w:val="single" w:sz="4" w:space="0" w:color="auto"/>
-              <w:left w:val="single" w:sz="4" w:space="0" w:color="auto"/>
-              <w:bottom w:val="single" w:sz="4" w:space="0" w:color="auto"/>
-              <w:right w:val="single" w:sz="4" w:space="0" w:color="auto"/>
-            </w:tcBorders>
-            <w:vAlign w:val="center"/>
-          </w:tcPr>
-          <w:p>
-            <w:pPr>
-              <w:spacing w:afterLines="50" w:after="156" w:line="360" w:lineRule="auto"/>
-              <w:jc w:val="center"/>
-              <w:rPr>
-                <w:rFonts w:ascii="宋体" w:eastAsia="宋体" w:hAnsi="宋体"/>
-                <w:sz w:val="32"/>
-                <w:szCs w:val="32"/>
-              </w:rPr>
-            </w:pPr>
-            <w:r>
-              <w:rPr>
-                <w:rFonts w:ascii="宋体" w:eastAsia="宋体" w:hAnsi="宋体" w:hint="eastAsia"/>
-                <w:kern w:val="0"/>
-                <w:sz w:val="32"/>
-                <w:szCs w:val="32"/>
-              </w:rPr>
-              <w:t>小 组 成 员</w:t>
-            </w:r>
-            <w:r>
-              <w:rPr>
-                <w:rFonts w:ascii="宋体" w:eastAsia="宋体" w:hAnsi="宋体" w:hint="eastAsia"/>
-                <w:sz w:val="32"/>
-                <w:szCs w:val="32"/>
-              </w:rPr>
-              <w:t>：</w:t>
-            </w:r>
-          </w:p>
-        </w:tc>
-        <w:tc>
-          <w:tcPr>
-            <w:tcW w:w="5607" w:type="dxa"/>
-            <w:tcBorders>
-              <w:top w:val="single" w:sz="4" w:space="0" w:color="auto"/>
-              <w:left w:val="single" w:sz="4" w:space="0" w:color="auto"/>
-              <w:bottom w:val="single" w:sz="4" w:space="0" w:color="auto"/>
-              <w:right w:val="single" w:sz="4" w:space="0" w:color="auto"/>
-            </w:tcBorders>
-            <w:vAlign w:val="center"/>
-          </w:tcPr>
-          <w:p>
-            <w:pPr>
-              <w:spacing w:afterLines="50" w:after="156" w:line="360" w:lineRule="auto"/>
-              <w:jc w:val="center"/>
-              <w:rPr>
-                <w:rFonts w:ascii="宋体" w:eastAsia="宋体" w:hAnsi="宋体"/>
-                <w:sz w:val="32"/>
-                <w:szCs w:val="32"/>
-              </w:rPr>
-            </w:pPr>
-            <w:r>
-              <w:rPr>
-                <w:rFonts w:ascii="宋体" w:eastAsia="宋体" w:hAnsi="宋体" w:hint="eastAsia"/>
-                <w:sz w:val="32"/>
-                <w:szCs w:val="32"/>
-              </w:rPr>
-              <w:t>陈若宇、房培松、李白</w:t>
-            </w:r>
-          </w:p>
-        </w:tc>
-      </w:tr>
-      <w:tr>
-        <w:tc>
-          <w:tcPr>
-            <w:tcW w:w="2689" w:type="dxa"/>
-            <w:tcBorders>
-              <w:top w:val="single" w:sz="4" w:space="0" w:color="auto"/>
-              <w:left w:val="single" w:sz="4" w:space="0" w:color="auto"/>
-              <w:bottom w:val="single" w:sz="4" w:space="0" w:color="auto"/>
-              <w:right w:val="single" w:sz="4" w:space="0" w:color="auto"/>
-            </w:tcBorders>
-            <w:vAlign w:val="center"/>
-          </w:tcPr>
-          <w:p>
-            <w:pPr>
-              <w:spacing w:afterLines="50" w:after="156" w:line="360" w:lineRule="auto"/>
-              <w:jc w:val="center"/>
-              <w:rPr>
-                <w:rFonts w:ascii="宋体" w:eastAsia="宋体" w:hAnsi="宋体"/>
-                <w:sz w:val="32"/>
-                <w:szCs w:val="32"/>
-              </w:rPr>
-            </w:pPr>
-            <w:r>
-              <w:rPr>
-                <w:rFonts w:ascii="宋体" w:eastAsia="宋体" w:hAnsi="宋体" w:hint="eastAsia"/>
-                <w:spacing w:val="1440"/>
-                <w:kern w:val="0"/>
-                <w:sz w:val="32"/>
-                <w:szCs w:val="32"/>
-                <w:fitText w:val="2080" w:id="111680099"/>
-              </w:rPr>
-              <w:t>学</w:t>
-            </w:r>
-            <w:r>
-              <w:rPr>
-                <w:rFonts w:ascii="宋体" w:eastAsia="宋体" w:hAnsi="宋体" w:hint="eastAsia"/>
-                <w:kern w:val="0"/>
-                <w:sz w:val="32"/>
-                <w:szCs w:val="32"/>
-                <w:fitText w:val="2080" w:id="111680099"/>
-              </w:rPr>
-              <w:t>院</w:t>
-            </w:r>
-            <w:r>
-              <w:rPr>
-                <w:rFonts w:ascii="宋体" w:eastAsia="宋体" w:hAnsi="宋体" w:hint="eastAsia"/>
-                <w:sz w:val="32"/>
-                <w:szCs w:val="32"/>
-              </w:rPr>
-              <w:t>：</w:t>
-            </w:r>
-          </w:p>
-        </w:tc>
-        <w:tc>
-          <w:tcPr>
-            <w:tcW w:w="5607" w:type="dxa"/>
-            <w:tcBorders>
-              <w:top w:val="single" w:sz="4" w:space="0" w:color="auto"/>
-              <w:left w:val="single" w:sz="4" w:space="0" w:color="auto"/>
-              <w:bottom w:val="single" w:sz="4" w:space="0" w:color="auto"/>
-              <w:right w:val="single" w:sz="4" w:space="0" w:color="auto"/>
-            </w:tcBorders>
-            <w:vAlign w:val="center"/>
-          </w:tcPr>
-          <w:p>
-            <w:pPr>
-              <w:spacing w:afterLines="50" w:after="156" w:line="360" w:lineRule="auto"/>
-              <w:jc w:val="center"/>
-              <w:rPr>
-                <w:rFonts w:ascii="宋体" w:eastAsia="宋体" w:hAnsi="宋体"/>
-                <w:sz w:val="32"/>
-                <w:szCs w:val="32"/>
-              </w:rPr>
-            </w:pPr>
-            <w:r>
-              <w:rPr>
-                <w:rFonts w:ascii="宋体" w:eastAsia="宋体" w:hAnsi="宋体" w:hint="eastAsia"/>
-                <w:sz w:val="32"/>
-                <w:szCs w:val="32"/>
-              </w:rPr>
-              <w:t>政治与公共管理学院</w:t>
-            </w:r>
-          </w:p>
-        </w:tc>
-      </w:tr>
-      <w:tr>
-        <w:tc>
-          <w:tcPr>
-            <w:tcW w:w="2689" w:type="dxa"/>
-            <w:tcBorders>
-              <w:top w:val="single" w:sz="4" w:space="0" w:color="auto"/>
-              <w:left w:val="single" w:sz="4" w:space="0" w:color="auto"/>
-              <w:bottom w:val="single" w:sz="4" w:space="0" w:color="auto"/>
-              <w:right w:val="single" w:sz="4" w:space="0" w:color="auto"/>
-            </w:tcBorders>
-            <w:vAlign w:val="center"/>
-          </w:tcPr>
-          <w:p>
-            <w:pPr>
-              <w:spacing w:afterLines="50" w:after="156" w:line="360" w:lineRule="auto"/>
-              <w:jc w:val="center"/>
-              <w:rPr>
-                <w:rFonts w:ascii="宋体" w:eastAsia="宋体" w:hAnsi="宋体"/>
-                <w:sz w:val="32"/>
-                <w:szCs w:val="32"/>
-              </w:rPr>
-            </w:pPr>
-            <w:r>
-              <w:rPr>
-                <w:rFonts w:ascii="宋体" w:eastAsia="宋体" w:hAnsi="宋体" w:hint="eastAsia"/>
-                <w:spacing w:val="1440"/>
-                <w:kern w:val="0"/>
-                <w:sz w:val="32"/>
-                <w:szCs w:val="32"/>
-                <w:fitText w:val="2080" w:id="1381512300"/>
-              </w:rPr>
-              <w:t>专</w:t>
-            </w:r>
-            <w:r>
-              <w:rPr>
-                <w:rFonts w:ascii="宋体" w:eastAsia="宋体" w:hAnsi="宋体" w:hint="eastAsia"/>
-                <w:kern w:val="0"/>
-                <w:sz w:val="32"/>
-                <w:szCs w:val="32"/>
-                <w:fitText w:val="2080" w:id="1381512300"/>
-              </w:rPr>
-              <w:t>业</w:t>
-            </w:r>
-            <w:r>
-              <w:rPr>
-                <w:rFonts w:ascii="宋体" w:eastAsia="宋体" w:hAnsi="宋体" w:hint="eastAsia"/>
-                <w:sz w:val="32"/>
-                <w:szCs w:val="32"/>
-              </w:rPr>
-              <w:t>：</w:t>
-            </w:r>
-          </w:p>
-        </w:tc>
-        <w:tc>
-          <w:tcPr>
-            <w:tcW w:w="5607" w:type="dxa"/>
-            <w:tcBorders>
-              <w:top w:val="single" w:sz="4" w:space="0" w:color="auto"/>
-              <w:left w:val="single" w:sz="4" w:space="0" w:color="auto"/>
-              <w:bottom w:val="single" w:sz="4" w:space="0" w:color="auto"/>
-              <w:right w:val="single" w:sz="4" w:space="0" w:color="auto"/>
-            </w:tcBorders>
-            <w:vAlign w:val="center"/>
-          </w:tcPr>
-          <w:p>
-            <w:pPr>
-              <w:spacing w:afterLines="50" w:after="156" w:line="360" w:lineRule="auto"/>
-              <w:jc w:val="center"/>
-              <w:rPr>
-                <w:rFonts w:ascii="宋体" w:eastAsia="宋体" w:hAnsi="宋体"/>
-                <w:sz w:val="32"/>
-                <w:szCs w:val="32"/>
-              </w:rPr>
-            </w:pPr>
-            <w:r>
-              <w:rPr>
-                <w:rFonts w:ascii="宋体" w:eastAsia="宋体" w:hAnsi="宋体" w:hint="eastAsia"/>
-                <w:sz w:val="32"/>
-                <w:szCs w:val="32"/>
-              </w:rPr>
-              <w:t>公共事业管理</w:t>
-            </w:r>
-          </w:p>
-        </w:tc>
-      </w:tr>
-      <w:tr>
-        <w:tc>
-          <w:tcPr>
-            <w:tcW w:w="2689" w:type="dxa"/>
-            <w:tcBorders>
-              <w:top w:val="single" w:sz="4" w:space="0" w:color="auto"/>
-              <w:left w:val="single" w:sz="4" w:space="0" w:color="auto"/>
-              <w:bottom w:val="single" w:sz="4" w:space="0" w:color="auto"/>
-              <w:right w:val="single" w:sz="4" w:space="0" w:color="auto"/>
-            </w:tcBorders>
-            <w:vAlign w:val="center"/>
-          </w:tcPr>
-          <w:p>
-            <w:pPr>
-              <w:spacing w:afterLines="50" w:after="156" w:line="360" w:lineRule="auto"/>
-              <w:jc w:val="center"/>
-              <w:rPr>
-                <w:rFonts w:ascii="宋体" w:eastAsia="宋体" w:hAnsi="宋体"/>
-                <w:sz w:val="32"/>
-                <w:szCs w:val="32"/>
-              </w:rPr>
-            </w:pPr>
-            <w:r>
-              <w:rPr>
-                <w:rFonts w:ascii="宋体" w:eastAsia="宋体" w:hAnsi="宋体" w:hint="eastAsia"/>
-                <w:spacing w:val="266"/>
-                <w:kern w:val="0"/>
-                <w:sz w:val="32"/>
-                <w:szCs w:val="32"/>
-                <w:fitText w:val="2080" w:id="2023704093"/>
-              </w:rPr>
-              <w:t>指导老</w:t>
-            </w:r>
-            <w:r>
-              <w:rPr>
-                <w:rFonts w:ascii="宋体" w:eastAsia="宋体" w:hAnsi="宋体" w:hint="eastAsia"/>
-                <w:spacing w:val="2"/>
-                <w:kern w:val="0"/>
-                <w:sz w:val="32"/>
-                <w:szCs w:val="32"/>
-                <w:fitText w:val="2080" w:id="2023704093"/>
-              </w:rPr>
-              <w:t>师</w:t>
-            </w:r>
-            <w:r>
-              <w:rPr>
-                <w:rFonts w:ascii="宋体" w:eastAsia="宋体" w:hAnsi="宋体" w:hint="eastAsia"/>
-                <w:kern w:val="0"/>
-                <w:sz w:val="32"/>
-                <w:szCs w:val="32"/>
-              </w:rPr>
-              <w:t>：</w:t>
-            </w:r>
-          </w:p>
-        </w:tc>
-        <w:tc>
-          <w:tcPr>
-            <w:tcW w:w="5607" w:type="dxa"/>
-            <w:tcBorders>
-              <w:top w:val="single" w:sz="4" w:space="0" w:color="auto"/>
-              <w:left w:val="single" w:sz="4" w:space="0" w:color="auto"/>
-              <w:bottom w:val="single" w:sz="4" w:space="0" w:color="auto"/>
-              <w:right w:val="single" w:sz="4" w:space="0" w:color="auto"/>
-            </w:tcBorders>
-            <w:vAlign w:val="center"/>
-          </w:tcPr>
-          <w:p>
-            <w:pPr>
-              <w:spacing w:afterLines="50" w:after="156" w:line="360" w:lineRule="auto"/>
-              <w:jc w:val="center"/>
-              <w:rPr>
-                <w:rFonts w:ascii="宋体" w:eastAsia="宋体" w:hAnsi="宋体"/>
-                <w:sz w:val="32"/>
-                <w:szCs w:val="32"/>
-              </w:rPr>
-            </w:pPr>
-            <w:r>
-              <w:rPr>
-                <w:rFonts w:ascii="宋体" w:eastAsia="宋体" w:hAnsi="宋体" w:hint="eastAsia"/>
-                <w:sz w:val="32"/>
-                <w:szCs w:val="32"/>
-              </w:rPr>
-              <w:t>龙君伟</w:t>
-            </w:r>
-          </w:p>
-        </w:tc>
-      </w:tr>
-    </w:tbl>
-    <w:p>
-      <w:pPr>
-        <w:widowControl/>
-        <w:jc w:val="left"/>
-        <w:rPr>
-          <w:sz w:val="36"/>
-          <w:szCs w:val="36"/>
-        </w:rPr>
-      </w:pPr>
-    </w:p>
-    <w:p>
-      <w:pPr>
-        <w:spacing w:line="360" w:lineRule="auto"/>
-        <w:jc w:val="center"/>
-        <w:rPr>
-          <w:rFonts w:ascii="黑体" w:eastAsia="黑体" w:hAnsi="黑体" w:cs="黑体"/>
+          <w:rFonts w:ascii="黑体" w:eastAsia="黑体" w:hAnsi="黑体" w:cs="黑体" w:hint="eastAsia"/>
           <w:b/>
           <w:bCs/>
           <w:sz w:val="48"/>
@@ -569,83 +41,8 @@
     <w:p>
       <w:pPr>
         <w:spacing w:line="360" w:lineRule="auto"/>
-        <w:jc w:val="center"/>
-        <w:rPr>
-          <w:rFonts w:ascii="黑体" w:eastAsia="黑体" w:hAnsi="黑体" w:cs="黑体"/>
-          <w:b/>
-          <w:bCs/>
-          <w:sz w:val="48"/>
-          <w:szCs w:val="48"/>
-        </w:rPr>
-      </w:pPr>
-    </w:p>
-    <w:p>
-      <w:pPr>
-        <w:spacing w:line="360" w:lineRule="auto"/>
-        <w:rPr>
-          <w:rFonts w:ascii="黑体" w:eastAsia="黑体" w:hAnsi="黑体" w:cs="黑体"/>
-          <w:b/>
-          <w:bCs/>
-          <w:sz w:val="48"/>
-          <w:szCs w:val="48"/>
-        </w:rPr>
-      </w:pPr>
-    </w:p>
-    <w:p>
-      <w:pPr>
-        <w:spacing w:line="360" w:lineRule="auto"/>
-        <w:jc w:val="center"/>
-        <w:rPr>
-          <w:rFonts w:ascii="黑体" w:eastAsia="黑体" w:hAnsi="黑体" w:cs="黑体"/>
-          <w:b/>
-          <w:bCs/>
-          <w:sz w:val="48"/>
-          <w:szCs w:val="48"/>
-        </w:rPr>
-      </w:pPr>
-    </w:p>
-    <w:p>
-      <w:pPr>
-        <w:spacing w:line="360" w:lineRule="auto"/>
-        <w:jc w:val="center"/>
-        <w:rPr>
-          <w:rFonts w:ascii="黑体" w:eastAsia="黑体" w:hAnsi="黑体" w:cs="黑体"/>
-          <w:b/>
-          <w:bCs/>
-          <w:sz w:val="48"/>
-          <w:szCs w:val="48"/>
-        </w:rPr>
-      </w:pPr>
-      <w:r>
-        <w:rPr>
-          <w:rFonts w:ascii="黑体" w:eastAsia="黑体" w:hAnsi="黑体" w:cs="黑体" w:hint="eastAsia"/>
-          <w:b/>
-          <w:bCs/>
-          <w:sz w:val="48"/>
-          <w:szCs w:val="48"/>
-        </w:rPr>
-        <w:lastRenderedPageBreak/>
-        <w:t>悦味之家——高校餐饮休闲娱乐一体化食堂</w:t>
-      </w:r>
-    </w:p>
-    <w:p>
-      <w:pPr>
-        <w:spacing w:line="360" w:lineRule="auto"/>
-        <w:jc w:val="center"/>
-        <w:rPr>
-          <w:rFonts w:ascii="黑体" w:eastAsia="黑体" w:hAnsi="黑体" w:cs="黑体"/>
-          <w:b/>
-          <w:bCs/>
-          <w:sz w:val="48"/>
-          <w:szCs w:val="48"/>
-        </w:rPr>
-      </w:pPr>
-    </w:p>
-    <w:p>
-      <w:pPr>
-        <w:spacing w:line="360" w:lineRule="auto"/>
-        <w:rPr>
-          <w:rFonts w:ascii="宋体" w:eastAsia="宋体" w:hAnsi="宋体" w:cs="宋体"/>
+        <w:rPr>
+          <w:rFonts w:ascii="宋体" w:eastAsia="宋体" w:hAnsi="宋体" w:cs="宋体" w:hint="eastAsia"/>
           <w:sz w:val="28"/>
           <w:szCs w:val="28"/>
         </w:rPr>
@@ -665,7 +62,7 @@
       <w:pPr>
         <w:spacing w:line="360" w:lineRule="auto"/>
         <w:rPr>
-          <w:rFonts w:ascii="宋体" w:eastAsia="宋体" w:hAnsi="宋体" w:cs="宋体"/>
+          <w:rFonts w:ascii="宋体" w:eastAsia="宋体" w:hAnsi="宋体" w:cs="宋体" w:hint="eastAsia"/>
           <w:b/>
           <w:bCs/>
           <w:sz w:val="24"/>
@@ -688,7 +85,7 @@
         <w:spacing w:line="360" w:lineRule="auto"/>
         <w:ind w:firstLineChars="200" w:firstLine="482"/>
         <w:rPr>
-          <w:rFonts w:ascii="宋体" w:eastAsia="宋体" w:hAnsi="宋体" w:cs="宋体"/>
+          <w:rFonts w:ascii="宋体" w:eastAsia="宋体" w:hAnsi="宋体" w:cs="宋体" w:hint="eastAsia"/>
           <w:sz w:val="24"/>
           <w:szCs w:val="24"/>
         </w:rPr>
@@ -734,7 +131,7 @@
         <w:spacing w:line="360" w:lineRule="auto"/>
         <w:ind w:firstLineChars="200" w:firstLine="482"/>
         <w:rPr>
-          <w:rFonts w:ascii="宋体" w:eastAsia="宋体" w:hAnsi="宋体" w:cs="宋体"/>
+          <w:rFonts w:ascii="宋体" w:eastAsia="宋体" w:hAnsi="宋体" w:cs="宋体" w:hint="eastAsia"/>
           <w:sz w:val="24"/>
           <w:szCs w:val="24"/>
         </w:rPr>
@@ -763,7 +160,7 @@
         <w:spacing w:line="360" w:lineRule="auto"/>
         <w:ind w:firstLineChars="200" w:firstLine="482"/>
         <w:rPr>
-          <w:rFonts w:ascii="宋体" w:eastAsia="宋体" w:hAnsi="宋体" w:cs="宋体"/>
+          <w:rFonts w:ascii="宋体" w:eastAsia="宋体" w:hAnsi="宋体" w:cs="宋体" w:hint="eastAsia"/>
           <w:sz w:val="24"/>
           <w:szCs w:val="24"/>
         </w:rPr>
@@ -791,7 +188,7 @@
       <w:pPr>
         <w:spacing w:line="360" w:lineRule="auto"/>
         <w:rPr>
-          <w:rFonts w:ascii="宋体" w:eastAsia="宋体" w:hAnsi="宋体" w:cs="宋体"/>
+          <w:rFonts w:ascii="宋体" w:eastAsia="宋体" w:hAnsi="宋体" w:cs="宋体" w:hint="eastAsia"/>
           <w:b/>
           <w:bCs/>
           <w:sz w:val="24"/>
@@ -831,7 +228,7 @@
       <w:pPr>
         <w:spacing w:line="360" w:lineRule="auto"/>
         <w:rPr>
-          <w:rFonts w:ascii="宋体" w:eastAsia="宋体" w:hAnsi="宋体" w:cs="宋体"/>
+          <w:rFonts w:ascii="宋体" w:eastAsia="宋体" w:hAnsi="宋体" w:cs="宋体" w:hint="eastAsia"/>
           <w:sz w:val="24"/>
           <w:szCs w:val="24"/>
         </w:rPr>
@@ -878,7 +275,7 @@
         <w:spacing w:line="360" w:lineRule="auto"/>
         <w:ind w:firstLineChars="200" w:firstLine="482"/>
         <w:rPr>
-          <w:rFonts w:ascii="宋体" w:eastAsia="宋体" w:hAnsi="宋体" w:cs="宋体"/>
+          <w:rFonts w:ascii="宋体" w:eastAsia="宋体" w:hAnsi="宋体" w:cs="宋体" w:hint="eastAsia"/>
           <w:color w:val="333333"/>
           <w:sz w:val="24"/>
           <w:szCs w:val="24"/>
@@ -921,7 +318,7 @@
         <w:spacing w:line="360" w:lineRule="auto"/>
         <w:ind w:firstLineChars="200" w:firstLine="480"/>
         <w:rPr>
-          <w:rFonts w:ascii="宋体" w:eastAsia="宋体" w:hAnsi="宋体" w:cs="宋体"/>
+          <w:rFonts w:ascii="宋体" w:eastAsia="宋体" w:hAnsi="宋体" w:cs="宋体" w:hint="eastAsia"/>
           <w:color w:val="333333"/>
           <w:sz w:val="24"/>
           <w:szCs w:val="24"/>
@@ -954,7 +351,7 @@
                     </pic:cNvPicPr>
                   </pic:nvPicPr>
                   <pic:blipFill>
-                    <a:blip r:embed="rId8">
+                    <a:blip r:embed="rId7">
                       <a:extLst>
                         <a:ext uri="{28A0092B-C50C-407E-A947-70E740481C1C}">
                           <a14:useLocalDpi xmlns:a14="http://schemas.microsoft.com/office/drawing/2010/main" val="0"/>
@@ -986,7 +383,7 @@
         <w:spacing w:line="360" w:lineRule="auto"/>
         <w:ind w:firstLineChars="200" w:firstLine="480"/>
         <w:rPr>
-          <w:rFonts w:ascii="宋体" w:eastAsia="宋体" w:hAnsi="宋体" w:cs="宋体"/>
+          <w:rFonts w:ascii="宋体" w:eastAsia="宋体" w:hAnsi="宋体" w:cs="宋体" w:hint="eastAsia"/>
           <w:color w:val="333333"/>
           <w:sz w:val="24"/>
           <w:szCs w:val="24"/>
@@ -1007,7 +404,7 @@
         <w:spacing w:line="360" w:lineRule="auto"/>
         <w:ind w:firstLineChars="200" w:firstLine="420"/>
         <w:rPr>
-          <w:rFonts w:ascii="宋体" w:eastAsia="宋体" w:hAnsi="宋体" w:cs="宋体"/>
+          <w:rFonts w:ascii="宋体" w:eastAsia="宋体" w:hAnsi="宋体" w:cs="宋体" w:hint="eastAsia"/>
           <w:color w:val="333333"/>
           <w:sz w:val="24"/>
           <w:szCs w:val="24"/>
@@ -1037,7 +434,7 @@
                     </pic:cNvPicPr>
                   </pic:nvPicPr>
                   <pic:blipFill>
-                    <a:blip r:embed="rId9">
+                    <a:blip r:embed="rId8">
                       <a:extLst>
                         <a:ext uri="{28A0092B-C50C-407E-A947-70E740481C1C}">
                           <a14:useLocalDpi xmlns:a14="http://schemas.microsoft.com/office/drawing/2010/main" val="0"/>
@@ -1074,7 +471,7 @@
         <w:spacing w:line="360" w:lineRule="auto"/>
         <w:ind w:firstLineChars="200" w:firstLine="480"/>
         <w:rPr>
-          <w:rFonts w:ascii="宋体" w:eastAsia="宋体" w:hAnsi="宋体" w:cs="宋体"/>
+          <w:rFonts w:ascii="宋体" w:eastAsia="宋体" w:hAnsi="宋体" w:cs="宋体" w:hint="eastAsia"/>
           <w:color w:val="333333"/>
           <w:sz w:val="24"/>
           <w:szCs w:val="24"/>
@@ -1095,7 +492,7 @@
         <w:spacing w:line="360" w:lineRule="auto"/>
         <w:ind w:firstLineChars="200" w:firstLine="480"/>
         <w:rPr>
-          <w:rFonts w:ascii="宋体" w:eastAsia="宋体" w:hAnsi="宋体" w:cs="宋体"/>
+          <w:rFonts w:ascii="宋体" w:eastAsia="宋体" w:hAnsi="宋体" w:cs="宋体" w:hint="eastAsia"/>
           <w:color w:val="333333"/>
           <w:sz w:val="24"/>
           <w:szCs w:val="24"/>
@@ -1110,7 +507,7 @@
           <w:szCs w:val="24"/>
         </w:rPr>
         <w:drawing>
-          <wp:inline distT="0" distB="0" distL="0" distR="0" wp14:anchorId="4180C27F" wp14:editId="60EC3B4A">
+          <wp:inline distT="0" distB="0" distL="0" distR="0" wp14:anchorId="4180C27F" wp14:editId="657C52B3">
             <wp:extent cx="5274310" cy="2907665"/>
             <wp:effectExtent l="0" t="0" r="0" b="0"/>
             <wp:docPr id="520814437" name="图片 1"/>
@@ -1127,7 +524,7 @@
                     </pic:cNvPicPr>
                   </pic:nvPicPr>
                   <pic:blipFill>
-                    <a:blip r:embed="rId10" cstate="print">
+                    <a:blip r:embed="rId9" cstate="print">
                       <a:extLst>
                         <a:ext uri="{28A0092B-C50C-407E-A947-70E740481C1C}">
                           <a14:useLocalDpi xmlns:a14="http://schemas.microsoft.com/office/drawing/2010/main" val="0"/>
@@ -1159,7 +556,7 @@
         <w:spacing w:line="360" w:lineRule="auto"/>
         <w:ind w:firstLineChars="400" w:firstLine="964"/>
         <w:rPr>
-          <w:rFonts w:ascii="宋体" w:eastAsia="宋体" w:hAnsi="宋体" w:cs="宋体"/>
+          <w:rFonts w:ascii="宋体" w:eastAsia="宋体" w:hAnsi="宋体" w:cs="宋体" w:hint="eastAsia"/>
           <w:sz w:val="24"/>
           <w:szCs w:val="24"/>
         </w:rPr>
@@ -1199,7 +596,7 @@
         <w:spacing w:line="360" w:lineRule="auto"/>
         <w:ind w:firstLineChars="200" w:firstLine="420"/>
         <w:rPr>
-          <w:rFonts w:ascii="宋体" w:eastAsia="宋体" w:hAnsi="宋体" w:cs="宋体"/>
+          <w:rFonts w:ascii="宋体" w:eastAsia="宋体" w:hAnsi="宋体" w:cs="宋体" w:hint="eastAsia"/>
           <w:sz w:val="24"/>
           <w:szCs w:val="24"/>
         </w:rPr>
@@ -1227,7 +624,7 @@
                     </pic:cNvPicPr>
                   </pic:nvPicPr>
                   <pic:blipFill>
-                    <a:blip r:embed="rId11"/>
+                    <a:blip r:embed="rId10"/>
                     <a:stretch>
                       <a:fillRect/>
                     </a:stretch>
@@ -1253,7 +650,7 @@
         <w:spacing w:line="360" w:lineRule="auto"/>
         <w:ind w:firstLineChars="200" w:firstLine="482"/>
         <w:rPr>
-          <w:rFonts w:ascii="宋体" w:eastAsia="宋体" w:hAnsi="宋体" w:cs="宋体"/>
+          <w:rFonts w:ascii="宋体" w:eastAsia="宋体" w:hAnsi="宋体" w:cs="宋体" w:hint="eastAsia"/>
           <w:sz w:val="24"/>
           <w:szCs w:val="24"/>
         </w:rPr>
@@ -1282,7 +679,7 @@
         <w:spacing w:line="360" w:lineRule="auto"/>
         <w:ind w:firstLineChars="200" w:firstLine="480"/>
         <w:rPr>
-          <w:rFonts w:ascii="宋体" w:eastAsia="宋体" w:hAnsi="宋体" w:cs="宋体"/>
+          <w:rFonts w:ascii="宋体" w:eastAsia="宋体" w:hAnsi="宋体" w:cs="宋体" w:hint="eastAsia"/>
           <w:sz w:val="24"/>
           <w:szCs w:val="24"/>
         </w:rPr>
@@ -1312,7 +709,7 @@
                     </pic:cNvPicPr>
                   </pic:nvPicPr>
                   <pic:blipFill>
-                    <a:blip r:embed="rId12">
+                    <a:blip r:embed="rId11">
                       <a:extLst>
                         <a:ext uri="{28A0092B-C50C-407E-A947-70E740481C1C}">
                           <a14:useLocalDpi xmlns:a14="http://schemas.microsoft.com/office/drawing/2010/main" val="0"/>
@@ -1343,7 +740,7 @@
       <w:pPr>
         <w:spacing w:line="360" w:lineRule="auto"/>
         <w:rPr>
-          <w:rFonts w:ascii="宋体" w:eastAsia="宋体" w:hAnsi="宋体" w:cs="宋体"/>
+          <w:rFonts w:ascii="宋体" w:eastAsia="宋体" w:hAnsi="宋体" w:cs="宋体" w:hint="eastAsia"/>
           <w:sz w:val="24"/>
           <w:szCs w:val="24"/>
         </w:rPr>
@@ -1382,7 +779,7 @@
         <w:spacing w:line="360" w:lineRule="auto"/>
         <w:ind w:firstLineChars="200" w:firstLine="480"/>
         <w:rPr>
-          <w:rFonts w:ascii="宋体" w:eastAsia="宋体" w:hAnsi="宋体" w:cs="宋体"/>
+          <w:rFonts w:ascii="宋体" w:eastAsia="宋体" w:hAnsi="宋体" w:cs="宋体" w:hint="eastAsia"/>
           <w:sz w:val="24"/>
           <w:szCs w:val="24"/>
         </w:rPr>
@@ -1401,7 +798,7 @@
         <w:spacing w:line="360" w:lineRule="auto"/>
         <w:ind w:firstLineChars="200" w:firstLine="480"/>
         <w:rPr>
-          <w:rFonts w:ascii="宋体" w:eastAsia="宋体" w:hAnsi="宋体" w:cs="宋体"/>
+          <w:rFonts w:ascii="宋体" w:eastAsia="宋体" w:hAnsi="宋体" w:cs="宋体" w:hint="eastAsia"/>
           <w:sz w:val="24"/>
           <w:szCs w:val="24"/>
         </w:rPr>
@@ -1420,7 +817,7 @@
         <w:spacing w:line="360" w:lineRule="auto"/>
         <w:ind w:firstLineChars="200" w:firstLine="480"/>
         <w:rPr>
-          <w:rFonts w:ascii="宋体" w:eastAsia="宋体" w:hAnsi="宋体" w:cs="宋体"/>
+          <w:rFonts w:ascii="宋体" w:eastAsia="宋体" w:hAnsi="宋体" w:cs="宋体" w:hint="eastAsia"/>
           <w:sz w:val="24"/>
           <w:szCs w:val="24"/>
         </w:rPr>
@@ -1447,17 +844,17 @@
       <w:pPr>
         <w:spacing w:line="360" w:lineRule="auto"/>
         <w:rPr>
-          <w:rFonts w:ascii="宋体" w:eastAsia="宋体" w:hAnsi="宋体" w:cs="宋体"/>
-          <w:sz w:val="24"/>
-          <w:szCs w:val="24"/>
-        </w:rPr>
-      </w:pPr>
-    </w:p>
-    <w:p>
-      <w:pPr>
-        <w:spacing w:line="360" w:lineRule="auto"/>
-        <w:rPr>
-          <w:rFonts w:ascii="宋体" w:eastAsia="宋体" w:hAnsi="宋体" w:cs="宋体"/>
+          <w:rFonts w:ascii="宋体" w:eastAsia="宋体" w:hAnsi="宋体" w:cs="宋体" w:hint="eastAsia"/>
+          <w:sz w:val="24"/>
+          <w:szCs w:val="24"/>
+        </w:rPr>
+      </w:pPr>
+    </w:p>
+    <w:p>
+      <w:pPr>
+        <w:spacing w:line="360" w:lineRule="auto"/>
+        <w:rPr>
+          <w:rFonts w:ascii="宋体" w:eastAsia="宋体" w:hAnsi="宋体" w:cs="宋体" w:hint="eastAsia"/>
           <w:b/>
           <w:bCs/>
           <w:sz w:val="28"/>
@@ -1480,7 +877,7 @@
         <w:spacing w:line="360" w:lineRule="auto"/>
         <w:ind w:firstLineChars="200" w:firstLine="482"/>
         <w:rPr>
-          <w:rFonts w:ascii="宋体" w:eastAsia="宋体" w:hAnsi="宋体" w:cs="宋体"/>
+          <w:rFonts w:ascii="宋体" w:eastAsia="宋体" w:hAnsi="宋体" w:cs="宋体" w:hint="eastAsia"/>
           <w:b/>
           <w:bCs/>
           <w:sz w:val="24"/>
@@ -1502,7 +899,7 @@
       <w:pPr>
         <w:spacing w:line="360" w:lineRule="auto"/>
         <w:rPr>
-          <w:rFonts w:ascii="宋体" w:eastAsia="宋体" w:hAnsi="宋体" w:cs="宋体"/>
+          <w:rFonts w:ascii="宋体" w:eastAsia="宋体" w:hAnsi="宋体" w:cs="宋体" w:hint="eastAsia"/>
           <w:sz w:val="24"/>
           <w:szCs w:val="24"/>
         </w:rPr>
@@ -1521,7 +918,7 @@
         <w:spacing w:line="360" w:lineRule="auto"/>
         <w:ind w:firstLineChars="200" w:firstLine="480"/>
         <w:rPr>
-          <w:rFonts w:ascii="宋体" w:eastAsia="宋体" w:hAnsi="宋体" w:cs="宋体"/>
+          <w:rFonts w:ascii="宋体" w:eastAsia="宋体" w:hAnsi="宋体" w:cs="宋体" w:hint="eastAsia"/>
           <w:sz w:val="24"/>
           <w:szCs w:val="24"/>
         </w:rPr>
@@ -1540,7 +937,7 @@
         <w:spacing w:line="360" w:lineRule="auto"/>
         <w:ind w:firstLineChars="200" w:firstLine="480"/>
         <w:rPr>
-          <w:rFonts w:ascii="宋体" w:eastAsia="宋体" w:hAnsi="宋体" w:cs="宋体"/>
+          <w:rFonts w:ascii="宋体" w:eastAsia="宋体" w:hAnsi="宋体" w:cs="宋体" w:hint="eastAsia"/>
           <w:sz w:val="24"/>
           <w:szCs w:val="24"/>
         </w:rPr>
@@ -1559,7 +956,7 @@
         <w:spacing w:line="360" w:lineRule="auto"/>
         <w:ind w:firstLineChars="200" w:firstLine="480"/>
         <w:rPr>
-          <w:rFonts w:ascii="宋体" w:eastAsia="宋体" w:hAnsi="宋体" w:cs="宋体"/>
+          <w:rFonts w:ascii="宋体" w:eastAsia="宋体" w:hAnsi="宋体" w:cs="宋体" w:hint="eastAsia"/>
           <w:sz w:val="24"/>
           <w:szCs w:val="24"/>
         </w:rPr>
@@ -1578,7 +975,7 @@
         <w:spacing w:line="360" w:lineRule="auto"/>
         <w:ind w:firstLineChars="200" w:firstLine="480"/>
         <w:rPr>
-          <w:rFonts w:ascii="宋体" w:eastAsia="宋体" w:hAnsi="宋体" w:cs="宋体"/>
+          <w:rFonts w:ascii="宋体" w:eastAsia="宋体" w:hAnsi="宋体" w:cs="宋体" w:hint="eastAsia"/>
           <w:sz w:val="24"/>
           <w:szCs w:val="24"/>
         </w:rPr>
@@ -1636,7 +1033,7 @@
       <w:pPr>
         <w:spacing w:line="360" w:lineRule="auto"/>
         <w:rPr>
-          <w:rFonts w:ascii="宋体" w:eastAsia="宋体" w:hAnsi="宋体" w:cs="宋体"/>
+          <w:rFonts w:ascii="宋体" w:eastAsia="宋体" w:hAnsi="宋体" w:cs="宋体" w:hint="eastAsia"/>
           <w:sz w:val="24"/>
           <w:szCs w:val="24"/>
         </w:rPr>
@@ -1655,7 +1052,7 @@
         <w:spacing w:line="360" w:lineRule="auto"/>
         <w:ind w:firstLineChars="200" w:firstLine="480"/>
         <w:rPr>
-          <w:rFonts w:ascii="宋体" w:eastAsia="宋体" w:hAnsi="宋体" w:cs="宋体"/>
+          <w:rFonts w:ascii="宋体" w:eastAsia="宋体" w:hAnsi="宋体" w:cs="宋体" w:hint="eastAsia"/>
           <w:sz w:val="24"/>
           <w:szCs w:val="24"/>
         </w:rPr>
@@ -1674,7 +1071,7 @@
         <w:spacing w:line="360" w:lineRule="auto"/>
         <w:ind w:firstLineChars="200" w:firstLine="480"/>
         <w:rPr>
-          <w:rFonts w:ascii="宋体" w:eastAsia="宋体" w:hAnsi="宋体" w:cs="宋体"/>
+          <w:rFonts w:ascii="宋体" w:eastAsia="宋体" w:hAnsi="宋体" w:cs="宋体" w:hint="eastAsia"/>
           <w:sz w:val="24"/>
           <w:szCs w:val="24"/>
         </w:rPr>
@@ -1693,7 +1090,7 @@
         <w:spacing w:line="360" w:lineRule="auto"/>
         <w:ind w:firstLineChars="200" w:firstLine="480"/>
         <w:rPr>
-          <w:rFonts w:ascii="宋体" w:eastAsia="宋体" w:hAnsi="宋体" w:cs="宋体"/>
+          <w:rFonts w:ascii="宋体" w:eastAsia="宋体" w:hAnsi="宋体" w:cs="宋体" w:hint="eastAsia"/>
           <w:sz w:val="24"/>
           <w:szCs w:val="24"/>
         </w:rPr>
@@ -1712,7 +1109,7 @@
         <w:spacing w:line="360" w:lineRule="auto"/>
         <w:ind w:firstLineChars="200" w:firstLine="480"/>
         <w:rPr>
-          <w:rFonts w:ascii="宋体" w:eastAsia="宋体" w:hAnsi="宋体" w:cs="宋体"/>
+          <w:rFonts w:ascii="宋体" w:eastAsia="宋体" w:hAnsi="宋体" w:cs="宋体" w:hint="eastAsia"/>
           <w:sz w:val="24"/>
           <w:szCs w:val="24"/>
         </w:rPr>
@@ -1770,7 +1167,7 @@
       <w:pPr>
         <w:spacing w:line="360" w:lineRule="auto"/>
         <w:rPr>
-          <w:rFonts w:ascii="宋体" w:eastAsia="宋体" w:hAnsi="宋体" w:cs="宋体"/>
+          <w:rFonts w:ascii="宋体" w:eastAsia="宋体" w:hAnsi="宋体" w:cs="宋体" w:hint="eastAsia"/>
           <w:sz w:val="24"/>
           <w:szCs w:val="24"/>
         </w:rPr>
@@ -1789,7 +1186,7 @@
         <w:spacing w:line="360" w:lineRule="auto"/>
         <w:ind w:firstLineChars="200" w:firstLine="480"/>
         <w:rPr>
-          <w:rFonts w:ascii="宋体" w:eastAsia="宋体" w:hAnsi="宋体" w:cs="宋体"/>
+          <w:rFonts w:ascii="宋体" w:eastAsia="宋体" w:hAnsi="宋体" w:cs="宋体" w:hint="eastAsia"/>
           <w:sz w:val="24"/>
           <w:szCs w:val="24"/>
         </w:rPr>
@@ -1808,7 +1205,7 @@
         <w:spacing w:line="360" w:lineRule="auto"/>
         <w:ind w:firstLineChars="200" w:firstLine="480"/>
         <w:rPr>
-          <w:rFonts w:ascii="宋体" w:eastAsia="宋体" w:hAnsi="宋体" w:cs="宋体"/>
+          <w:rFonts w:ascii="宋体" w:eastAsia="宋体" w:hAnsi="宋体" w:cs="宋体" w:hint="eastAsia"/>
           <w:sz w:val="24"/>
           <w:szCs w:val="24"/>
         </w:rPr>
@@ -1827,7 +1224,7 @@
         <w:spacing w:line="360" w:lineRule="auto"/>
         <w:ind w:firstLineChars="200" w:firstLine="480"/>
         <w:rPr>
-          <w:rFonts w:ascii="宋体" w:eastAsia="宋体" w:hAnsi="宋体" w:cs="宋体"/>
+          <w:rFonts w:ascii="宋体" w:eastAsia="宋体" w:hAnsi="宋体" w:cs="宋体" w:hint="eastAsia"/>
           <w:sz w:val="24"/>
           <w:szCs w:val="24"/>
         </w:rPr>
@@ -1846,7 +1243,7 @@
         <w:spacing w:line="360" w:lineRule="auto"/>
         <w:ind w:firstLineChars="200" w:firstLine="480"/>
         <w:rPr>
-          <w:rFonts w:ascii="宋体" w:eastAsia="宋体" w:hAnsi="宋体" w:cs="宋体"/>
+          <w:rFonts w:ascii="宋体" w:eastAsia="宋体" w:hAnsi="宋体" w:cs="宋体" w:hint="eastAsia"/>
           <w:sz w:val="24"/>
           <w:szCs w:val="24"/>
         </w:rPr>
@@ -1904,17 +1301,17 @@
       <w:pPr>
         <w:spacing w:line="360" w:lineRule="auto"/>
         <w:rPr>
-          <w:rFonts w:ascii="宋体" w:eastAsia="宋体" w:hAnsi="宋体" w:cs="宋体"/>
-          <w:sz w:val="24"/>
-          <w:szCs w:val="24"/>
-        </w:rPr>
-      </w:pPr>
-    </w:p>
-    <w:p>
-      <w:pPr>
-        <w:spacing w:line="360" w:lineRule="auto"/>
-        <w:rPr>
-          <w:rFonts w:ascii="宋体" w:eastAsia="宋体" w:hAnsi="宋体" w:cs="宋体"/>
+          <w:rFonts w:ascii="宋体" w:eastAsia="宋体" w:hAnsi="宋体" w:cs="宋体" w:hint="eastAsia"/>
+          <w:sz w:val="24"/>
+          <w:szCs w:val="24"/>
+        </w:rPr>
+      </w:pPr>
+    </w:p>
+    <w:p>
+      <w:pPr>
+        <w:spacing w:line="360" w:lineRule="auto"/>
+        <w:rPr>
+          <w:rFonts w:ascii="宋体" w:eastAsia="宋体" w:hAnsi="宋体" w:cs="宋体" w:hint="eastAsia"/>
           <w:b/>
           <w:bCs/>
           <w:sz w:val="28"/>
@@ -1937,7 +1334,7 @@
       <w:pPr>
         <w:spacing w:line="360" w:lineRule="auto"/>
         <w:rPr>
-          <w:rFonts w:ascii="宋体" w:eastAsia="宋体" w:hAnsi="宋体" w:cs="宋体"/>
+          <w:rFonts w:ascii="宋体" w:eastAsia="宋体" w:hAnsi="宋体" w:cs="宋体" w:hint="eastAsia"/>
           <w:b/>
           <w:bCs/>
           <w:sz w:val="24"/>
@@ -1960,7 +1357,7 @@
         <w:spacing w:line="360" w:lineRule="auto"/>
         <w:ind w:firstLineChars="200" w:firstLine="480"/>
         <w:rPr>
-          <w:rFonts w:ascii="宋体" w:eastAsia="宋体" w:hAnsi="宋体" w:cs="宋体"/>
+          <w:rFonts w:ascii="宋体" w:eastAsia="宋体" w:hAnsi="宋体" w:cs="宋体" w:hint="eastAsia"/>
           <w:sz w:val="24"/>
           <w:szCs w:val="24"/>
         </w:rPr>
@@ -1982,7 +1379,7 @@
         </w:numPr>
         <w:spacing w:line="360" w:lineRule="auto"/>
         <w:rPr>
-          <w:rFonts w:ascii="宋体" w:eastAsia="宋体" w:hAnsi="宋体" w:cs="宋体"/>
+          <w:rFonts w:ascii="宋体" w:eastAsia="宋体" w:hAnsi="宋体" w:cs="宋体" w:hint="eastAsia"/>
           <w:b/>
           <w:bCs/>
           <w:sz w:val="24"/>
@@ -2005,7 +1402,7 @@
         <w:spacing w:line="360" w:lineRule="auto"/>
         <w:ind w:firstLineChars="200" w:firstLine="480"/>
         <w:rPr>
-          <w:rFonts w:ascii="宋体" w:eastAsia="宋体" w:hAnsi="宋体" w:cs="宋体"/>
+          <w:rFonts w:ascii="宋体" w:eastAsia="宋体" w:hAnsi="宋体" w:cs="宋体" w:hint="eastAsia"/>
           <w:color w:val="292934"/>
           <w:sz w:val="24"/>
           <w:szCs w:val="24"/>
@@ -2031,7 +1428,7 @@
         </w:numPr>
         <w:spacing w:line="360" w:lineRule="auto"/>
         <w:rPr>
-          <w:rFonts w:ascii="宋体" w:eastAsia="宋体" w:hAnsi="宋体" w:cs="宋体"/>
+          <w:rFonts w:ascii="宋体" w:eastAsia="宋体" w:hAnsi="宋体" w:cs="宋体" w:hint="eastAsia"/>
           <w:b/>
           <w:bCs/>
           <w:color w:val="292934"/>
@@ -2058,7 +1455,7 @@
         <w:spacing w:line="360" w:lineRule="auto"/>
         <w:ind w:firstLineChars="200" w:firstLine="480"/>
         <w:rPr>
-          <w:rFonts w:ascii="宋体" w:eastAsia="宋体" w:hAnsi="宋体" w:cs="宋体"/>
+          <w:rFonts w:ascii="宋体" w:eastAsia="宋体" w:hAnsi="宋体" w:cs="宋体" w:hint="eastAsia"/>
           <w:color w:val="292934"/>
           <w:sz w:val="24"/>
           <w:szCs w:val="24"/>
@@ -2084,7 +1481,7 @@
         </w:numPr>
         <w:spacing w:line="360" w:lineRule="auto"/>
         <w:rPr>
-          <w:rFonts w:ascii="宋体" w:eastAsia="宋体" w:hAnsi="宋体" w:cs="宋体"/>
+          <w:rFonts w:ascii="宋体" w:eastAsia="宋体" w:hAnsi="宋体" w:cs="宋体" w:hint="eastAsia"/>
           <w:b/>
           <w:bCs/>
           <w:sz w:val="24"/>
@@ -2107,7 +1504,7 @@
         <w:spacing w:line="360" w:lineRule="auto"/>
         <w:ind w:firstLineChars="200" w:firstLine="480"/>
         <w:rPr>
-          <w:rFonts w:ascii="宋体" w:eastAsia="宋体" w:hAnsi="宋体" w:cs="宋体"/>
+          <w:rFonts w:ascii="宋体" w:eastAsia="宋体" w:hAnsi="宋体" w:cs="宋体" w:hint="eastAsia"/>
           <w:sz w:val="24"/>
           <w:szCs w:val="24"/>
         </w:rPr>
@@ -2125,7 +1522,7 @@
       <w:pPr>
         <w:spacing w:line="360" w:lineRule="auto"/>
         <w:rPr>
-          <w:rFonts w:ascii="宋体" w:eastAsia="宋体" w:hAnsi="宋体" w:cs="宋体"/>
+          <w:rFonts w:ascii="宋体" w:eastAsia="宋体" w:hAnsi="宋体" w:cs="宋体" w:hint="eastAsia"/>
           <w:b/>
           <w:bCs/>
           <w:sz w:val="24"/>
@@ -2148,7 +1545,7 @@
         <w:spacing w:line="360" w:lineRule="auto"/>
         <w:ind w:firstLineChars="200" w:firstLine="480"/>
         <w:rPr>
-          <w:rFonts w:ascii="宋体" w:eastAsia="宋体" w:hAnsi="宋体" w:cs="宋体"/>
+          <w:rFonts w:ascii="宋体" w:eastAsia="宋体" w:hAnsi="宋体" w:cs="宋体" w:hint="eastAsia"/>
           <w:sz w:val="24"/>
           <w:szCs w:val="24"/>
         </w:rPr>
@@ -2167,7 +1564,7 @@
         <w:spacing w:line="360" w:lineRule="auto"/>
         <w:ind w:firstLineChars="200" w:firstLine="480"/>
         <w:rPr>
-          <w:rFonts w:ascii="宋体" w:eastAsia="宋体" w:hAnsi="宋体" w:cs="宋体"/>
+          <w:rFonts w:ascii="宋体" w:eastAsia="宋体" w:hAnsi="宋体" w:cs="宋体" w:hint="eastAsia"/>
           <w:sz w:val="24"/>
           <w:szCs w:val="24"/>
         </w:rPr>
@@ -2186,7 +1583,7 @@
         <w:spacing w:line="360" w:lineRule="auto"/>
         <w:ind w:firstLineChars="200" w:firstLine="480"/>
         <w:rPr>
-          <w:rFonts w:ascii="宋体" w:eastAsia="宋体" w:hAnsi="宋体" w:cs="宋体"/>
+          <w:rFonts w:ascii="宋体" w:eastAsia="宋体" w:hAnsi="宋体" w:cs="宋体" w:hint="eastAsia"/>
           <w:sz w:val="24"/>
           <w:szCs w:val="24"/>
         </w:rPr>
@@ -2205,7 +1602,7 @@
         <w:spacing w:line="360" w:lineRule="auto"/>
         <w:ind w:firstLineChars="200" w:firstLine="480"/>
         <w:rPr>
-          <w:rFonts w:ascii="宋体" w:eastAsia="宋体" w:hAnsi="宋体" w:cs="宋体"/>
+          <w:rFonts w:ascii="宋体" w:eastAsia="宋体" w:hAnsi="宋体" w:cs="宋体" w:hint="eastAsia"/>
           <w:b/>
           <w:bCs/>
           <w:sz w:val="24"/>
@@ -2247,7 +1644,7 @@
         <w:spacing w:line="360" w:lineRule="auto"/>
         <w:ind w:firstLineChars="200" w:firstLine="480"/>
         <w:rPr>
-          <w:rFonts w:ascii="宋体" w:eastAsia="宋体" w:hAnsi="宋体" w:cs="宋体"/>
+          <w:rFonts w:ascii="宋体" w:eastAsia="宋体" w:hAnsi="宋体" w:cs="宋体" w:hint="eastAsia"/>
           <w:sz w:val="24"/>
           <w:szCs w:val="24"/>
         </w:rPr>
@@ -2269,7 +1666,7 @@
         </w:numPr>
         <w:spacing w:line="360" w:lineRule="auto"/>
         <w:rPr>
-          <w:rFonts w:ascii="宋体" w:eastAsia="宋体" w:hAnsi="宋体" w:cs="宋体"/>
+          <w:rFonts w:ascii="宋体" w:eastAsia="宋体" w:hAnsi="宋体" w:cs="宋体" w:hint="eastAsia"/>
           <w:b/>
           <w:bCs/>
           <w:sz w:val="24"/>
@@ -2292,7 +1689,7 @@
         <w:spacing w:line="360" w:lineRule="auto"/>
         <w:ind w:firstLineChars="200" w:firstLine="480"/>
         <w:rPr>
-          <w:rFonts w:ascii="宋体" w:eastAsia="宋体" w:hAnsi="宋体" w:cs="宋体"/>
+          <w:rFonts w:ascii="宋体" w:eastAsia="宋体" w:hAnsi="宋体" w:cs="宋体" w:hint="eastAsia"/>
           <w:sz w:val="24"/>
           <w:szCs w:val="24"/>
         </w:rPr>
@@ -2314,7 +1711,7 @@
         </w:numPr>
         <w:spacing w:line="360" w:lineRule="auto"/>
         <w:rPr>
-          <w:rFonts w:ascii="宋体" w:eastAsia="宋体" w:hAnsi="宋体" w:cs="宋体"/>
+          <w:rFonts w:ascii="宋体" w:eastAsia="宋体" w:hAnsi="宋体" w:cs="宋体" w:hint="eastAsia"/>
           <w:b/>
           <w:bCs/>
           <w:sz w:val="24"/>
@@ -2337,7 +1734,7 @@
         <w:spacing w:line="360" w:lineRule="auto"/>
         <w:ind w:firstLineChars="200" w:firstLine="480"/>
         <w:rPr>
-          <w:rFonts w:ascii="宋体" w:eastAsia="宋体" w:hAnsi="宋体" w:cs="宋体"/>
+          <w:rFonts w:ascii="宋体" w:eastAsia="宋体" w:hAnsi="宋体" w:cs="宋体" w:hint="eastAsia"/>
           <w:color w:val="333333"/>
           <w:sz w:val="24"/>
           <w:szCs w:val="24"/>
@@ -2368,7 +1765,7 @@
         <w:spacing w:line="360" w:lineRule="auto"/>
         <w:ind w:firstLineChars="200" w:firstLine="480"/>
         <w:rPr>
-          <w:rFonts w:ascii="宋体" w:eastAsia="宋体" w:hAnsi="宋体" w:cs="宋体"/>
+          <w:rFonts w:ascii="宋体" w:eastAsia="宋体" w:hAnsi="宋体" w:cs="宋体" w:hint="eastAsia"/>
           <w:color w:val="333333"/>
           <w:sz w:val="24"/>
           <w:szCs w:val="24"/>
@@ -2402,7 +1799,7 @@
                     </pic:cNvPicPr>
                   </pic:nvPicPr>
                   <pic:blipFill>
-                    <a:blip r:embed="rId13"/>
+                    <a:blip r:embed="rId12"/>
                     <a:stretch>
                       <a:fillRect/>
                     </a:stretch>
@@ -2433,7 +1830,7 @@
         <w:spacing w:line="360" w:lineRule="auto"/>
         <w:ind w:firstLineChars="0"/>
         <w:rPr>
-          <w:rFonts w:ascii="宋体" w:eastAsia="宋体" w:hAnsi="宋体" w:cs="宋体"/>
+          <w:rFonts w:ascii="宋体" w:eastAsia="宋体" w:hAnsi="宋体" w:cs="宋体" w:hint="eastAsia"/>
           <w:b/>
           <w:bCs/>
           <w:sz w:val="24"/>
@@ -2458,7 +1855,7 @@
         <w:spacing w:line="360" w:lineRule="auto"/>
         <w:ind w:left="360" w:firstLine="482"/>
         <w:rPr>
-          <w:rFonts w:ascii="宋体" w:eastAsia="宋体" w:hAnsi="宋体" w:cs="宋体"/>
+          <w:rFonts w:ascii="宋体" w:eastAsia="宋体" w:hAnsi="宋体" w:cs="宋体" w:hint="eastAsia"/>
           <w:color w:val="000000"/>
           <w:kern w:val="0"/>
           <w:sz w:val="24"/>
@@ -2502,7 +1899,7 @@
         <w:spacing w:line="360" w:lineRule="auto"/>
         <w:ind w:left="360" w:firstLine="482"/>
         <w:rPr>
-          <w:rFonts w:ascii="宋体" w:eastAsia="宋体" w:hAnsi="宋体" w:cs="宋体"/>
+          <w:rFonts w:ascii="宋体" w:eastAsia="宋体" w:hAnsi="宋体" w:cs="宋体" w:hint="eastAsia"/>
           <w:sz w:val="24"/>
           <w:szCs w:val="24"/>
         </w:rPr>
@@ -2545,7 +1942,7 @@
         <w:spacing w:line="360" w:lineRule="auto"/>
         <w:ind w:left="360" w:firstLine="482"/>
         <w:rPr>
-          <w:rFonts w:ascii="宋体" w:eastAsia="宋体" w:hAnsi="宋体" w:cs="宋体"/>
+          <w:rFonts w:ascii="宋体" w:eastAsia="宋体" w:hAnsi="宋体" w:cs="宋体" w:hint="eastAsia"/>
           <w:color w:val="292934"/>
           <w:sz w:val="24"/>
           <w:szCs w:val="24"/>
@@ -2617,7 +2014,7 @@
         <w:spacing w:line="360" w:lineRule="auto"/>
         <w:ind w:left="360" w:firstLineChars="0" w:firstLine="0"/>
         <w:rPr>
-          <w:rFonts w:ascii="宋体" w:eastAsia="宋体" w:hAnsi="宋体" w:cs="宋体"/>
+          <w:rFonts w:ascii="宋体" w:eastAsia="宋体" w:hAnsi="宋体" w:cs="宋体" w:hint="eastAsia"/>
           <w:sz w:val="24"/>
           <w:szCs w:val="24"/>
         </w:rPr>
@@ -2648,7 +2045,7 @@
                     </pic:cNvPicPr>
                   </pic:nvPicPr>
                   <pic:blipFill>
-                    <a:blip r:embed="rId14">
+                    <a:blip r:embed="rId13">
                       <a:extLst>
                         <a:ext uri="{28A0092B-C50C-407E-A947-70E740481C1C}">
                           <a14:useLocalDpi xmlns:a14="http://schemas.microsoft.com/office/drawing/2010/main" val="0"/>
@@ -2680,7 +2077,7 @@
         <w:spacing w:line="360" w:lineRule="auto"/>
         <w:ind w:leftChars="200" w:left="420" w:firstLineChars="200" w:firstLine="482"/>
         <w:rPr>
-          <w:rFonts w:ascii="宋体" w:eastAsia="宋体" w:hAnsi="宋体" w:cs="宋体"/>
+          <w:rFonts w:ascii="宋体" w:eastAsia="宋体" w:hAnsi="宋体" w:cs="宋体" w:hint="eastAsia"/>
           <w:color w:val="000000" w:themeColor="text1"/>
           <w:sz w:val="24"/>
           <w:szCs w:val="24"/>
@@ -2721,7 +2118,7 @@
         <w:spacing w:line="360" w:lineRule="auto"/>
         <w:ind w:leftChars="200" w:left="420"/>
         <w:rPr>
-          <w:rFonts w:ascii="宋体" w:eastAsia="宋体" w:hAnsi="宋体" w:cs="宋体"/>
+          <w:rFonts w:ascii="宋体" w:eastAsia="宋体" w:hAnsi="宋体" w:cs="宋体" w:hint="eastAsia"/>
           <w:color w:val="000000" w:themeColor="text1"/>
           <w:sz w:val="24"/>
           <w:szCs w:val="24"/>
@@ -2753,7 +2150,7 @@
                     </pic:cNvPicPr>
                   </pic:nvPicPr>
                   <pic:blipFill>
-                    <a:blip r:embed="rId15"/>
+                    <a:blip r:embed="rId14"/>
                     <a:stretch>
                       <a:fillRect/>
                     </a:stretch>
@@ -2779,7 +2176,7 @@
         <w:spacing w:line="360" w:lineRule="auto"/>
         <w:ind w:leftChars="200" w:left="420"/>
         <w:rPr>
-          <w:rFonts w:ascii="宋体" w:eastAsia="宋体" w:hAnsi="宋体" w:cs="宋体"/>
+          <w:rFonts w:ascii="宋体" w:eastAsia="宋体" w:hAnsi="宋体" w:cs="宋体" w:hint="eastAsia"/>
           <w:color w:val="000000" w:themeColor="text1"/>
           <w:sz w:val="24"/>
           <w:szCs w:val="24"/>
@@ -2794,7 +2191,7 @@
         </w:numPr>
         <w:spacing w:line="360" w:lineRule="auto"/>
         <w:rPr>
-          <w:rFonts w:ascii="宋体" w:eastAsia="宋体" w:hAnsi="宋体" w:cs="宋体"/>
+          <w:rFonts w:ascii="宋体" w:eastAsia="宋体" w:hAnsi="宋体" w:cs="宋体" w:hint="eastAsia"/>
           <w:b/>
           <w:bCs/>
           <w:color w:val="000000" w:themeColor="text1"/>
@@ -2819,7 +2216,7 @@
         <w:spacing w:line="360" w:lineRule="auto"/>
         <w:ind w:rightChars="-1949" w:right="-4093"/>
         <w:rPr>
-          <w:rFonts w:ascii="宋体" w:eastAsia="宋体" w:hAnsi="宋体" w:cs="宋体"/>
+          <w:rFonts w:ascii="宋体" w:eastAsia="宋体" w:hAnsi="宋体" w:cs="宋体" w:hint="eastAsia"/>
           <w:b/>
           <w:bCs/>
           <w:color w:val="000000" w:themeColor="text1"/>
@@ -2843,7 +2240,7 @@
       <w:pPr>
         <w:spacing w:line="360" w:lineRule="auto"/>
         <w:rPr>
-          <w:rFonts w:ascii="宋体" w:eastAsia="宋体" w:hAnsi="宋体" w:cs="宋体"/>
+          <w:rFonts w:ascii="宋体" w:eastAsia="宋体" w:hAnsi="宋体" w:cs="宋体" w:hint="eastAsia"/>
         </w:rPr>
       </w:pPr>
       <w:r>
@@ -2870,7 +2267,7 @@
                     </pic:cNvPicPr>
                   </pic:nvPicPr>
                   <pic:blipFill>
-                    <a:blip r:embed="rId16"/>
+                    <a:blip r:embed="rId15"/>
                     <a:stretch>
                       <a:fillRect/>
                     </a:stretch>
@@ -2903,7 +2300,7 @@
         </w:numPr>
         <w:spacing w:line="360" w:lineRule="auto"/>
         <w:rPr>
-          <w:rFonts w:ascii="宋体" w:eastAsia="宋体" w:hAnsi="宋体" w:cs="宋体"/>
+          <w:rFonts w:ascii="宋体" w:eastAsia="宋体" w:hAnsi="宋体" w:cs="宋体" w:hint="eastAsia"/>
           <w:b/>
           <w:bCs/>
           <w:sz w:val="24"/>
@@ -2925,7 +2322,7 @@
       <w:pPr>
         <w:spacing w:line="360" w:lineRule="auto"/>
         <w:rPr>
-          <w:rFonts w:ascii="宋体" w:eastAsia="宋体" w:hAnsi="宋体" w:cs="宋体"/>
+          <w:rFonts w:ascii="宋体" w:eastAsia="宋体" w:hAnsi="宋体" w:cs="宋体" w:hint="eastAsia"/>
           <w:b/>
           <w:bCs/>
           <w:sz w:val="24"/>
@@ -2968,7 +2365,7 @@
             <w:pPr>
               <w:jc w:val="center"/>
               <w:rPr>
-                <w:rFonts w:ascii="宋体" w:eastAsia="宋体" w:hAnsi="宋体" w:cs="宋体"/>
+                <w:rFonts w:ascii="宋体" w:eastAsia="宋体" w:hAnsi="宋体" w:cs="宋体" w:hint="eastAsia"/>
                 <w:b/>
                 <w:bCs/>
                 <w:sz w:val="24"/>
@@ -2994,7 +2391,7 @@
             <w:pPr>
               <w:jc w:val="center"/>
               <w:rPr>
-                <w:rFonts w:ascii="宋体" w:eastAsia="宋体" w:hAnsi="宋体" w:cs="宋体"/>
+                <w:rFonts w:ascii="宋体" w:eastAsia="宋体" w:hAnsi="宋体" w:cs="宋体" w:hint="eastAsia"/>
                 <w:b/>
                 <w:bCs/>
                 <w:sz w:val="24"/>
@@ -3020,7 +2417,7 @@
             <w:pPr>
               <w:jc w:val="center"/>
               <w:rPr>
-                <w:rFonts w:ascii="宋体" w:eastAsia="宋体" w:hAnsi="宋体" w:cs="宋体"/>
+                <w:rFonts w:ascii="宋体" w:eastAsia="宋体" w:hAnsi="宋体" w:cs="宋体" w:hint="eastAsia"/>
                 <w:b/>
                 <w:bCs/>
                 <w:sz w:val="24"/>
@@ -3048,7 +2445,7 @@
             <w:pPr>
               <w:jc w:val="center"/>
               <w:rPr>
-                <w:rFonts w:ascii="宋体" w:eastAsia="宋体" w:hAnsi="宋体" w:cs="宋体"/>
+                <w:rFonts w:ascii="宋体" w:eastAsia="宋体" w:hAnsi="宋体" w:cs="宋体" w:hint="eastAsia"/>
                 <w:sz w:val="24"/>
               </w:rPr>
             </w:pPr>
@@ -3069,7 +2466,7 @@
           <w:p>
             <w:pPr>
               <w:rPr>
-                <w:rFonts w:ascii="宋体" w:eastAsia="宋体" w:hAnsi="宋体" w:cs="宋体"/>
+                <w:rFonts w:ascii="宋体" w:eastAsia="宋体" w:hAnsi="宋体" w:cs="宋体" w:hint="eastAsia"/>
                 <w:sz w:val="24"/>
               </w:rPr>
             </w:pPr>
@@ -3084,7 +2481,7 @@
           <w:p>
             <w:pPr>
               <w:rPr>
-                <w:rFonts w:ascii="宋体" w:eastAsia="宋体" w:hAnsi="宋体" w:cs="宋体"/>
+                <w:rFonts w:ascii="宋体" w:eastAsia="宋体" w:hAnsi="宋体" w:cs="宋体" w:hint="eastAsia"/>
                 <w:sz w:val="24"/>
               </w:rPr>
             </w:pPr>
@@ -3099,7 +2496,7 @@
           <w:p>
             <w:pPr>
               <w:rPr>
-                <w:rFonts w:ascii="宋体" w:eastAsia="宋体" w:hAnsi="宋体" w:cs="宋体"/>
+                <w:rFonts w:ascii="宋体" w:eastAsia="宋体" w:hAnsi="宋体" w:cs="宋体" w:hint="eastAsia"/>
                 <w:sz w:val="24"/>
               </w:rPr>
             </w:pPr>
@@ -3114,7 +2511,7 @@
           <w:p>
             <w:pPr>
               <w:rPr>
-                <w:rFonts w:ascii="宋体" w:eastAsia="宋体" w:hAnsi="宋体" w:cs="宋体"/>
+                <w:rFonts w:ascii="宋体" w:eastAsia="宋体" w:hAnsi="宋体" w:cs="宋体" w:hint="eastAsia"/>
                 <w:sz w:val="24"/>
               </w:rPr>
             </w:pPr>
@@ -3135,7 +2532,7 @@
           <w:p>
             <w:pPr>
               <w:rPr>
-                <w:rFonts w:ascii="宋体" w:eastAsia="宋体" w:hAnsi="宋体" w:cs="宋体"/>
+                <w:rFonts w:ascii="宋体" w:eastAsia="宋体" w:hAnsi="宋体" w:cs="宋体" w:hint="eastAsia"/>
                 <w:sz w:val="24"/>
               </w:rPr>
             </w:pPr>
@@ -3150,7 +2547,7 @@
           <w:p>
             <w:pPr>
               <w:rPr>
-                <w:rFonts w:ascii="宋体" w:eastAsia="宋体" w:hAnsi="宋体" w:cs="宋体"/>
+                <w:rFonts w:ascii="宋体" w:eastAsia="宋体" w:hAnsi="宋体" w:cs="宋体" w:hint="eastAsia"/>
                 <w:sz w:val="24"/>
               </w:rPr>
             </w:pPr>
@@ -3165,7 +2562,7 @@
           <w:p>
             <w:pPr>
               <w:rPr>
-                <w:rFonts w:ascii="宋体" w:eastAsia="宋体" w:hAnsi="宋体" w:cs="宋体"/>
+                <w:rFonts w:ascii="宋体" w:eastAsia="宋体" w:hAnsi="宋体" w:cs="宋体" w:hint="eastAsia"/>
                 <w:sz w:val="24"/>
               </w:rPr>
             </w:pPr>
@@ -3180,7 +2577,7 @@
           <w:p>
             <w:pPr>
               <w:rPr>
-                <w:rFonts w:ascii="宋体" w:eastAsia="宋体" w:hAnsi="宋体" w:cs="宋体"/>
+                <w:rFonts w:ascii="宋体" w:eastAsia="宋体" w:hAnsi="宋体" w:cs="宋体" w:hint="eastAsia"/>
                 <w:sz w:val="24"/>
               </w:rPr>
             </w:pPr>
@@ -3195,7 +2592,7 @@
           <w:p>
             <w:pPr>
               <w:rPr>
-                <w:rFonts w:ascii="宋体" w:eastAsia="宋体" w:hAnsi="宋体" w:cs="宋体"/>
+                <w:rFonts w:ascii="宋体" w:eastAsia="宋体" w:hAnsi="宋体" w:cs="宋体" w:hint="eastAsia"/>
                 <w:sz w:val="24"/>
               </w:rPr>
             </w:pPr>
@@ -3219,7 +2616,7 @@
             <w:pPr>
               <w:jc w:val="center"/>
               <w:rPr>
-                <w:rFonts w:ascii="宋体" w:eastAsia="宋体" w:hAnsi="宋体" w:cs="宋体"/>
+                <w:rFonts w:ascii="宋体" w:eastAsia="宋体" w:hAnsi="宋体" w:cs="宋体" w:hint="eastAsia"/>
                 <w:sz w:val="24"/>
               </w:rPr>
             </w:pPr>
@@ -3240,7 +2637,7 @@
           <w:p>
             <w:pPr>
               <w:rPr>
-                <w:rFonts w:ascii="宋体" w:eastAsia="宋体" w:hAnsi="宋体" w:cs="宋体"/>
+                <w:rFonts w:ascii="宋体" w:eastAsia="宋体" w:hAnsi="宋体" w:cs="宋体" w:hint="eastAsia"/>
                 <w:sz w:val="24"/>
               </w:rPr>
             </w:pPr>
@@ -3255,7 +2652,7 @@
           <w:p>
             <w:pPr>
               <w:rPr>
-                <w:rFonts w:ascii="宋体" w:eastAsia="宋体" w:hAnsi="宋体" w:cs="宋体"/>
+                <w:rFonts w:ascii="宋体" w:eastAsia="宋体" w:hAnsi="宋体" w:cs="宋体" w:hint="eastAsia"/>
                 <w:sz w:val="24"/>
               </w:rPr>
             </w:pPr>
@@ -3270,7 +2667,7 @@
           <w:p>
             <w:pPr>
               <w:rPr>
-                <w:rFonts w:ascii="宋体" w:eastAsia="宋体" w:hAnsi="宋体" w:cs="宋体"/>
+                <w:rFonts w:ascii="宋体" w:eastAsia="宋体" w:hAnsi="宋体" w:cs="宋体" w:hint="eastAsia"/>
                 <w:sz w:val="24"/>
               </w:rPr>
             </w:pPr>
@@ -3285,7 +2682,7 @@
           <w:p>
             <w:pPr>
               <w:rPr>
-                <w:rFonts w:ascii="宋体" w:eastAsia="宋体" w:hAnsi="宋体" w:cs="宋体"/>
+                <w:rFonts w:ascii="宋体" w:eastAsia="宋体" w:hAnsi="宋体" w:cs="宋体" w:hint="eastAsia"/>
                 <w:sz w:val="24"/>
               </w:rPr>
             </w:pPr>
@@ -3306,7 +2703,7 @@
           <w:p>
             <w:pPr>
               <w:rPr>
-                <w:rFonts w:ascii="宋体" w:eastAsia="宋体" w:hAnsi="宋体" w:cs="宋体"/>
+                <w:rFonts w:ascii="宋体" w:eastAsia="宋体" w:hAnsi="宋体" w:cs="宋体" w:hint="eastAsia"/>
                 <w:sz w:val="24"/>
               </w:rPr>
             </w:pPr>
@@ -3321,7 +2718,7 @@
           <w:p>
             <w:pPr>
               <w:rPr>
-                <w:rFonts w:ascii="宋体" w:eastAsia="宋体" w:hAnsi="宋体" w:cs="宋体"/>
+                <w:rFonts w:ascii="宋体" w:eastAsia="宋体" w:hAnsi="宋体" w:cs="宋体" w:hint="eastAsia"/>
                 <w:sz w:val="24"/>
               </w:rPr>
             </w:pPr>
@@ -3336,7 +2733,7 @@
           <w:p>
             <w:pPr>
               <w:rPr>
-                <w:rFonts w:ascii="宋体" w:eastAsia="宋体" w:hAnsi="宋体" w:cs="宋体"/>
+                <w:rFonts w:ascii="宋体" w:eastAsia="宋体" w:hAnsi="宋体" w:cs="宋体" w:hint="eastAsia"/>
                 <w:sz w:val="24"/>
               </w:rPr>
             </w:pPr>
@@ -3351,7 +2748,7 @@
           <w:p>
             <w:pPr>
               <w:rPr>
-                <w:rFonts w:ascii="宋体" w:eastAsia="宋体" w:hAnsi="宋体" w:cs="宋体"/>
+                <w:rFonts w:ascii="宋体" w:eastAsia="宋体" w:hAnsi="宋体" w:cs="宋体" w:hint="eastAsia"/>
                 <w:sz w:val="24"/>
               </w:rPr>
             </w:pPr>
@@ -3375,7 +2772,7 @@
             <w:pPr>
               <w:jc w:val="center"/>
               <w:rPr>
-                <w:rFonts w:ascii="宋体" w:eastAsia="宋体" w:hAnsi="宋体" w:cs="宋体"/>
+                <w:rFonts w:ascii="宋体" w:eastAsia="宋体" w:hAnsi="宋体" w:cs="宋体" w:hint="eastAsia"/>
                 <w:sz w:val="24"/>
                 <w:szCs w:val="24"/>
               </w:rPr>
@@ -3398,7 +2795,7 @@
           <w:p>
             <w:pPr>
               <w:rPr>
-                <w:rFonts w:ascii="宋体" w:eastAsia="宋体" w:hAnsi="宋体" w:cs="宋体"/>
+                <w:rFonts w:ascii="宋体" w:eastAsia="宋体" w:hAnsi="宋体" w:cs="宋体" w:hint="eastAsia"/>
                 <w:sz w:val="24"/>
                 <w:szCs w:val="24"/>
               </w:rPr>
@@ -3422,7 +2819,7 @@
             <w:pPr>
               <w:pStyle w:val="a3"/>
               <w:rPr>
-                <w:rFonts w:ascii="宋体" w:eastAsia="宋体" w:hAnsi="宋体" w:cs="宋体"/>
+                <w:rFonts w:ascii="宋体" w:eastAsia="宋体" w:hAnsi="宋体" w:cs="宋体" w:hint="eastAsia"/>
                 <w:sz w:val="24"/>
                 <w:szCs w:val="24"/>
               </w:rPr>
@@ -3457,7 +2854,7 @@
             <w:pPr>
               <w:jc w:val="center"/>
               <w:rPr>
-                <w:rFonts w:ascii="宋体" w:eastAsia="宋体" w:hAnsi="宋体" w:cs="宋体"/>
+                <w:rFonts w:ascii="宋体" w:eastAsia="宋体" w:hAnsi="宋体" w:cs="宋体" w:hint="eastAsia"/>
                 <w:sz w:val="24"/>
               </w:rPr>
             </w:pPr>
@@ -3479,7 +2876,7 @@
           <w:p>
             <w:pPr>
               <w:rPr>
-                <w:rFonts w:ascii="宋体" w:eastAsia="宋体" w:hAnsi="宋体" w:cs="宋体"/>
+                <w:rFonts w:ascii="宋体" w:eastAsia="宋体" w:hAnsi="宋体" w:cs="宋体" w:hint="eastAsia"/>
                 <w:sz w:val="24"/>
               </w:rPr>
             </w:pPr>
@@ -3494,7 +2891,7 @@
           <w:p>
             <w:pPr>
               <w:rPr>
-                <w:rFonts w:ascii="宋体" w:eastAsia="宋体" w:hAnsi="宋体" w:cs="宋体"/>
+                <w:rFonts w:ascii="宋体" w:eastAsia="宋体" w:hAnsi="宋体" w:cs="宋体" w:hint="eastAsia"/>
                 <w:sz w:val="24"/>
               </w:rPr>
             </w:pPr>
@@ -3509,7 +2906,7 @@
           <w:p>
             <w:pPr>
               <w:rPr>
-                <w:rFonts w:ascii="宋体" w:eastAsia="宋体" w:hAnsi="宋体" w:cs="宋体"/>
+                <w:rFonts w:ascii="宋体" w:eastAsia="宋体" w:hAnsi="宋体" w:cs="宋体" w:hint="eastAsia"/>
                 <w:sz w:val="24"/>
               </w:rPr>
             </w:pPr>
@@ -3524,7 +2921,7 @@
           <w:p>
             <w:pPr>
               <w:rPr>
-                <w:rFonts w:ascii="宋体" w:eastAsia="宋体" w:hAnsi="宋体" w:cs="宋体"/>
+                <w:rFonts w:ascii="宋体" w:eastAsia="宋体" w:hAnsi="宋体" w:cs="宋体" w:hint="eastAsia"/>
                 <w:sz w:val="24"/>
               </w:rPr>
             </w:pPr>
@@ -3545,7 +2942,7 @@
           <w:p>
             <w:pPr>
               <w:rPr>
-                <w:rFonts w:ascii="宋体" w:eastAsia="宋体" w:hAnsi="宋体" w:cs="宋体"/>
+                <w:rFonts w:ascii="宋体" w:eastAsia="宋体" w:hAnsi="宋体" w:cs="宋体" w:hint="eastAsia"/>
                 <w:sz w:val="24"/>
               </w:rPr>
             </w:pPr>
@@ -3560,7 +2957,7 @@
           <w:p>
             <w:pPr>
               <w:rPr>
-                <w:rFonts w:ascii="宋体" w:eastAsia="宋体" w:hAnsi="宋体" w:cs="宋体"/>
+                <w:rFonts w:ascii="宋体" w:eastAsia="宋体" w:hAnsi="宋体" w:cs="宋体" w:hint="eastAsia"/>
                 <w:sz w:val="24"/>
               </w:rPr>
             </w:pPr>
@@ -3575,7 +2972,7 @@
           <w:p>
             <w:pPr>
               <w:rPr>
-                <w:rFonts w:ascii="宋体" w:eastAsia="宋体" w:hAnsi="宋体" w:cs="宋体"/>
+                <w:rFonts w:ascii="宋体" w:eastAsia="宋体" w:hAnsi="宋体" w:cs="宋体" w:hint="eastAsia"/>
                 <w:sz w:val="24"/>
               </w:rPr>
             </w:pPr>
@@ -3590,7 +2987,7 @@
           <w:p>
             <w:pPr>
               <w:rPr>
-                <w:rFonts w:ascii="宋体" w:eastAsia="宋体" w:hAnsi="宋体" w:cs="宋体"/>
+                <w:rFonts w:ascii="宋体" w:eastAsia="宋体" w:hAnsi="宋体" w:cs="宋体" w:hint="eastAsia"/>
                 <w:sz w:val="24"/>
               </w:rPr>
             </w:pPr>
@@ -3614,7 +3011,7 @@
             <w:pPr>
               <w:jc w:val="center"/>
               <w:rPr>
-                <w:rFonts w:ascii="宋体" w:eastAsia="宋体" w:hAnsi="宋体" w:cs="宋体"/>
+                <w:rFonts w:ascii="宋体" w:eastAsia="宋体" w:hAnsi="宋体" w:cs="宋体" w:hint="eastAsia"/>
                 <w:sz w:val="24"/>
                 <w:szCs w:val="24"/>
               </w:rPr>
@@ -3637,7 +3034,7 @@
           <w:p>
             <w:pPr>
               <w:rPr>
-                <w:rFonts w:ascii="宋体" w:eastAsia="宋体" w:hAnsi="宋体" w:cs="宋体"/>
+                <w:rFonts w:ascii="宋体" w:eastAsia="宋体" w:hAnsi="宋体" w:cs="宋体" w:hint="eastAsia"/>
                 <w:sz w:val="24"/>
                 <w:szCs w:val="24"/>
               </w:rPr>
@@ -3661,7 +3058,7 @@
             <w:pPr>
               <w:pStyle w:val="a3"/>
               <w:rPr>
-                <w:rFonts w:ascii="宋体" w:eastAsia="宋体" w:hAnsi="宋体" w:cs="宋体"/>
+                <w:rFonts w:ascii="宋体" w:eastAsia="宋体" w:hAnsi="宋体" w:cs="宋体" w:hint="eastAsia"/>
                 <w:sz w:val="24"/>
                 <w:szCs w:val="24"/>
               </w:rPr>
@@ -3687,7 +3084,7 @@
             <w:pPr>
               <w:jc w:val="center"/>
               <w:rPr>
-                <w:rFonts w:ascii="宋体" w:eastAsia="宋体" w:hAnsi="宋体" w:cs="宋体"/>
+                <w:rFonts w:ascii="宋体" w:eastAsia="宋体" w:hAnsi="宋体" w:cs="宋体" w:hint="eastAsia"/>
                 <w:sz w:val="24"/>
                 <w:szCs w:val="24"/>
               </w:rPr>
@@ -3710,7 +3107,7 @@
           <w:p>
             <w:pPr>
               <w:rPr>
-                <w:rFonts w:ascii="宋体" w:eastAsia="宋体" w:hAnsi="宋体" w:cs="宋体"/>
+                <w:rFonts w:ascii="宋体" w:eastAsia="宋体" w:hAnsi="宋体" w:cs="宋体" w:hint="eastAsia"/>
                 <w:sz w:val="24"/>
                 <w:szCs w:val="24"/>
               </w:rPr>
@@ -3727,7 +3124,7 @@
           <w:p>
             <w:pPr>
               <w:rPr>
-                <w:rFonts w:ascii="宋体" w:eastAsia="宋体" w:hAnsi="宋体" w:cs="宋体"/>
+                <w:rFonts w:ascii="宋体" w:eastAsia="宋体" w:hAnsi="宋体" w:cs="宋体" w:hint="eastAsia"/>
                 <w:sz w:val="24"/>
                 <w:szCs w:val="24"/>
               </w:rPr>
@@ -3744,7 +3141,7 @@
           <w:p>
             <w:pPr>
               <w:rPr>
-                <w:rFonts w:ascii="宋体" w:eastAsia="宋体" w:hAnsi="宋体" w:cs="宋体"/>
+                <w:rFonts w:ascii="宋体" w:eastAsia="宋体" w:hAnsi="宋体" w:cs="宋体" w:hint="eastAsia"/>
                 <w:sz w:val="24"/>
                 <w:szCs w:val="24"/>
               </w:rPr>
@@ -3761,7 +3158,7 @@
           <w:p>
             <w:pPr>
               <w:rPr>
-                <w:rFonts w:ascii="宋体" w:eastAsia="宋体" w:hAnsi="宋体" w:cs="宋体"/>
+                <w:rFonts w:ascii="宋体" w:eastAsia="宋体" w:hAnsi="宋体" w:cs="宋体" w:hint="eastAsia"/>
                 <w:sz w:val="24"/>
                 <w:szCs w:val="24"/>
               </w:rPr>
@@ -3784,7 +3181,7 @@
           <w:p>
             <w:pPr>
               <w:rPr>
-                <w:rFonts w:ascii="宋体" w:eastAsia="宋体" w:hAnsi="宋体" w:cs="宋体"/>
+                <w:rFonts w:ascii="宋体" w:eastAsia="宋体" w:hAnsi="宋体" w:cs="宋体" w:hint="eastAsia"/>
                 <w:sz w:val="24"/>
                 <w:szCs w:val="24"/>
               </w:rPr>
@@ -3801,7 +3198,7 @@
           <w:p>
             <w:pPr>
               <w:rPr>
-                <w:rFonts w:ascii="宋体" w:eastAsia="宋体" w:hAnsi="宋体" w:cs="宋体"/>
+                <w:rFonts w:ascii="宋体" w:eastAsia="宋体" w:hAnsi="宋体" w:cs="宋体" w:hint="eastAsia"/>
                 <w:sz w:val="24"/>
                 <w:szCs w:val="24"/>
               </w:rPr>
@@ -3818,7 +3215,7 @@
           <w:p>
             <w:pPr>
               <w:rPr>
-                <w:rFonts w:ascii="宋体" w:eastAsia="宋体" w:hAnsi="宋体" w:cs="宋体"/>
+                <w:rFonts w:ascii="宋体" w:eastAsia="宋体" w:hAnsi="宋体" w:cs="宋体" w:hint="eastAsia"/>
                 <w:sz w:val="24"/>
                 <w:szCs w:val="24"/>
               </w:rPr>
@@ -3835,7 +3232,7 @@
           <w:p>
             <w:pPr>
               <w:rPr>
-                <w:rFonts w:ascii="宋体" w:eastAsia="宋体" w:hAnsi="宋体" w:cs="宋体"/>
+                <w:rFonts w:ascii="宋体" w:eastAsia="宋体" w:hAnsi="宋体" w:cs="宋体" w:hint="eastAsia"/>
                 <w:sz w:val="24"/>
                 <w:szCs w:val="24"/>
               </w:rPr>
@@ -3861,7 +3258,7 @@
             <w:pPr>
               <w:jc w:val="center"/>
               <w:rPr>
-                <w:rFonts w:ascii="宋体" w:eastAsia="宋体" w:hAnsi="宋体" w:cs="宋体"/>
+                <w:rFonts w:ascii="宋体" w:eastAsia="宋体" w:hAnsi="宋体" w:cs="宋体" w:hint="eastAsia"/>
                 <w:sz w:val="24"/>
               </w:rPr>
             </w:pPr>
@@ -3882,7 +3279,7 @@
           <w:p>
             <w:pPr>
               <w:rPr>
-                <w:rFonts w:ascii="宋体" w:eastAsia="宋体" w:hAnsi="宋体" w:cs="宋体"/>
+                <w:rFonts w:ascii="宋体" w:eastAsia="宋体" w:hAnsi="宋体" w:cs="宋体" w:hint="eastAsia"/>
                 <w:sz w:val="24"/>
               </w:rPr>
             </w:pPr>
@@ -3897,7 +3294,7 @@
           <w:p>
             <w:pPr>
               <w:rPr>
-                <w:rFonts w:ascii="宋体" w:eastAsia="宋体" w:hAnsi="宋体" w:cs="宋体"/>
+                <w:rFonts w:ascii="宋体" w:eastAsia="宋体" w:hAnsi="宋体" w:cs="宋体" w:hint="eastAsia"/>
                 <w:sz w:val="24"/>
               </w:rPr>
             </w:pPr>
@@ -3912,7 +3309,7 @@
           <w:p>
             <w:pPr>
               <w:rPr>
-                <w:rFonts w:ascii="宋体" w:eastAsia="宋体" w:hAnsi="宋体" w:cs="宋体"/>
+                <w:rFonts w:ascii="宋体" w:eastAsia="宋体" w:hAnsi="宋体" w:cs="宋体" w:hint="eastAsia"/>
                 <w:sz w:val="24"/>
               </w:rPr>
             </w:pPr>
@@ -3927,7 +3324,7 @@
           <w:p>
             <w:pPr>
               <w:rPr>
-                <w:rFonts w:ascii="宋体" w:eastAsia="宋体" w:hAnsi="宋体" w:cs="宋体"/>
+                <w:rFonts w:ascii="宋体" w:eastAsia="宋体" w:hAnsi="宋体" w:cs="宋体" w:hint="eastAsia"/>
                 <w:sz w:val="24"/>
               </w:rPr>
             </w:pPr>
@@ -3948,7 +3345,7 @@
           <w:p>
             <w:pPr>
               <w:rPr>
-                <w:rFonts w:ascii="宋体" w:eastAsia="宋体" w:hAnsi="宋体" w:cs="宋体"/>
+                <w:rFonts w:ascii="宋体" w:eastAsia="宋体" w:hAnsi="宋体" w:cs="宋体" w:hint="eastAsia"/>
                 <w:sz w:val="24"/>
               </w:rPr>
             </w:pPr>
@@ -3963,7 +3360,7 @@
           <w:p>
             <w:pPr>
               <w:rPr>
-                <w:rFonts w:ascii="宋体" w:eastAsia="宋体" w:hAnsi="宋体" w:cs="宋体"/>
+                <w:rFonts w:ascii="宋体" w:eastAsia="宋体" w:hAnsi="宋体" w:cs="宋体" w:hint="eastAsia"/>
                 <w:sz w:val="24"/>
               </w:rPr>
             </w:pPr>
@@ -3978,7 +3375,7 @@
           <w:p>
             <w:pPr>
               <w:rPr>
-                <w:rFonts w:ascii="宋体" w:eastAsia="宋体" w:hAnsi="宋体" w:cs="宋体"/>
+                <w:rFonts w:ascii="宋体" w:eastAsia="宋体" w:hAnsi="宋体" w:cs="宋体" w:hint="eastAsia"/>
                 <w:sz w:val="24"/>
               </w:rPr>
             </w:pPr>
@@ -3993,7 +3390,7 @@
           <w:p>
             <w:pPr>
               <w:rPr>
-                <w:rFonts w:ascii="宋体" w:eastAsia="宋体" w:hAnsi="宋体" w:cs="宋体"/>
+                <w:rFonts w:ascii="宋体" w:eastAsia="宋体" w:hAnsi="宋体" w:cs="宋体" w:hint="eastAsia"/>
                 <w:sz w:val="24"/>
               </w:rPr>
             </w:pPr>
@@ -4017,7 +3414,7 @@
             <w:pPr>
               <w:jc w:val="center"/>
               <w:rPr>
-                <w:rFonts w:ascii="宋体" w:eastAsia="宋体" w:hAnsi="宋体" w:cs="宋体"/>
+                <w:rFonts w:ascii="宋体" w:eastAsia="宋体" w:hAnsi="宋体" w:cs="宋体" w:hint="eastAsia"/>
                 <w:sz w:val="24"/>
               </w:rPr>
             </w:pPr>
@@ -4038,7 +3435,7 @@
           <w:p>
             <w:pPr>
               <w:rPr>
-                <w:rFonts w:ascii="宋体" w:eastAsia="宋体" w:hAnsi="宋体" w:cs="宋体"/>
+                <w:rFonts w:ascii="宋体" w:eastAsia="宋体" w:hAnsi="宋体" w:cs="宋体" w:hint="eastAsia"/>
                 <w:sz w:val="24"/>
               </w:rPr>
             </w:pPr>
@@ -4053,7 +3450,7 @@
           <w:p>
             <w:pPr>
               <w:rPr>
-                <w:rFonts w:ascii="宋体" w:eastAsia="宋体" w:hAnsi="宋体" w:cs="宋体"/>
+                <w:rFonts w:ascii="宋体" w:eastAsia="宋体" w:hAnsi="宋体" w:cs="宋体" w:hint="eastAsia"/>
                 <w:sz w:val="24"/>
               </w:rPr>
             </w:pPr>
@@ -4068,7 +3465,7 @@
           <w:p>
             <w:pPr>
               <w:rPr>
-                <w:rFonts w:ascii="宋体" w:eastAsia="宋体" w:hAnsi="宋体" w:cs="宋体"/>
+                <w:rFonts w:ascii="宋体" w:eastAsia="宋体" w:hAnsi="宋体" w:cs="宋体" w:hint="eastAsia"/>
                 <w:sz w:val="24"/>
               </w:rPr>
             </w:pPr>
@@ -4083,7 +3480,7 @@
           <w:p>
             <w:pPr>
               <w:rPr>
-                <w:rFonts w:ascii="宋体" w:eastAsia="宋体" w:hAnsi="宋体" w:cs="宋体"/>
+                <w:rFonts w:ascii="宋体" w:eastAsia="宋体" w:hAnsi="宋体" w:cs="宋体" w:hint="eastAsia"/>
                 <w:sz w:val="24"/>
               </w:rPr>
             </w:pPr>
@@ -4104,7 +3501,7 @@
           <w:p>
             <w:pPr>
               <w:rPr>
-                <w:rFonts w:ascii="宋体" w:eastAsia="宋体" w:hAnsi="宋体" w:cs="宋体"/>
+                <w:rFonts w:ascii="宋体" w:eastAsia="宋体" w:hAnsi="宋体" w:cs="宋体" w:hint="eastAsia"/>
                 <w:sz w:val="24"/>
               </w:rPr>
             </w:pPr>
@@ -4119,7 +3516,7 @@
           <w:p>
             <w:pPr>
               <w:rPr>
-                <w:rFonts w:ascii="宋体" w:eastAsia="宋体" w:hAnsi="宋体" w:cs="宋体"/>
+                <w:rFonts w:ascii="宋体" w:eastAsia="宋体" w:hAnsi="宋体" w:cs="宋体" w:hint="eastAsia"/>
                 <w:sz w:val="24"/>
               </w:rPr>
             </w:pPr>
@@ -4134,7 +3531,7 @@
           <w:p>
             <w:pPr>
               <w:rPr>
-                <w:rFonts w:ascii="宋体" w:eastAsia="宋体" w:hAnsi="宋体" w:cs="宋体"/>
+                <w:rFonts w:ascii="宋体" w:eastAsia="宋体" w:hAnsi="宋体" w:cs="宋体" w:hint="eastAsia"/>
                 <w:sz w:val="24"/>
               </w:rPr>
             </w:pPr>
@@ -4149,7 +3546,7 @@
           <w:p>
             <w:pPr>
               <w:rPr>
-                <w:rFonts w:ascii="宋体" w:eastAsia="宋体" w:hAnsi="宋体" w:cs="宋体"/>
+                <w:rFonts w:ascii="宋体" w:eastAsia="宋体" w:hAnsi="宋体" w:cs="宋体" w:hint="eastAsia"/>
                 <w:sz w:val="24"/>
               </w:rPr>
             </w:pPr>
@@ -4173,7 +3570,7 @@
             <w:pPr>
               <w:jc w:val="center"/>
               <w:rPr>
-                <w:rFonts w:ascii="宋体" w:eastAsia="宋体" w:hAnsi="宋体" w:cs="宋体"/>
+                <w:rFonts w:ascii="宋体" w:eastAsia="宋体" w:hAnsi="宋体" w:cs="宋体" w:hint="eastAsia"/>
                 <w:sz w:val="24"/>
               </w:rPr>
             </w:pPr>
@@ -4195,7 +3592,7 @@
           <w:p>
             <w:pPr>
               <w:rPr>
-                <w:rFonts w:ascii="宋体" w:eastAsia="宋体" w:hAnsi="宋体" w:cs="宋体"/>
+                <w:rFonts w:ascii="宋体" w:eastAsia="宋体" w:hAnsi="宋体" w:cs="宋体" w:hint="eastAsia"/>
                 <w:sz w:val="24"/>
               </w:rPr>
             </w:pPr>
@@ -4210,7 +3607,7 @@
           <w:p>
             <w:pPr>
               <w:rPr>
-                <w:rFonts w:ascii="宋体" w:eastAsia="宋体" w:hAnsi="宋体" w:cs="宋体"/>
+                <w:rFonts w:ascii="宋体" w:eastAsia="宋体" w:hAnsi="宋体" w:cs="宋体" w:hint="eastAsia"/>
                 <w:sz w:val="24"/>
               </w:rPr>
             </w:pPr>
@@ -4225,7 +3622,7 @@
           <w:p>
             <w:pPr>
               <w:rPr>
-                <w:rFonts w:ascii="宋体" w:eastAsia="宋体" w:hAnsi="宋体" w:cs="宋体"/>
+                <w:rFonts w:ascii="宋体" w:eastAsia="宋体" w:hAnsi="宋体" w:cs="宋体" w:hint="eastAsia"/>
                 <w:sz w:val="24"/>
               </w:rPr>
             </w:pPr>
@@ -4240,7 +3637,7 @@
           <w:p>
             <w:pPr>
               <w:rPr>
-                <w:rFonts w:ascii="宋体" w:eastAsia="宋体" w:hAnsi="宋体" w:cs="宋体"/>
+                <w:rFonts w:ascii="宋体" w:eastAsia="宋体" w:hAnsi="宋体" w:cs="宋体" w:hint="eastAsia"/>
                 <w:sz w:val="24"/>
               </w:rPr>
             </w:pPr>
@@ -4261,7 +3658,7 @@
           <w:p>
             <w:pPr>
               <w:rPr>
-                <w:rFonts w:ascii="宋体" w:eastAsia="宋体" w:hAnsi="宋体" w:cs="宋体"/>
+                <w:rFonts w:ascii="宋体" w:eastAsia="宋体" w:hAnsi="宋体" w:cs="宋体" w:hint="eastAsia"/>
                 <w:sz w:val="24"/>
               </w:rPr>
             </w:pPr>
@@ -4276,7 +3673,7 @@
           <w:p>
             <w:pPr>
               <w:rPr>
-                <w:rFonts w:ascii="宋体" w:eastAsia="宋体" w:hAnsi="宋体" w:cs="宋体"/>
+                <w:rFonts w:ascii="宋体" w:eastAsia="宋体" w:hAnsi="宋体" w:cs="宋体" w:hint="eastAsia"/>
                 <w:sz w:val="24"/>
               </w:rPr>
             </w:pPr>
@@ -4291,7 +3688,7 @@
           <w:p>
             <w:pPr>
               <w:rPr>
-                <w:rFonts w:ascii="宋体" w:eastAsia="宋体" w:hAnsi="宋体" w:cs="宋体"/>
+                <w:rFonts w:ascii="宋体" w:eastAsia="宋体" w:hAnsi="宋体" w:cs="宋体" w:hint="eastAsia"/>
                 <w:sz w:val="24"/>
               </w:rPr>
             </w:pPr>
@@ -4306,7 +3703,7 @@
           <w:p>
             <w:pPr>
               <w:rPr>
-                <w:rFonts w:ascii="宋体" w:eastAsia="宋体" w:hAnsi="宋体" w:cs="宋体"/>
+                <w:rFonts w:ascii="宋体" w:eastAsia="宋体" w:hAnsi="宋体" w:cs="宋体" w:hint="eastAsia"/>
                 <w:sz w:val="24"/>
               </w:rPr>
             </w:pPr>
@@ -4330,7 +3727,7 @@
             <w:pPr>
               <w:jc w:val="center"/>
               <w:rPr>
-                <w:rFonts w:ascii="宋体" w:eastAsia="宋体" w:hAnsi="宋体" w:cs="宋体"/>
+                <w:rFonts w:ascii="宋体" w:eastAsia="宋体" w:hAnsi="宋体" w:cs="宋体" w:hint="eastAsia"/>
                 <w:sz w:val="24"/>
               </w:rPr>
             </w:pPr>
@@ -4351,7 +3748,7 @@
           <w:p>
             <w:pPr>
               <w:rPr>
-                <w:rFonts w:ascii="宋体" w:eastAsia="宋体" w:hAnsi="宋体" w:cs="宋体"/>
+                <w:rFonts w:ascii="宋体" w:eastAsia="宋体" w:hAnsi="宋体" w:cs="宋体" w:hint="eastAsia"/>
                 <w:sz w:val="24"/>
               </w:rPr>
             </w:pPr>
@@ -4366,7 +3763,7 @@
           <w:p>
             <w:pPr>
               <w:rPr>
-                <w:rFonts w:ascii="宋体" w:eastAsia="宋体" w:hAnsi="宋体" w:cs="宋体"/>
+                <w:rFonts w:ascii="宋体" w:eastAsia="宋体" w:hAnsi="宋体" w:cs="宋体" w:hint="eastAsia"/>
                 <w:sz w:val="24"/>
               </w:rPr>
             </w:pPr>
@@ -4381,7 +3778,7 @@
           <w:p>
             <w:pPr>
               <w:rPr>
-                <w:rFonts w:ascii="宋体" w:eastAsia="宋体" w:hAnsi="宋体" w:cs="宋体"/>
+                <w:rFonts w:ascii="宋体" w:eastAsia="宋体" w:hAnsi="宋体" w:cs="宋体" w:hint="eastAsia"/>
                 <w:sz w:val="24"/>
               </w:rPr>
             </w:pPr>
@@ -4396,7 +3793,7 @@
           <w:p>
             <w:pPr>
               <w:rPr>
-                <w:rFonts w:ascii="宋体" w:eastAsia="宋体" w:hAnsi="宋体" w:cs="宋体"/>
+                <w:rFonts w:ascii="宋体" w:eastAsia="宋体" w:hAnsi="宋体" w:cs="宋体" w:hint="eastAsia"/>
                 <w:sz w:val="24"/>
               </w:rPr>
             </w:pPr>
@@ -4417,7 +3814,7 @@
           <w:p>
             <w:pPr>
               <w:rPr>
-                <w:rFonts w:ascii="宋体" w:eastAsia="宋体" w:hAnsi="宋体" w:cs="宋体"/>
+                <w:rFonts w:ascii="宋体" w:eastAsia="宋体" w:hAnsi="宋体" w:cs="宋体" w:hint="eastAsia"/>
                 <w:sz w:val="24"/>
               </w:rPr>
             </w:pPr>
@@ -4432,7 +3829,7 @@
           <w:p>
             <w:pPr>
               <w:rPr>
-                <w:rFonts w:ascii="宋体" w:eastAsia="宋体" w:hAnsi="宋体" w:cs="宋体"/>
+                <w:rFonts w:ascii="宋体" w:eastAsia="宋体" w:hAnsi="宋体" w:cs="宋体" w:hint="eastAsia"/>
                 <w:sz w:val="24"/>
               </w:rPr>
             </w:pPr>
@@ -4447,7 +3844,7 @@
           <w:p>
             <w:pPr>
               <w:rPr>
-                <w:rFonts w:ascii="宋体" w:eastAsia="宋体" w:hAnsi="宋体" w:cs="宋体"/>
+                <w:rFonts w:ascii="宋体" w:eastAsia="宋体" w:hAnsi="宋体" w:cs="宋体" w:hint="eastAsia"/>
                 <w:sz w:val="24"/>
               </w:rPr>
             </w:pPr>
@@ -4462,7 +3859,7 @@
           <w:p>
             <w:pPr>
               <w:rPr>
-                <w:rFonts w:ascii="宋体" w:eastAsia="宋体" w:hAnsi="宋体" w:cs="宋体"/>
+                <w:rFonts w:ascii="宋体" w:eastAsia="宋体" w:hAnsi="宋体" w:cs="宋体" w:hint="eastAsia"/>
                 <w:sz w:val="24"/>
               </w:rPr>
             </w:pPr>
@@ -4480,7 +3877,7 @@
     <w:p>
       <w:pPr>
         <w:rPr>
-          <w:rFonts w:ascii="宋体" w:eastAsia="宋体" w:hAnsi="宋体" w:cs="宋体"/>
+          <w:rFonts w:ascii="宋体" w:eastAsia="宋体" w:hAnsi="宋体" w:cs="宋体" w:hint="eastAsia"/>
           <w:b/>
           <w:bCs/>
           <w:sz w:val="24"/>
@@ -4521,7 +3918,7 @@
             <w:pPr>
               <w:jc w:val="center"/>
               <w:rPr>
-                <w:rFonts w:ascii="宋体" w:eastAsia="宋体" w:hAnsi="宋体" w:cs="宋体"/>
+                <w:rFonts w:ascii="宋体" w:eastAsia="宋体" w:hAnsi="宋体" w:cs="宋体" w:hint="eastAsia"/>
                 <w:b/>
                 <w:bCs/>
                 <w:sz w:val="24"/>
@@ -4547,7 +3944,7 @@
             <w:pPr>
               <w:jc w:val="center"/>
               <w:rPr>
-                <w:rFonts w:ascii="宋体" w:eastAsia="宋体" w:hAnsi="宋体" w:cs="宋体"/>
+                <w:rFonts w:ascii="宋体" w:eastAsia="宋体" w:hAnsi="宋体" w:cs="宋体" w:hint="eastAsia"/>
                 <w:b/>
                 <w:bCs/>
                 <w:sz w:val="24"/>
@@ -4575,7 +3972,7 @@
             <w:pPr>
               <w:jc w:val="center"/>
               <w:rPr>
-                <w:rFonts w:ascii="宋体" w:eastAsia="宋体" w:hAnsi="宋体" w:cs="宋体"/>
+                <w:rFonts w:ascii="宋体" w:eastAsia="宋体" w:hAnsi="宋体" w:cs="宋体" w:hint="eastAsia"/>
                 <w:sz w:val="24"/>
               </w:rPr>
             </w:pPr>
@@ -4595,7 +3992,7 @@
           <w:p>
             <w:pPr>
               <w:rPr>
-                <w:rFonts w:ascii="宋体" w:eastAsia="宋体" w:hAnsi="宋体" w:cs="宋体"/>
+                <w:rFonts w:ascii="宋体" w:eastAsia="宋体" w:hAnsi="宋体" w:cs="宋体" w:hint="eastAsia"/>
                 <w:sz w:val="24"/>
               </w:rPr>
             </w:pPr>
@@ -4610,7 +4007,7 @@
           <w:p>
             <w:pPr>
               <w:rPr>
-                <w:rFonts w:ascii="宋体" w:eastAsia="宋体" w:hAnsi="宋体" w:cs="宋体"/>
+                <w:rFonts w:ascii="宋体" w:eastAsia="宋体" w:hAnsi="宋体" w:cs="宋体" w:hint="eastAsia"/>
                 <w:b/>
                 <w:bCs/>
                 <w:sz w:val="30"/>
@@ -4637,7 +4034,7 @@
             <w:pPr>
               <w:jc w:val="center"/>
               <w:rPr>
-                <w:rFonts w:ascii="宋体" w:eastAsia="宋体" w:hAnsi="宋体" w:cs="宋体"/>
+                <w:rFonts w:ascii="宋体" w:eastAsia="宋体" w:hAnsi="宋体" w:cs="宋体" w:hint="eastAsia"/>
                 <w:sz w:val="24"/>
               </w:rPr>
             </w:pPr>
@@ -4657,7 +4054,7 @@
           <w:p>
             <w:pPr>
               <w:rPr>
-                <w:rFonts w:ascii="宋体" w:eastAsia="宋体" w:hAnsi="宋体" w:cs="宋体"/>
+                <w:rFonts w:ascii="宋体" w:eastAsia="宋体" w:hAnsi="宋体" w:cs="宋体" w:hint="eastAsia"/>
                 <w:sz w:val="24"/>
               </w:rPr>
             </w:pPr>
@@ -4672,7 +4069,7 @@
           <w:p>
             <w:pPr>
               <w:rPr>
-                <w:rFonts w:ascii="宋体" w:eastAsia="宋体" w:hAnsi="宋体" w:cs="宋体"/>
+                <w:rFonts w:ascii="宋体" w:eastAsia="宋体" w:hAnsi="宋体" w:cs="宋体" w:hint="eastAsia"/>
                 <w:sz w:val="24"/>
               </w:rPr>
             </w:pPr>
@@ -4696,7 +4093,7 @@
             <w:pPr>
               <w:jc w:val="center"/>
               <w:rPr>
-                <w:rFonts w:ascii="宋体" w:eastAsia="宋体" w:hAnsi="宋体" w:cs="宋体"/>
+                <w:rFonts w:ascii="宋体" w:eastAsia="宋体" w:hAnsi="宋体" w:cs="宋体" w:hint="eastAsia"/>
                 <w:sz w:val="24"/>
               </w:rPr>
             </w:pPr>
@@ -4716,7 +4113,7 @@
           <w:p>
             <w:pPr>
               <w:rPr>
-                <w:rFonts w:ascii="宋体" w:eastAsia="宋体" w:hAnsi="宋体" w:cs="宋体"/>
+                <w:rFonts w:ascii="宋体" w:eastAsia="宋体" w:hAnsi="宋体" w:cs="宋体" w:hint="eastAsia"/>
                 <w:sz w:val="24"/>
               </w:rPr>
             </w:pPr>
@@ -4731,7 +4128,7 @@
           <w:p>
             <w:pPr>
               <w:rPr>
-                <w:rFonts w:ascii="宋体" w:eastAsia="宋体" w:hAnsi="宋体" w:cs="宋体"/>
+                <w:rFonts w:ascii="宋体" w:eastAsia="宋体" w:hAnsi="宋体" w:cs="宋体" w:hint="eastAsia"/>
                 <w:sz w:val="24"/>
               </w:rPr>
             </w:pPr>
@@ -4755,7 +4152,7 @@
             <w:pPr>
               <w:jc w:val="center"/>
               <w:rPr>
-                <w:rFonts w:ascii="宋体" w:eastAsia="宋体" w:hAnsi="宋体" w:cs="宋体"/>
+                <w:rFonts w:ascii="宋体" w:eastAsia="宋体" w:hAnsi="宋体" w:cs="宋体" w:hint="eastAsia"/>
                 <w:sz w:val="24"/>
               </w:rPr>
             </w:pPr>
@@ -4775,7 +4172,7 @@
           <w:p>
             <w:pPr>
               <w:rPr>
-                <w:rFonts w:ascii="宋体" w:eastAsia="宋体" w:hAnsi="宋体" w:cs="宋体"/>
+                <w:rFonts w:ascii="宋体" w:eastAsia="宋体" w:hAnsi="宋体" w:cs="宋体" w:hint="eastAsia"/>
                 <w:sz w:val="24"/>
               </w:rPr>
             </w:pPr>
@@ -4790,7 +4187,7 @@
           <w:p>
             <w:pPr>
               <w:rPr>
-                <w:rFonts w:ascii="宋体" w:eastAsia="宋体" w:hAnsi="宋体" w:cs="宋体"/>
+                <w:rFonts w:ascii="宋体" w:eastAsia="宋体" w:hAnsi="宋体" w:cs="宋体" w:hint="eastAsia"/>
                 <w:sz w:val="24"/>
               </w:rPr>
             </w:pPr>
@@ -4814,7 +4211,7 @@
             <w:pPr>
               <w:jc w:val="center"/>
               <w:rPr>
-                <w:rFonts w:ascii="宋体" w:eastAsia="宋体" w:hAnsi="宋体" w:cs="宋体"/>
+                <w:rFonts w:ascii="宋体" w:eastAsia="宋体" w:hAnsi="宋体" w:cs="宋体" w:hint="eastAsia"/>
                 <w:sz w:val="24"/>
               </w:rPr>
             </w:pPr>
@@ -4834,7 +4231,7 @@
           <w:p>
             <w:pPr>
               <w:rPr>
-                <w:rFonts w:ascii="宋体" w:eastAsia="宋体" w:hAnsi="宋体" w:cs="宋体"/>
+                <w:rFonts w:ascii="宋体" w:eastAsia="宋体" w:hAnsi="宋体" w:cs="宋体" w:hint="eastAsia"/>
                 <w:sz w:val="24"/>
               </w:rPr>
             </w:pPr>
@@ -4849,7 +4246,7 @@
           <w:p>
             <w:pPr>
               <w:rPr>
-                <w:rFonts w:ascii="宋体" w:eastAsia="宋体" w:hAnsi="宋体" w:cs="宋体"/>
+                <w:rFonts w:ascii="宋体" w:eastAsia="宋体" w:hAnsi="宋体" w:cs="宋体" w:hint="eastAsia"/>
                 <w:sz w:val="24"/>
               </w:rPr>
             </w:pPr>
@@ -4873,7 +4270,7 @@
             <w:pPr>
               <w:jc w:val="center"/>
               <w:rPr>
-                <w:rFonts w:ascii="宋体" w:eastAsia="宋体" w:hAnsi="宋体" w:cs="宋体"/>
+                <w:rFonts w:ascii="宋体" w:eastAsia="宋体" w:hAnsi="宋体" w:cs="宋体" w:hint="eastAsia"/>
                 <w:sz w:val="24"/>
               </w:rPr>
             </w:pPr>
@@ -4893,7 +4290,7 @@
           <w:p>
             <w:pPr>
               <w:rPr>
-                <w:rFonts w:ascii="宋体" w:eastAsia="宋体" w:hAnsi="宋体" w:cs="宋体"/>
+                <w:rFonts w:ascii="宋体" w:eastAsia="宋体" w:hAnsi="宋体" w:cs="宋体" w:hint="eastAsia"/>
                 <w:sz w:val="24"/>
               </w:rPr>
             </w:pPr>
@@ -4908,7 +4305,7 @@
           <w:p>
             <w:pPr>
               <w:rPr>
-                <w:rFonts w:ascii="宋体" w:eastAsia="宋体" w:hAnsi="宋体" w:cs="宋体"/>
+                <w:rFonts w:ascii="宋体" w:eastAsia="宋体" w:hAnsi="宋体" w:cs="宋体" w:hint="eastAsia"/>
                 <w:sz w:val="24"/>
               </w:rPr>
             </w:pPr>
@@ -4932,7 +4329,7 @@
             <w:pPr>
               <w:jc w:val="center"/>
               <w:rPr>
-                <w:rFonts w:ascii="宋体" w:eastAsia="宋体" w:hAnsi="宋体" w:cs="宋体"/>
+                <w:rFonts w:ascii="宋体" w:eastAsia="宋体" w:hAnsi="宋体" w:cs="宋体" w:hint="eastAsia"/>
                 <w:sz w:val="24"/>
               </w:rPr>
             </w:pPr>
@@ -4952,7 +4349,7 @@
           <w:p>
             <w:pPr>
               <w:rPr>
-                <w:rFonts w:ascii="宋体" w:eastAsia="宋体" w:hAnsi="宋体" w:cs="宋体"/>
+                <w:rFonts w:ascii="宋体" w:eastAsia="宋体" w:hAnsi="宋体" w:cs="宋体" w:hint="eastAsia"/>
                 <w:sz w:val="24"/>
               </w:rPr>
             </w:pPr>
@@ -4967,7 +4364,7 @@
           <w:p>
             <w:pPr>
               <w:rPr>
-                <w:rFonts w:ascii="宋体" w:eastAsia="宋体" w:hAnsi="宋体" w:cs="宋体"/>
+                <w:rFonts w:ascii="宋体" w:eastAsia="宋体" w:hAnsi="宋体" w:cs="宋体" w:hint="eastAsia"/>
                 <w:sz w:val="24"/>
               </w:rPr>
             </w:pPr>
@@ -4991,7 +4388,7 @@
             <w:pPr>
               <w:jc w:val="center"/>
               <w:rPr>
-                <w:rFonts w:ascii="宋体" w:eastAsia="宋体" w:hAnsi="宋体" w:cs="宋体"/>
+                <w:rFonts w:ascii="宋体" w:eastAsia="宋体" w:hAnsi="宋体" w:cs="宋体" w:hint="eastAsia"/>
                 <w:sz w:val="24"/>
               </w:rPr>
             </w:pPr>
@@ -5011,7 +4408,7 @@
           <w:p>
             <w:pPr>
               <w:rPr>
-                <w:rFonts w:ascii="宋体" w:eastAsia="宋体" w:hAnsi="宋体" w:cs="宋体"/>
+                <w:rFonts w:ascii="宋体" w:eastAsia="宋体" w:hAnsi="宋体" w:cs="宋体" w:hint="eastAsia"/>
                 <w:sz w:val="24"/>
               </w:rPr>
             </w:pPr>
@@ -5034,7 +4431,7 @@
           <w:p>
             <w:pPr>
               <w:rPr>
-                <w:rFonts w:ascii="宋体" w:eastAsia="宋体" w:hAnsi="宋体" w:cs="宋体"/>
+                <w:rFonts w:ascii="宋体" w:eastAsia="宋体" w:hAnsi="宋体" w:cs="宋体" w:hint="eastAsia"/>
                 <w:sz w:val="24"/>
               </w:rPr>
             </w:pPr>
@@ -5057,7 +4454,7 @@
         </w:numPr>
         <w:spacing w:line="360" w:lineRule="auto"/>
         <w:rPr>
-          <w:rFonts w:ascii="宋体" w:eastAsia="宋体" w:hAnsi="宋体" w:cs="宋体"/>
+          <w:rFonts w:ascii="宋体" w:eastAsia="宋体" w:hAnsi="宋体" w:cs="宋体" w:hint="eastAsia"/>
           <w:b/>
           <w:bCs/>
           <w:sz w:val="24"/>
@@ -5079,7 +4476,7 @@
     <w:p>
       <w:pPr>
         <w:rPr>
-          <w:rFonts w:ascii="宋体" w:eastAsia="宋体" w:hAnsi="宋体" w:cs="宋体"/>
+          <w:rFonts w:ascii="宋体" w:eastAsia="宋体" w:hAnsi="宋体" w:cs="宋体" w:hint="eastAsia"/>
           <w:b/>
           <w:bCs/>
           <w:sz w:val="24"/>
@@ -5098,7 +4495,7 @@
     <w:p>
       <w:pPr>
         <w:rPr>
-          <w:rFonts w:ascii="宋体" w:eastAsia="宋体" w:hAnsi="宋体" w:cs="宋体"/>
+          <w:rFonts w:ascii="宋体" w:eastAsia="宋体" w:hAnsi="宋体" w:cs="宋体" w:hint="eastAsia"/>
           <w:sz w:val="24"/>
         </w:rPr>
       </w:pPr>
@@ -5125,7 +4522,7 @@
                     </pic:cNvPicPr>
                   </pic:nvPicPr>
                   <pic:blipFill>
-                    <a:blip r:embed="rId17"/>
+                    <a:blip r:embed="rId16"/>
                     <a:stretch>
                       <a:fillRect/>
                     </a:stretch>
@@ -5153,7 +4550,7 @@
     <w:p>
       <w:pPr>
         <w:rPr>
-          <w:rFonts w:ascii="宋体" w:eastAsia="宋体" w:hAnsi="宋体" w:cs="宋体"/>
+          <w:rFonts w:ascii="宋体" w:eastAsia="宋体" w:hAnsi="宋体" w:cs="宋体" w:hint="eastAsia"/>
           <w:b/>
           <w:bCs/>
           <w:sz w:val="24"/>
@@ -5173,7 +4570,7 @@
       <w:pPr>
         <w:ind w:firstLineChars="200" w:firstLine="480"/>
         <w:rPr>
-          <w:rFonts w:ascii="宋体" w:eastAsia="宋体" w:hAnsi="宋体" w:cs="宋体"/>
+          <w:rFonts w:ascii="宋体" w:eastAsia="宋体" w:hAnsi="宋体" w:cs="宋体" w:hint="eastAsia"/>
           <w:sz w:val="24"/>
         </w:rPr>
       </w:pPr>
@@ -5189,7 +4586,7 @@
       <w:pPr>
         <w:ind w:firstLineChars="200" w:firstLine="480"/>
         <w:rPr>
-          <w:rFonts w:ascii="宋体" w:eastAsia="宋体" w:hAnsi="宋体" w:cs="宋体"/>
+          <w:rFonts w:ascii="宋体" w:eastAsia="宋体" w:hAnsi="宋体" w:cs="宋体" w:hint="eastAsia"/>
           <w:sz w:val="24"/>
         </w:rPr>
       </w:pPr>
@@ -5205,7 +4602,7 @@
       <w:pPr>
         <w:ind w:firstLineChars="200" w:firstLine="480"/>
         <w:rPr>
-          <w:rFonts w:ascii="宋体" w:eastAsia="宋体" w:hAnsi="宋体" w:cs="宋体"/>
+          <w:rFonts w:ascii="宋体" w:eastAsia="宋体" w:hAnsi="宋体" w:cs="宋体" w:hint="eastAsia"/>
           <w:sz w:val="24"/>
         </w:rPr>
       </w:pPr>
@@ -5221,7 +4618,7 @@
       <w:pPr>
         <w:ind w:firstLineChars="200" w:firstLine="480"/>
         <w:rPr>
-          <w:rFonts w:ascii="宋体" w:eastAsia="宋体" w:hAnsi="宋体" w:cs="宋体"/>
+          <w:rFonts w:ascii="宋体" w:eastAsia="宋体" w:hAnsi="宋体" w:cs="宋体" w:hint="eastAsia"/>
           <w:sz w:val="24"/>
           <w:szCs w:val="24"/>
         </w:rPr>
@@ -5279,7 +4676,7 @@
       <w:pPr>
         <w:ind w:firstLineChars="200" w:firstLine="480"/>
         <w:rPr>
-          <w:rFonts w:ascii="宋体" w:eastAsia="宋体" w:hAnsi="宋体" w:cs="宋体"/>
+          <w:rFonts w:ascii="宋体" w:eastAsia="宋体" w:hAnsi="宋体" w:cs="宋体" w:hint="eastAsia"/>
           <w:sz w:val="24"/>
           <w:szCs w:val="24"/>
         </w:rPr>
@@ -5336,17 +4733,17 @@
     <w:p>
       <w:pPr>
         <w:rPr>
-          <w:rFonts w:ascii="宋体" w:eastAsia="宋体" w:hAnsi="宋体" w:cs="宋体"/>
-          <w:sz w:val="24"/>
-          <w:szCs w:val="24"/>
-        </w:rPr>
-      </w:pPr>
-    </w:p>
-    <w:p>
-      <w:pPr>
-        <w:spacing w:line="360" w:lineRule="auto"/>
-        <w:rPr>
-          <w:rFonts w:ascii="宋体" w:eastAsia="宋体" w:hAnsi="宋体" w:cs="宋体"/>
+          <w:rFonts w:ascii="宋体" w:eastAsia="宋体" w:hAnsi="宋体" w:cs="宋体" w:hint="eastAsia"/>
+          <w:sz w:val="24"/>
+          <w:szCs w:val="24"/>
+        </w:rPr>
+      </w:pPr>
+    </w:p>
+    <w:p>
+      <w:pPr>
+        <w:spacing w:line="360" w:lineRule="auto"/>
+        <w:rPr>
+          <w:rFonts w:ascii="宋体" w:eastAsia="宋体" w:hAnsi="宋体" w:cs="宋体" w:hint="eastAsia"/>
           <w:b/>
           <w:bCs/>
           <w:sz w:val="28"/>
@@ -5369,7 +4766,7 @@
         <w:spacing w:line="360" w:lineRule="auto"/>
         <w:jc w:val="left"/>
         <w:rPr>
-          <w:rFonts w:ascii="宋体" w:eastAsia="宋体" w:hAnsi="宋体" w:cs="宋体"/>
+          <w:rFonts w:ascii="宋体" w:eastAsia="宋体" w:hAnsi="宋体" w:cs="宋体" w:hint="eastAsia"/>
           <w:b/>
           <w:bCs/>
           <w:sz w:val="24"/>
@@ -5392,7 +4789,7 @@
         <w:spacing w:line="360" w:lineRule="auto"/>
         <w:jc w:val="left"/>
         <w:rPr>
-          <w:rFonts w:ascii="宋体" w:eastAsia="宋体" w:hAnsi="宋体" w:cs="宋体"/>
+          <w:rFonts w:ascii="宋体" w:eastAsia="宋体" w:hAnsi="宋体" w:cs="宋体" w:hint="eastAsia"/>
           <w:b/>
           <w:bCs/>
           <w:sz w:val="24"/>
@@ -5416,7 +4813,7 @@
         <w:ind w:firstLineChars="200" w:firstLine="480"/>
         <w:jc w:val="left"/>
         <w:rPr>
-          <w:rFonts w:ascii="宋体" w:eastAsia="宋体" w:hAnsi="宋体" w:cs="宋体"/>
+          <w:rFonts w:ascii="宋体" w:eastAsia="宋体" w:hAnsi="宋体" w:cs="宋体" w:hint="eastAsia"/>
           <w:sz w:val="24"/>
           <w:szCs w:val="24"/>
         </w:rPr>
@@ -5454,7 +4851,7 @@
         <w:ind w:firstLineChars="200" w:firstLine="480"/>
         <w:jc w:val="left"/>
         <w:rPr>
-          <w:rFonts w:ascii="宋体" w:eastAsia="宋体" w:hAnsi="宋体" w:cs="宋体"/>
+          <w:rFonts w:ascii="宋体" w:eastAsia="宋体" w:hAnsi="宋体" w:cs="宋体" w:hint="eastAsia"/>
           <w:sz w:val="24"/>
           <w:szCs w:val="24"/>
         </w:rPr>
@@ -5474,7 +4871,7 @@
         <w:ind w:firstLineChars="200" w:firstLine="480"/>
         <w:jc w:val="left"/>
         <w:rPr>
-          <w:rFonts w:ascii="宋体" w:eastAsia="宋体" w:hAnsi="宋体" w:cs="宋体"/>
+          <w:rFonts w:ascii="宋体" w:eastAsia="宋体" w:hAnsi="宋体" w:cs="宋体" w:hint="eastAsia"/>
           <w:sz w:val="24"/>
           <w:szCs w:val="24"/>
         </w:rPr>
@@ -5503,7 +4900,7 @@
         <w:ind w:firstLineChars="200" w:firstLine="480"/>
         <w:jc w:val="left"/>
         <w:rPr>
-          <w:rFonts w:ascii="宋体" w:eastAsia="宋体" w:hAnsi="宋体" w:cs="宋体"/>
+          <w:rFonts w:ascii="宋体" w:eastAsia="宋体" w:hAnsi="宋体" w:cs="宋体" w:hint="eastAsia"/>
           <w:sz w:val="24"/>
           <w:szCs w:val="24"/>
         </w:rPr>
@@ -5523,7 +4920,7 @@
         <w:ind w:firstLineChars="200" w:firstLine="480"/>
         <w:jc w:val="left"/>
         <w:rPr>
-          <w:rFonts w:ascii="宋体" w:eastAsia="宋体" w:hAnsi="宋体" w:cs="宋体"/>
+          <w:rFonts w:ascii="宋体" w:eastAsia="宋体" w:hAnsi="宋体" w:cs="宋体" w:hint="eastAsia"/>
           <w:sz w:val="24"/>
           <w:szCs w:val="24"/>
         </w:rPr>
@@ -5600,7 +4997,7 @@
         <w:spacing w:line="360" w:lineRule="auto"/>
         <w:jc w:val="left"/>
         <w:rPr>
-          <w:rFonts w:ascii="宋体" w:eastAsia="宋体" w:hAnsi="宋体" w:cs="宋体"/>
+          <w:rFonts w:ascii="宋体" w:eastAsia="宋体" w:hAnsi="宋体" w:cs="宋体" w:hint="eastAsia"/>
           <w:b/>
           <w:bCs/>
           <w:sz w:val="24"/>
@@ -5626,7 +5023,7 @@
         <w:ind w:firstLineChars="200" w:firstLine="480"/>
         <w:jc w:val="left"/>
         <w:rPr>
-          <w:rFonts w:ascii="宋体" w:eastAsia="宋体" w:hAnsi="宋体" w:cs="宋体"/>
+          <w:rFonts w:ascii="宋体" w:eastAsia="宋体" w:hAnsi="宋体" w:cs="宋体" w:hint="eastAsia"/>
           <w:color w:val="000000"/>
           <w:kern w:val="0"/>
           <w:sz w:val="24"/>
@@ -5650,7 +5047,7 @@
         <w:ind w:firstLineChars="200" w:firstLine="480"/>
         <w:jc w:val="left"/>
         <w:rPr>
-          <w:rFonts w:ascii="宋体" w:eastAsia="宋体" w:hAnsi="宋体" w:cs="宋体"/>
+          <w:rFonts w:ascii="宋体" w:eastAsia="宋体" w:hAnsi="宋体" w:cs="宋体" w:hint="eastAsia"/>
           <w:color w:val="000000"/>
           <w:kern w:val="0"/>
           <w:sz w:val="24"/>
@@ -5683,7 +5080,7 @@
         <w:ind w:firstLineChars="200" w:firstLine="480"/>
         <w:jc w:val="left"/>
         <w:rPr>
-          <w:rFonts w:ascii="宋体" w:eastAsia="宋体" w:hAnsi="宋体" w:cs="宋体"/>
+          <w:rFonts w:ascii="宋体" w:eastAsia="宋体" w:hAnsi="宋体" w:cs="宋体" w:hint="eastAsia"/>
           <w:sz w:val="24"/>
           <w:szCs w:val="24"/>
         </w:rPr>
@@ -5703,7 +5100,7 @@
         <w:ind w:firstLineChars="200" w:firstLine="480"/>
         <w:jc w:val="left"/>
         <w:rPr>
-          <w:rFonts w:ascii="宋体" w:eastAsia="宋体" w:hAnsi="宋体" w:cs="宋体"/>
+          <w:rFonts w:ascii="宋体" w:eastAsia="宋体" w:hAnsi="宋体" w:cs="宋体" w:hint="eastAsia"/>
           <w:sz w:val="24"/>
           <w:szCs w:val="24"/>
         </w:rPr>
@@ -5762,7 +5159,7 @@
         <w:spacing w:line="360" w:lineRule="auto"/>
         <w:jc w:val="left"/>
         <w:rPr>
-          <w:rFonts w:ascii="宋体" w:eastAsia="宋体" w:hAnsi="宋体" w:cs="宋体"/>
+          <w:rFonts w:ascii="宋体" w:eastAsia="宋体" w:hAnsi="宋体" w:cs="宋体" w:hint="eastAsia"/>
           <w:b/>
           <w:bCs/>
           <w:sz w:val="24"/>
@@ -5786,7 +5183,7 @@
         <w:ind w:firstLineChars="200" w:firstLine="480"/>
         <w:jc w:val="left"/>
         <w:rPr>
-          <w:rFonts w:ascii="宋体" w:eastAsia="宋体" w:hAnsi="宋体" w:cs="宋体"/>
+          <w:rFonts w:ascii="宋体" w:eastAsia="宋体" w:hAnsi="宋体" w:cs="宋体" w:hint="eastAsia"/>
           <w:sz w:val="24"/>
           <w:szCs w:val="24"/>
         </w:rPr>
@@ -5806,7 +5203,7 @@
         <w:ind w:firstLineChars="200" w:firstLine="480"/>
         <w:jc w:val="left"/>
         <w:rPr>
-          <w:rFonts w:ascii="宋体" w:eastAsia="宋体" w:hAnsi="宋体" w:cs="宋体"/>
+          <w:rFonts w:ascii="宋体" w:eastAsia="宋体" w:hAnsi="宋体" w:cs="宋体" w:hint="eastAsia"/>
           <w:sz w:val="24"/>
           <w:szCs w:val="24"/>
         </w:rPr>
@@ -5826,7 +5223,7 @@
         <w:ind w:firstLineChars="200" w:firstLine="480"/>
         <w:jc w:val="left"/>
         <w:rPr>
-          <w:rFonts w:ascii="宋体" w:eastAsia="宋体" w:hAnsi="宋体" w:cs="宋体"/>
+          <w:rFonts w:ascii="宋体" w:eastAsia="宋体" w:hAnsi="宋体" w:cs="宋体" w:hint="eastAsia"/>
           <w:sz w:val="24"/>
           <w:szCs w:val="24"/>
         </w:rPr>
@@ -5846,7 +5243,7 @@
         <w:ind w:firstLineChars="200" w:firstLine="480"/>
         <w:jc w:val="left"/>
         <w:rPr>
-          <w:rFonts w:ascii="宋体" w:eastAsia="宋体" w:hAnsi="宋体" w:cs="宋体"/>
+          <w:rFonts w:ascii="宋体" w:eastAsia="宋体" w:hAnsi="宋体" w:cs="宋体" w:hint="eastAsia"/>
           <w:sz w:val="24"/>
           <w:szCs w:val="24"/>
         </w:rPr>
@@ -5905,7 +5302,7 @@
         <w:spacing w:line="360" w:lineRule="auto"/>
         <w:jc w:val="left"/>
         <w:rPr>
-          <w:rFonts w:ascii="宋体" w:eastAsia="宋体" w:hAnsi="宋体" w:cs="宋体"/>
+          <w:rFonts w:ascii="宋体" w:eastAsia="宋体" w:hAnsi="宋体" w:cs="宋体" w:hint="eastAsia"/>
           <w:b/>
           <w:bCs/>
           <w:sz w:val="24"/>
@@ -5929,7 +5326,7 @@
         <w:ind w:firstLineChars="200" w:firstLine="480"/>
         <w:jc w:val="left"/>
         <w:rPr>
-          <w:rFonts w:ascii="宋体" w:eastAsia="宋体" w:hAnsi="宋体" w:cs="宋体"/>
+          <w:rFonts w:ascii="宋体" w:eastAsia="宋体" w:hAnsi="宋体" w:cs="宋体" w:hint="eastAsia"/>
           <w:sz w:val="24"/>
           <w:szCs w:val="24"/>
         </w:rPr>
@@ -5949,7 +5346,7 @@
         <w:ind w:firstLineChars="200" w:firstLine="480"/>
         <w:jc w:val="left"/>
         <w:rPr>
-          <w:rFonts w:ascii="宋体" w:eastAsia="宋体" w:hAnsi="宋体" w:cs="宋体"/>
+          <w:rFonts w:ascii="宋体" w:eastAsia="宋体" w:hAnsi="宋体" w:cs="宋体" w:hint="eastAsia"/>
           <w:sz w:val="24"/>
           <w:szCs w:val="24"/>
         </w:rPr>
@@ -5969,7 +5366,7 @@
         <w:ind w:firstLineChars="200" w:firstLine="480"/>
         <w:jc w:val="left"/>
         <w:rPr>
-          <w:rFonts w:ascii="宋体" w:eastAsia="宋体" w:hAnsi="宋体" w:cs="宋体"/>
+          <w:rFonts w:ascii="宋体" w:eastAsia="宋体" w:hAnsi="宋体" w:cs="宋体" w:hint="eastAsia"/>
           <w:sz w:val="24"/>
           <w:szCs w:val="24"/>
         </w:rPr>
@@ -5989,7 +5386,7 @@
         <w:ind w:firstLineChars="200" w:firstLine="480"/>
         <w:jc w:val="left"/>
         <w:rPr>
-          <w:rFonts w:ascii="宋体" w:eastAsia="宋体" w:hAnsi="宋体" w:cs="宋体"/>
+          <w:rFonts w:ascii="宋体" w:eastAsia="宋体" w:hAnsi="宋体" w:cs="宋体" w:hint="eastAsia"/>
           <w:sz w:val="24"/>
           <w:szCs w:val="24"/>
         </w:rPr>
@@ -6017,7 +5414,7 @@
         <w:spacing w:line="360" w:lineRule="auto"/>
         <w:jc w:val="left"/>
         <w:rPr>
-          <w:rFonts w:ascii="宋体" w:eastAsia="宋体" w:hAnsi="宋体" w:cs="宋体"/>
+          <w:rFonts w:ascii="宋体" w:eastAsia="宋体" w:hAnsi="宋体" w:cs="宋体" w:hint="eastAsia"/>
           <w:b/>
           <w:bCs/>
           <w:sz w:val="24"/>
@@ -6041,7 +5438,7 @@
         <w:ind w:firstLineChars="200" w:firstLine="480"/>
         <w:jc w:val="left"/>
         <w:rPr>
-          <w:rFonts w:ascii="宋体" w:eastAsia="宋体" w:hAnsi="宋体" w:cs="宋体"/>
+          <w:rFonts w:ascii="宋体" w:eastAsia="宋体" w:hAnsi="宋体" w:cs="宋体" w:hint="eastAsia"/>
           <w:sz w:val="24"/>
           <w:szCs w:val="24"/>
         </w:rPr>
@@ -6061,7 +5458,7 @@
         <w:ind w:firstLineChars="200" w:firstLine="480"/>
         <w:jc w:val="left"/>
         <w:rPr>
-          <w:rFonts w:ascii="宋体" w:eastAsia="宋体" w:hAnsi="宋体" w:cs="宋体"/>
+          <w:rFonts w:ascii="宋体" w:eastAsia="宋体" w:hAnsi="宋体" w:cs="宋体" w:hint="eastAsia"/>
           <w:sz w:val="24"/>
           <w:szCs w:val="24"/>
         </w:rPr>
@@ -6081,7 +5478,7 @@
         <w:ind w:firstLineChars="200" w:firstLine="480"/>
         <w:jc w:val="left"/>
         <w:rPr>
-          <w:rFonts w:ascii="宋体" w:eastAsia="宋体" w:hAnsi="宋体" w:cs="宋体"/>
+          <w:rFonts w:ascii="宋体" w:eastAsia="宋体" w:hAnsi="宋体" w:cs="宋体" w:hint="eastAsia"/>
           <w:sz w:val="24"/>
           <w:szCs w:val="24"/>
         </w:rPr>
@@ -6100,7 +5497,7 @@
         <w:spacing w:line="360" w:lineRule="auto"/>
         <w:jc w:val="left"/>
         <w:rPr>
-          <w:rFonts w:ascii="宋体" w:eastAsia="宋体" w:hAnsi="宋体" w:cs="宋体"/>
+          <w:rFonts w:ascii="宋体" w:eastAsia="宋体" w:hAnsi="宋体" w:cs="宋体" w:hint="eastAsia"/>
           <w:b/>
           <w:bCs/>
           <w:sz w:val="24"/>
@@ -6123,7 +5520,7 @@
         <w:spacing w:line="360" w:lineRule="auto"/>
         <w:jc w:val="left"/>
         <w:rPr>
-          <w:rFonts w:ascii="宋体" w:eastAsia="宋体" w:hAnsi="宋体" w:cs="宋体"/>
+          <w:rFonts w:ascii="宋体" w:eastAsia="宋体" w:hAnsi="宋体" w:cs="宋体" w:hint="eastAsia"/>
           <w:b/>
           <w:bCs/>
           <w:sz w:val="24"/>
@@ -6147,7 +5544,7 @@
         <w:ind w:firstLineChars="200" w:firstLine="480"/>
         <w:jc w:val="left"/>
         <w:rPr>
-          <w:rFonts w:ascii="宋体" w:eastAsia="宋体" w:hAnsi="宋体" w:cs="宋体"/>
+          <w:rFonts w:ascii="宋体" w:eastAsia="宋体" w:hAnsi="宋体" w:cs="宋体" w:hint="eastAsia"/>
           <w:sz w:val="24"/>
           <w:szCs w:val="24"/>
         </w:rPr>
@@ -6167,7 +5564,7 @@
         <w:ind w:firstLineChars="200" w:firstLine="480"/>
         <w:jc w:val="left"/>
         <w:rPr>
-          <w:rFonts w:ascii="宋体" w:eastAsia="宋体" w:hAnsi="宋体" w:cs="宋体"/>
+          <w:rFonts w:ascii="宋体" w:eastAsia="宋体" w:hAnsi="宋体" w:cs="宋体" w:hint="eastAsia"/>
           <w:sz w:val="24"/>
           <w:szCs w:val="24"/>
         </w:rPr>
@@ -6186,7 +5583,7 @@
         <w:spacing w:line="360" w:lineRule="auto"/>
         <w:jc w:val="left"/>
         <w:rPr>
-          <w:rFonts w:ascii="宋体" w:eastAsia="宋体" w:hAnsi="宋体" w:cs="宋体"/>
+          <w:rFonts w:ascii="宋体" w:eastAsia="宋体" w:hAnsi="宋体" w:cs="宋体" w:hint="eastAsia"/>
           <w:b/>
           <w:bCs/>
           <w:sz w:val="24"/>
@@ -6210,7 +5607,7 @@
         <w:ind w:firstLineChars="200" w:firstLine="480"/>
         <w:jc w:val="left"/>
         <w:rPr>
-          <w:rFonts w:ascii="宋体" w:eastAsia="宋体" w:hAnsi="宋体" w:cs="宋体"/>
+          <w:rFonts w:ascii="宋体" w:eastAsia="宋体" w:hAnsi="宋体" w:cs="宋体" w:hint="eastAsia"/>
           <w:sz w:val="24"/>
           <w:szCs w:val="24"/>
         </w:rPr>
@@ -6230,7 +5627,7 @@
         <w:ind w:firstLineChars="200" w:firstLine="480"/>
         <w:jc w:val="left"/>
         <w:rPr>
-          <w:rFonts w:ascii="宋体" w:eastAsia="宋体" w:hAnsi="宋体" w:cs="宋体"/>
+          <w:rFonts w:ascii="宋体" w:eastAsia="宋体" w:hAnsi="宋体" w:cs="宋体" w:hint="eastAsia"/>
           <w:sz w:val="24"/>
           <w:szCs w:val="24"/>
         </w:rPr>
@@ -6250,7 +5647,7 @@
         <w:ind w:firstLineChars="200" w:firstLine="480"/>
         <w:jc w:val="left"/>
         <w:rPr>
-          <w:rFonts w:ascii="宋体" w:eastAsia="宋体" w:hAnsi="宋体" w:cs="宋体"/>
+          <w:rFonts w:ascii="宋体" w:eastAsia="宋体" w:hAnsi="宋体" w:cs="宋体" w:hint="eastAsia"/>
           <w:sz w:val="24"/>
           <w:szCs w:val="24"/>
         </w:rPr>
@@ -6270,7 +5667,7 @@
         <w:ind w:firstLineChars="200" w:firstLine="480"/>
         <w:jc w:val="left"/>
         <w:rPr>
-          <w:rFonts w:ascii="宋体" w:eastAsia="宋体" w:hAnsi="宋体" w:cs="宋体"/>
+          <w:rFonts w:ascii="宋体" w:eastAsia="宋体" w:hAnsi="宋体" w:cs="宋体" w:hint="eastAsia"/>
           <w:sz w:val="24"/>
           <w:szCs w:val="24"/>
         </w:rPr>
@@ -6329,7 +5726,7 @@
         <w:spacing w:line="360" w:lineRule="auto"/>
         <w:jc w:val="left"/>
         <w:rPr>
-          <w:rFonts w:ascii="宋体" w:eastAsia="宋体" w:hAnsi="宋体" w:cs="宋体"/>
+          <w:rFonts w:ascii="宋体" w:eastAsia="宋体" w:hAnsi="宋体" w:cs="宋体" w:hint="eastAsia"/>
           <w:b/>
           <w:bCs/>
           <w:sz w:val="24"/>
@@ -6353,7 +5750,7 @@
         <w:ind w:firstLineChars="200" w:firstLine="480"/>
         <w:jc w:val="left"/>
         <w:rPr>
-          <w:rFonts w:ascii="宋体" w:eastAsia="宋体" w:hAnsi="宋体" w:cs="宋体"/>
+          <w:rFonts w:ascii="宋体" w:eastAsia="宋体" w:hAnsi="宋体" w:cs="宋体" w:hint="eastAsia"/>
           <w:sz w:val="24"/>
           <w:szCs w:val="24"/>
         </w:rPr>
@@ -6373,7 +5770,7 @@
         <w:ind w:firstLineChars="200" w:firstLine="480"/>
         <w:jc w:val="left"/>
         <w:rPr>
-          <w:rFonts w:ascii="宋体" w:eastAsia="宋体" w:hAnsi="宋体" w:cs="宋体"/>
+          <w:rFonts w:ascii="宋体" w:eastAsia="宋体" w:hAnsi="宋体" w:cs="宋体" w:hint="eastAsia"/>
           <w:sz w:val="24"/>
           <w:szCs w:val="24"/>
         </w:rPr>
@@ -6393,7 +5790,7 @@
         <w:ind w:firstLineChars="200" w:firstLine="480"/>
         <w:jc w:val="left"/>
         <w:rPr>
-          <w:rFonts w:ascii="宋体" w:eastAsia="宋体" w:hAnsi="宋体" w:cs="宋体"/>
+          <w:rFonts w:ascii="宋体" w:eastAsia="宋体" w:hAnsi="宋体" w:cs="宋体" w:hint="eastAsia"/>
           <w:sz w:val="24"/>
           <w:szCs w:val="24"/>
         </w:rPr>
@@ -6410,7 +5807,7 @@
     <w:p>
       <w:pPr>
         <w:rPr>
-          <w:rFonts w:ascii="宋体" w:eastAsia="宋体" w:hAnsi="宋体" w:cs="宋体"/>
+          <w:rFonts w:ascii="宋体" w:eastAsia="宋体" w:hAnsi="宋体" w:cs="宋体" w:hint="eastAsia"/>
           <w:b/>
           <w:bCs/>
           <w:sz w:val="24"/>
@@ -6431,7 +5828,7 @@
     <w:p>
       <w:pPr>
         <w:rPr>
-          <w:rFonts w:ascii="宋体" w:eastAsia="宋体" w:hAnsi="宋体" w:cs="宋体"/>
+          <w:rFonts w:ascii="宋体" w:eastAsia="宋体" w:hAnsi="宋体" w:cs="宋体" w:hint="eastAsia"/>
           <w:b/>
           <w:bCs/>
           <w:sz w:val="24"/>
@@ -6453,7 +5850,7 @@
       <w:pPr>
         <w:ind w:firstLineChars="200" w:firstLine="480"/>
         <w:rPr>
-          <w:rFonts w:ascii="宋体" w:eastAsia="宋体" w:hAnsi="宋体" w:cs="宋体"/>
+          <w:rFonts w:ascii="宋体" w:eastAsia="宋体" w:hAnsi="宋体" w:cs="宋体" w:hint="eastAsia"/>
           <w:sz w:val="24"/>
           <w:szCs w:val="24"/>
         </w:rPr>
@@ -6471,7 +5868,7 @@
     <w:p>
       <w:pPr>
         <w:rPr>
-          <w:rFonts w:ascii="宋体" w:eastAsia="宋体" w:hAnsi="宋体" w:cs="宋体"/>
+          <w:rFonts w:ascii="宋体" w:eastAsia="宋体" w:hAnsi="宋体" w:cs="宋体" w:hint="eastAsia"/>
           <w:b/>
           <w:bCs/>
           <w:sz w:val="24"/>
@@ -6493,7 +5890,7 @@
       <w:pPr>
         <w:ind w:firstLineChars="200" w:firstLine="480"/>
         <w:rPr>
-          <w:rFonts w:ascii="宋体" w:eastAsia="宋体" w:hAnsi="宋体" w:cs="宋体"/>
+          <w:rFonts w:ascii="宋体" w:eastAsia="宋体" w:hAnsi="宋体" w:cs="宋体" w:hint="eastAsia"/>
           <w:sz w:val="24"/>
           <w:szCs w:val="24"/>
         </w:rPr>
@@ -6511,7 +5908,7 @@
       <w:pPr>
         <w:ind w:firstLineChars="200" w:firstLine="480"/>
         <w:rPr>
-          <w:rFonts w:ascii="宋体" w:eastAsia="宋体" w:hAnsi="宋体" w:cs="宋体"/>
+          <w:rFonts w:ascii="宋体" w:eastAsia="宋体" w:hAnsi="宋体" w:cs="宋体" w:hint="eastAsia"/>
           <w:sz w:val="24"/>
           <w:szCs w:val="24"/>
         </w:rPr>
@@ -6529,7 +5926,7 @@
       <w:pPr>
         <w:ind w:firstLineChars="200" w:firstLine="480"/>
         <w:rPr>
-          <w:rFonts w:ascii="宋体" w:eastAsia="宋体" w:hAnsi="宋体" w:cs="宋体"/>
+          <w:rFonts w:ascii="宋体" w:eastAsia="宋体" w:hAnsi="宋体" w:cs="宋体" w:hint="eastAsia"/>
           <w:sz w:val="24"/>
           <w:szCs w:val="24"/>
         </w:rPr>
@@ -6562,7 +5959,7 @@
           <w:p>
             <w:pPr>
               <w:rPr>
-                <w:rFonts w:ascii="宋体" w:eastAsia="宋体" w:hAnsi="宋体" w:cs="宋体"/>
+                <w:rFonts w:ascii="宋体" w:eastAsia="宋体" w:hAnsi="宋体" w:cs="宋体" w:hint="eastAsia"/>
                 <w:sz w:val="24"/>
                 <w:szCs w:val="24"/>
               </w:rPr>
@@ -6586,7 +5983,7 @@
           <w:p>
             <w:pPr>
               <w:rPr>
-                <w:rFonts w:ascii="宋体" w:eastAsia="宋体" w:hAnsi="宋体" w:cs="宋体"/>
+                <w:rFonts w:ascii="宋体" w:eastAsia="宋体" w:hAnsi="宋体" w:cs="宋体" w:hint="eastAsia"/>
                 <w:sz w:val="24"/>
                 <w:szCs w:val="24"/>
               </w:rPr>
@@ -6608,7 +6005,7 @@
           <w:p>
             <w:pPr>
               <w:rPr>
-                <w:rFonts w:ascii="宋体" w:eastAsia="宋体" w:hAnsi="宋体" w:cs="宋体"/>
+                <w:rFonts w:ascii="宋体" w:eastAsia="宋体" w:hAnsi="宋体" w:cs="宋体" w:hint="eastAsia"/>
                 <w:sz w:val="24"/>
                 <w:szCs w:val="24"/>
               </w:rPr>
@@ -6632,7 +6029,7 @@
           <w:p>
             <w:pPr>
               <w:rPr>
-                <w:rFonts w:ascii="宋体" w:eastAsia="宋体" w:hAnsi="宋体" w:cs="宋体"/>
+                <w:rFonts w:ascii="宋体" w:eastAsia="宋体" w:hAnsi="宋体" w:cs="宋体" w:hint="eastAsia"/>
                 <w:sz w:val="24"/>
                 <w:szCs w:val="24"/>
               </w:rPr>
@@ -6654,7 +6051,7 @@
           <w:p>
             <w:pPr>
               <w:rPr>
-                <w:rFonts w:ascii="宋体" w:eastAsia="宋体" w:hAnsi="宋体" w:cs="宋体"/>
+                <w:rFonts w:ascii="宋体" w:eastAsia="宋体" w:hAnsi="宋体" w:cs="宋体" w:hint="eastAsia"/>
                 <w:sz w:val="24"/>
                 <w:szCs w:val="24"/>
               </w:rPr>
@@ -6679,7 +6076,7 @@
           <w:p>
             <w:pPr>
               <w:rPr>
-                <w:rFonts w:ascii="宋体" w:eastAsia="宋体" w:hAnsi="宋体" w:cs="宋体"/>
+                <w:rFonts w:ascii="宋体" w:eastAsia="宋体" w:hAnsi="宋体" w:cs="宋体" w:hint="eastAsia"/>
                 <w:sz w:val="24"/>
                 <w:szCs w:val="24"/>
               </w:rPr>
@@ -6703,7 +6100,7 @@
           <w:p>
             <w:pPr>
               <w:rPr>
-                <w:rFonts w:ascii="宋体" w:eastAsia="宋体" w:hAnsi="宋体" w:cs="宋体"/>
+                <w:rFonts w:ascii="宋体" w:eastAsia="宋体" w:hAnsi="宋体" w:cs="宋体" w:hint="eastAsia"/>
                 <w:sz w:val="24"/>
                 <w:szCs w:val="24"/>
               </w:rPr>
@@ -6725,7 +6122,7 @@
           <w:p>
             <w:pPr>
               <w:rPr>
-                <w:rFonts w:ascii="宋体" w:eastAsia="宋体" w:hAnsi="宋体" w:cs="宋体"/>
+                <w:rFonts w:ascii="宋体" w:eastAsia="宋体" w:hAnsi="宋体" w:cs="宋体" w:hint="eastAsia"/>
                 <w:sz w:val="24"/>
                 <w:szCs w:val="24"/>
               </w:rPr>
@@ -6749,7 +6146,7 @@
           <w:p>
             <w:pPr>
               <w:rPr>
-                <w:rFonts w:ascii="宋体" w:eastAsia="宋体" w:hAnsi="宋体" w:cs="宋体"/>
+                <w:rFonts w:ascii="宋体" w:eastAsia="宋体" w:hAnsi="宋体" w:cs="宋体" w:hint="eastAsia"/>
                 <w:sz w:val="24"/>
                 <w:szCs w:val="24"/>
               </w:rPr>
@@ -6771,7 +6168,7 @@
           <w:p>
             <w:pPr>
               <w:rPr>
-                <w:rFonts w:ascii="宋体" w:eastAsia="宋体" w:hAnsi="宋体" w:cs="宋体"/>
+                <w:rFonts w:ascii="宋体" w:eastAsia="宋体" w:hAnsi="宋体" w:cs="宋体" w:hint="eastAsia"/>
                 <w:sz w:val="24"/>
                 <w:szCs w:val="24"/>
               </w:rPr>
@@ -6795,7 +6192,7 @@
           <w:p>
             <w:pPr>
               <w:rPr>
-                <w:rFonts w:ascii="宋体" w:eastAsia="宋体" w:hAnsi="宋体" w:cs="宋体"/>
+                <w:rFonts w:ascii="宋体" w:eastAsia="宋体" w:hAnsi="宋体" w:cs="宋体" w:hint="eastAsia"/>
                 <w:sz w:val="24"/>
                 <w:szCs w:val="24"/>
               </w:rPr>
@@ -6817,7 +6214,7 @@
           <w:p>
             <w:pPr>
               <w:rPr>
-                <w:rFonts w:ascii="宋体" w:eastAsia="宋体" w:hAnsi="宋体" w:cs="宋体"/>
+                <w:rFonts w:ascii="宋体" w:eastAsia="宋体" w:hAnsi="宋体" w:cs="宋体" w:hint="eastAsia"/>
                 <w:sz w:val="24"/>
                 <w:szCs w:val="24"/>
               </w:rPr>
@@ -6841,7 +6238,7 @@
           <w:p>
             <w:pPr>
               <w:rPr>
-                <w:rFonts w:ascii="宋体" w:eastAsia="宋体" w:hAnsi="宋体" w:cs="宋体"/>
+                <w:rFonts w:ascii="宋体" w:eastAsia="宋体" w:hAnsi="宋体" w:cs="宋体" w:hint="eastAsia"/>
                 <w:sz w:val="24"/>
                 <w:szCs w:val="24"/>
               </w:rPr>
@@ -6863,7 +6260,7 @@
           <w:p>
             <w:pPr>
               <w:rPr>
-                <w:rFonts w:ascii="宋体" w:eastAsia="宋体" w:hAnsi="宋体" w:cs="宋体"/>
+                <w:rFonts w:ascii="宋体" w:eastAsia="宋体" w:hAnsi="宋体" w:cs="宋体" w:hint="eastAsia"/>
                 <w:sz w:val="24"/>
                 <w:szCs w:val="24"/>
               </w:rPr>
@@ -6887,7 +6284,7 @@
           <w:p>
             <w:pPr>
               <w:rPr>
-                <w:rFonts w:ascii="宋体" w:eastAsia="宋体" w:hAnsi="宋体" w:cs="宋体"/>
+                <w:rFonts w:ascii="宋体" w:eastAsia="宋体" w:hAnsi="宋体" w:cs="宋体" w:hint="eastAsia"/>
                 <w:sz w:val="24"/>
                 <w:szCs w:val="24"/>
               </w:rPr>
@@ -6909,7 +6306,7 @@
           <w:p>
             <w:pPr>
               <w:rPr>
-                <w:rFonts w:ascii="宋体" w:eastAsia="宋体" w:hAnsi="宋体" w:cs="宋体"/>
+                <w:rFonts w:ascii="宋体" w:eastAsia="宋体" w:hAnsi="宋体" w:cs="宋体" w:hint="eastAsia"/>
                 <w:sz w:val="24"/>
                 <w:szCs w:val="24"/>
               </w:rPr>
@@ -6933,7 +6330,7 @@
           <w:p>
             <w:pPr>
               <w:rPr>
-                <w:rFonts w:ascii="宋体" w:eastAsia="宋体" w:hAnsi="宋体" w:cs="宋体"/>
+                <w:rFonts w:ascii="宋体" w:eastAsia="宋体" w:hAnsi="宋体" w:cs="宋体" w:hint="eastAsia"/>
                 <w:sz w:val="24"/>
                 <w:szCs w:val="24"/>
               </w:rPr>
@@ -6955,7 +6352,7 @@
           <w:p>
             <w:pPr>
               <w:rPr>
-                <w:rFonts w:ascii="宋体" w:eastAsia="宋体" w:hAnsi="宋体" w:cs="宋体"/>
+                <w:rFonts w:ascii="宋体" w:eastAsia="宋体" w:hAnsi="宋体" w:cs="宋体" w:hint="eastAsia"/>
                 <w:sz w:val="24"/>
                 <w:szCs w:val="24"/>
               </w:rPr>
@@ -6979,7 +6376,7 @@
           <w:p>
             <w:pPr>
               <w:rPr>
-                <w:rFonts w:ascii="宋体" w:eastAsia="宋体" w:hAnsi="宋体" w:cs="宋体"/>
+                <w:rFonts w:ascii="宋体" w:eastAsia="宋体" w:hAnsi="宋体" w:cs="宋体" w:hint="eastAsia"/>
                 <w:sz w:val="24"/>
                 <w:szCs w:val="24"/>
               </w:rPr>
@@ -7001,7 +6398,7 @@
           <w:p>
             <w:pPr>
               <w:rPr>
-                <w:rFonts w:ascii="宋体" w:eastAsia="宋体" w:hAnsi="宋体" w:cs="宋体"/>
+                <w:rFonts w:ascii="宋体" w:eastAsia="宋体" w:hAnsi="宋体" w:cs="宋体" w:hint="eastAsia"/>
                 <w:sz w:val="24"/>
                 <w:szCs w:val="24"/>
               </w:rPr>
@@ -7026,7 +6423,7 @@
           <w:p>
             <w:pPr>
               <w:rPr>
-                <w:rFonts w:ascii="宋体" w:eastAsia="宋体" w:hAnsi="宋体" w:cs="宋体"/>
+                <w:rFonts w:ascii="宋体" w:eastAsia="宋体" w:hAnsi="宋体" w:cs="宋体" w:hint="eastAsia"/>
                 <w:sz w:val="24"/>
                 <w:szCs w:val="24"/>
               </w:rPr>
@@ -7050,7 +6447,7 @@
           <w:p>
             <w:pPr>
               <w:rPr>
-                <w:rFonts w:ascii="宋体" w:eastAsia="宋体" w:hAnsi="宋体" w:cs="宋体"/>
+                <w:rFonts w:ascii="宋体" w:eastAsia="宋体" w:hAnsi="宋体" w:cs="宋体" w:hint="eastAsia"/>
                 <w:sz w:val="24"/>
                 <w:szCs w:val="24"/>
               </w:rPr>
@@ -7072,7 +6469,7 @@
           <w:p>
             <w:pPr>
               <w:rPr>
-                <w:rFonts w:ascii="宋体" w:eastAsia="宋体" w:hAnsi="宋体" w:cs="宋体"/>
+                <w:rFonts w:ascii="宋体" w:eastAsia="宋体" w:hAnsi="宋体" w:cs="宋体" w:hint="eastAsia"/>
                 <w:sz w:val="24"/>
                 <w:szCs w:val="24"/>
               </w:rPr>
@@ -7093,7 +6490,7 @@
       <w:pPr>
         <w:ind w:firstLineChars="200" w:firstLine="480"/>
         <w:rPr>
-          <w:rFonts w:ascii="宋体" w:eastAsia="宋体" w:hAnsi="宋体" w:cs="宋体"/>
+          <w:rFonts w:ascii="宋体" w:eastAsia="宋体" w:hAnsi="宋体" w:cs="宋体" w:hint="eastAsia"/>
           <w:sz w:val="24"/>
           <w:szCs w:val="24"/>
         </w:rPr>
@@ -7151,7 +6548,7 @@
       <w:pPr>
         <w:ind w:firstLineChars="200" w:firstLine="480"/>
         <w:rPr>
-          <w:rFonts w:ascii="宋体" w:eastAsia="宋体" w:hAnsi="宋体" w:cs="宋体"/>
+          <w:rFonts w:ascii="宋体" w:eastAsia="宋体" w:hAnsi="宋体" w:cs="宋体" w:hint="eastAsia"/>
           <w:sz w:val="24"/>
           <w:szCs w:val="24"/>
         </w:rPr>
@@ -7208,7 +6605,7 @@
     <w:p>
       <w:pPr>
         <w:rPr>
-          <w:rFonts w:ascii="宋体" w:eastAsia="宋体" w:hAnsi="宋体" w:cs="宋体"/>
+          <w:rFonts w:ascii="宋体" w:eastAsia="宋体" w:hAnsi="宋体" w:cs="宋体" w:hint="eastAsia"/>
           <w:sz w:val="24"/>
           <w:szCs w:val="24"/>
         </w:rPr>
@@ -7219,7 +6616,7 @@
         <w:spacing w:line="360" w:lineRule="auto"/>
         <w:jc w:val="left"/>
         <w:rPr>
-          <w:rFonts w:ascii="宋体" w:eastAsia="宋体" w:hAnsi="宋体" w:cs="宋体"/>
+          <w:rFonts w:ascii="宋体" w:eastAsia="宋体" w:hAnsi="宋体" w:cs="宋体" w:hint="eastAsia"/>
           <w:b/>
           <w:bCs/>
           <w:sz w:val="24"/>
@@ -7246,7 +6643,7 @@
         <w:spacing w:line="360" w:lineRule="auto"/>
         <w:jc w:val="left"/>
         <w:rPr>
-          <w:rFonts w:ascii="宋体" w:eastAsia="宋体" w:hAnsi="宋体" w:cs="宋体"/>
+          <w:rFonts w:ascii="宋体" w:eastAsia="宋体" w:hAnsi="宋体" w:cs="宋体" w:hint="eastAsia"/>
           <w:b/>
           <w:bCs/>
           <w:sz w:val="24"/>
@@ -7270,7 +6667,7 @@
         <w:ind w:firstLineChars="200" w:firstLine="480"/>
         <w:jc w:val="left"/>
         <w:rPr>
-          <w:rFonts w:ascii="宋体" w:eastAsia="宋体" w:hAnsi="宋体" w:cs="宋体"/>
+          <w:rFonts w:ascii="宋体" w:eastAsia="宋体" w:hAnsi="宋体" w:cs="宋体" w:hint="eastAsia"/>
           <w:sz w:val="24"/>
           <w:szCs w:val="24"/>
         </w:rPr>
@@ -7308,7 +6705,7 @@
         <w:ind w:firstLineChars="200" w:firstLine="480"/>
         <w:jc w:val="left"/>
         <w:rPr>
-          <w:rFonts w:ascii="宋体" w:eastAsia="宋体" w:hAnsi="宋体" w:cs="宋体"/>
+          <w:rFonts w:ascii="宋体" w:eastAsia="宋体" w:hAnsi="宋体" w:cs="宋体" w:hint="eastAsia"/>
           <w:sz w:val="24"/>
           <w:szCs w:val="24"/>
         </w:rPr>
@@ -7328,7 +6725,7 @@
         <w:ind w:firstLineChars="200" w:firstLine="480"/>
         <w:jc w:val="left"/>
         <w:rPr>
-          <w:rFonts w:ascii="宋体" w:eastAsia="宋体" w:hAnsi="宋体" w:cs="宋体"/>
+          <w:rFonts w:ascii="宋体" w:eastAsia="宋体" w:hAnsi="宋体" w:cs="宋体" w:hint="eastAsia"/>
           <w:sz w:val="24"/>
           <w:szCs w:val="24"/>
         </w:rPr>
@@ -7348,7 +6745,7 @@
         <w:ind w:firstLineChars="200" w:firstLine="480"/>
         <w:jc w:val="left"/>
         <w:rPr>
-          <w:rFonts w:ascii="宋体" w:eastAsia="宋体" w:hAnsi="宋体" w:cs="宋体"/>
+          <w:rFonts w:ascii="宋体" w:eastAsia="宋体" w:hAnsi="宋体" w:cs="宋体" w:hint="eastAsia"/>
           <w:sz w:val="24"/>
           <w:szCs w:val="24"/>
         </w:rPr>
@@ -7372,7 +6769,7 @@
         <w:spacing w:line="360" w:lineRule="auto"/>
         <w:jc w:val="left"/>
         <w:rPr>
-          <w:rFonts w:ascii="宋体" w:eastAsia="宋体" w:hAnsi="宋体" w:cs="宋体"/>
+          <w:rFonts w:ascii="宋体" w:eastAsia="宋体" w:hAnsi="宋体" w:cs="宋体" w:hint="eastAsia"/>
           <w:b/>
           <w:bCs/>
           <w:sz w:val="24"/>
@@ -7396,7 +6793,7 @@
         <w:ind w:firstLineChars="200" w:firstLine="480"/>
         <w:jc w:val="left"/>
         <w:rPr>
-          <w:rFonts w:ascii="宋体" w:eastAsia="宋体" w:hAnsi="宋体" w:cs="宋体"/>
+          <w:rFonts w:ascii="宋体" w:eastAsia="宋体" w:hAnsi="宋体" w:cs="宋体" w:hint="eastAsia"/>
           <w:sz w:val="24"/>
           <w:szCs w:val="24"/>
         </w:rPr>
@@ -7416,7 +6813,7 @@
         <w:ind w:firstLineChars="200" w:firstLine="480"/>
         <w:jc w:val="left"/>
         <w:rPr>
-          <w:rFonts w:ascii="宋体" w:eastAsia="宋体" w:hAnsi="宋体" w:cs="宋体"/>
+          <w:rFonts w:ascii="宋体" w:eastAsia="宋体" w:hAnsi="宋体" w:cs="宋体" w:hint="eastAsia"/>
           <w:sz w:val="24"/>
           <w:szCs w:val="24"/>
         </w:rPr>
@@ -7436,7 +6833,7 @@
         <w:ind w:firstLineChars="200" w:firstLine="480"/>
         <w:jc w:val="left"/>
         <w:rPr>
-          <w:rFonts w:ascii="宋体" w:eastAsia="宋体" w:hAnsi="宋体" w:cs="宋体"/>
+          <w:rFonts w:ascii="宋体" w:eastAsia="宋体" w:hAnsi="宋体" w:cs="宋体" w:hint="eastAsia"/>
           <w:sz w:val="24"/>
           <w:szCs w:val="24"/>
         </w:rPr>
@@ -7456,7 +6853,7 @@
         <w:ind w:firstLineChars="200" w:firstLine="480"/>
         <w:jc w:val="left"/>
         <w:rPr>
-          <w:rFonts w:ascii="宋体" w:eastAsia="宋体" w:hAnsi="宋体" w:cs="宋体"/>
+          <w:rFonts w:ascii="宋体" w:eastAsia="宋体" w:hAnsi="宋体" w:cs="宋体" w:hint="eastAsia"/>
           <w:sz w:val="24"/>
           <w:szCs w:val="24"/>
         </w:rPr>
@@ -7475,40 +6872,40 @@
         <w:spacing w:line="360" w:lineRule="auto"/>
         <w:jc w:val="left"/>
         <w:rPr>
-          <w:rFonts w:ascii="宋体" w:eastAsia="宋体" w:hAnsi="宋体" w:cs="宋体"/>
-          <w:sz w:val="24"/>
-          <w:szCs w:val="24"/>
-        </w:rPr>
-      </w:pPr>
-    </w:p>
-    <w:p>
-      <w:pPr>
-        <w:spacing w:line="360" w:lineRule="auto"/>
-        <w:rPr>
-          <w:rFonts w:ascii="宋体" w:eastAsia="宋体" w:hAnsi="宋体" w:cs="宋体"/>
-          <w:sz w:val="24"/>
-          <w:szCs w:val="24"/>
-        </w:rPr>
-      </w:pPr>
-    </w:p>
-    <w:p>
-      <w:pPr>
-        <w:spacing w:line="360" w:lineRule="auto"/>
-        <w:rPr>
-          <w:rFonts w:ascii="宋体" w:eastAsia="宋体" w:hAnsi="宋体" w:cs="宋体"/>
-        </w:rPr>
-      </w:pPr>
-    </w:p>
-    <w:p>
-      <w:pPr>
-        <w:spacing w:line="360" w:lineRule="auto"/>
-        <w:rPr>
-          <w:rFonts w:ascii="宋体" w:eastAsia="宋体" w:hAnsi="宋体" w:cs="宋体"/>
+          <w:rFonts w:ascii="宋体" w:eastAsia="宋体" w:hAnsi="宋体" w:cs="宋体" w:hint="eastAsia"/>
+          <w:sz w:val="24"/>
+          <w:szCs w:val="24"/>
+        </w:rPr>
+      </w:pPr>
+    </w:p>
+    <w:p>
+      <w:pPr>
+        <w:spacing w:line="360" w:lineRule="auto"/>
+        <w:rPr>
+          <w:rFonts w:ascii="宋体" w:eastAsia="宋体" w:hAnsi="宋体" w:cs="宋体" w:hint="eastAsia"/>
+          <w:sz w:val="24"/>
+          <w:szCs w:val="24"/>
+        </w:rPr>
+      </w:pPr>
+    </w:p>
+    <w:p>
+      <w:pPr>
+        <w:spacing w:line="360" w:lineRule="auto"/>
+        <w:rPr>
+          <w:rFonts w:ascii="宋体" w:eastAsia="宋体" w:hAnsi="宋体" w:cs="宋体" w:hint="eastAsia"/>
+        </w:rPr>
+      </w:pPr>
+    </w:p>
+    <w:p>
+      <w:pPr>
+        <w:spacing w:line="360" w:lineRule="auto"/>
+        <w:rPr>
+          <w:rFonts w:ascii="宋体" w:eastAsia="宋体" w:hAnsi="宋体" w:cs="宋体" w:hint="eastAsia"/>
         </w:rPr>
       </w:pPr>
     </w:p>
     <w:sectPr>
-      <w:headerReference w:type="default" r:id="rId18"/>
+      <w:headerReference w:type="default" r:id="rId17"/>
       <w:pgSz w:w="11906" w:h="16838"/>
       <w:pgMar w:top="1440" w:right="1800" w:bottom="1440" w:left="1800" w:header="851" w:footer="992" w:gutter="0"/>
       <w:cols w:space="425"/>
@@ -7519,9 +6916,14 @@
 </file>
 
 <file path=word/endnotes.xml><?xml version="1.0" encoding="utf-8"?>
-<w:endnotes xmlns:wpc="http://schemas.microsoft.com/office/word/2010/wordprocessingCanvas" xmlns:cx="http://schemas.microsoft.com/office/drawing/2014/chartex" xmlns:cx1="http://schemas.microsoft.com/office/drawing/2015/9/8/chartex" xmlns:cx2="http://schemas.microsoft.com/office/drawing/2015/10/21/chartex" xmlns:cx3="http://schemas.microsoft.com/office/drawing/2016/5/9/chartex" xmlns:cx4="http://schemas.microsoft.com/office/drawing/2016/5/10/chartex" xmlns:cx5="http://schemas.microsoft.com/office/drawing/2016/5/11/chartex" xmlns:cx6="http://schemas.microsoft.com/office/drawing/2016/5/12/chartex" xmlns:cx7="http://schemas.microsoft.com/office/drawing/2016/5/13/chartex" xmlns:cx8="http://schemas.microsoft.com/office/drawing/2016/5/14/chartex" xmlns:mc="http://schemas.openxmlformats.org/markup-compatibility/2006" xmlns:aink="http://schemas.microsoft.com/office/drawing/2016/ink" xmlns:am3d="http://schemas.microsoft.com/office/drawing/2017/model3d" xmlns:o="urn:schemas-microsoft-com:office:office" xmlns:oel="http://schemas.microsoft.com/office/2019/extlst" xmlns:r="http://schemas.openxmlformats.org/officeDocument/2006/relationships" xmlns:m="http://schemas.openxmlformats.org/officeDocument/2006/math" xmlns:v="urn:schemas-microsoft-com:vml" xmlns:wp14="http://schemas.microsoft.com/office/word/2010/wordprocessingDrawing" xmlns:wp="http://schemas.openxmlformats.org/drawingml/2006/wordprocessingDrawing" xmlns:w10="urn:schemas-microsoft-com:office:word" xmlns:w="http://schemas.openxmlformats.org/wordprocessingml/2006/main" xmlns:w14="http://schemas.microsoft.com/office/word/2010/wordml" xmlns:w15="http://schemas.microsoft.com/office/word/2012/wordml" xmlns:w16cex="http://schemas.microsoft.com/office/word/2018/wordml/cex" xmlns:w16cid="http://schemas.microsoft.com/office/word/2016/wordml/cid" xmlns:w16="http://schemas.microsoft.com/office/word/2018/wordml" xmlns:w16du="http://schemas.microsoft.com/office/word/2023/wordml/word16du" xmlns:w16sdtdh="http://schemas.microsoft.com/office/word/2020/wordml/sdtdatahash" xmlns:w16se="http://schemas.microsoft.com/office/word/2015/wordml/symex" xmlns:wpg="http://schemas.microsoft.com/office/word/2010/wordprocessingGroup" xmlns:wpi="http://schemas.microsoft.com/office/word/2010/wordprocessingInk" xmlns:wne="http://schemas.microsoft.com/office/word/2006/wordml" xmlns:wps="http://schemas.microsoft.com/office/word/2010/wordprocessingShape" mc:Ignorable="w14 w15 w16se w16cid w16 w16cex w16sdtdh w16du wp14">
+<w:endnotes xmlns:wpc="http://schemas.microsoft.com/office/word/2010/wordprocessingCanvas" xmlns:cx="http://schemas.microsoft.com/office/drawing/2014/chartex" xmlns:cx1="http://schemas.microsoft.com/office/drawing/2015/9/8/chartex" xmlns:cx2="http://schemas.microsoft.com/office/drawing/2015/10/21/chartex" xmlns:cx3="http://schemas.microsoft.com/office/drawing/2016/5/9/chartex" xmlns:cx4="http://schemas.microsoft.com/office/drawing/2016/5/10/chartex" xmlns:cx5="http://schemas.microsoft.com/office/drawing/2016/5/11/chartex" xmlns:cx6="http://schemas.microsoft.com/office/drawing/2016/5/12/chartex" xmlns:cx7="http://schemas.microsoft.com/office/drawing/2016/5/13/chartex" xmlns:cx8="http://schemas.microsoft.com/office/drawing/2016/5/14/chartex" xmlns:mc="http://schemas.openxmlformats.org/markup-compatibility/2006" xmlns:aink="http://schemas.microsoft.com/office/drawing/2016/ink" xmlns:am3d="http://schemas.microsoft.com/office/drawing/2017/model3d" xmlns:o="urn:schemas-microsoft-com:office:office" xmlns:oel="http://schemas.microsoft.com/office/2019/extlst" xmlns:r="http://schemas.openxmlformats.org/officeDocument/2006/relationships" xmlns:m="http://schemas.openxmlformats.org/officeDocument/2006/math" xmlns:v="urn:schemas-microsoft-com:vml" xmlns:wp14="http://schemas.microsoft.com/office/word/2010/wordprocessingDrawing" xmlns:wp="http://schemas.openxmlformats.org/drawingml/2006/wordprocessingDrawing" xmlns:w10="urn:schemas-microsoft-com:office:word" xmlns:w="http://schemas.openxmlformats.org/wordprocessingml/2006/main" xmlns:w14="http://schemas.microsoft.com/office/word/2010/wordml" xmlns:w15="http://schemas.microsoft.com/office/word/2012/wordml" xmlns:w16cex="http://schemas.microsoft.com/office/word/2018/wordml/cex" xmlns:w16cid="http://schemas.microsoft.com/office/word/2016/wordml/cid" xmlns:w16="http://schemas.microsoft.com/office/word/2018/wordml" xmlns:w16du="http://schemas.microsoft.com/office/word/2023/wordml/word16du" xmlns:w16sdtdh="http://schemas.microsoft.com/office/word/2020/wordml/sdtdatahash" xmlns:w16sdtfl="http://schemas.microsoft.com/office/word/2024/wordml/sdtformatlock" xmlns:w16se="http://schemas.microsoft.com/office/word/2015/wordml/symex" xmlns:wpg="http://schemas.microsoft.com/office/word/2010/wordprocessingGroup" xmlns:wpi="http://schemas.microsoft.com/office/word/2010/wordprocessingInk" xmlns:wne="http://schemas.microsoft.com/office/word/2006/wordml" xmlns:wps="http://schemas.microsoft.com/office/word/2010/wordprocessingShape" mc:Ignorable="w14 w15 w16se w16cid w16 w16cex w16sdtdh w16sdtfl w16du wp14">
   <w:endnote w:type="separator" w:id="-1">
     <w:p>
+      <w:pPr>
+        <w:rPr>
+          <w:rFonts w:hint="eastAsia"/>
+        </w:rPr>
+      </w:pPr>
       <w:r>
         <w:separator/>
       </w:r>
@@ -7529,6 +6931,11 @@
   </w:endnote>
   <w:endnote w:type="continuationSeparator" w:id="0">
     <w:p>
+      <w:pPr>
+        <w:rPr>
+          <w:rFonts w:hint="eastAsia"/>
+        </w:rPr>
+      </w:pPr>
       <w:r>
         <w:continuationSeparator/>
       </w:r>
@@ -7538,9 +6945,14 @@
 </file>
 
 <file path=word/footnotes.xml><?xml version="1.0" encoding="utf-8"?>
-<w:footnotes xmlns:wpc="http://schemas.microsoft.com/office/word/2010/wordprocessingCanvas" xmlns:cx="http://schemas.microsoft.com/office/drawing/2014/chartex" xmlns:cx1="http://schemas.microsoft.com/office/drawing/2015/9/8/chartex" xmlns:cx2="http://schemas.microsoft.com/office/drawing/2015/10/21/chartex" xmlns:cx3="http://schemas.microsoft.com/office/drawing/2016/5/9/chartex" xmlns:cx4="http://schemas.microsoft.com/office/drawing/2016/5/10/chartex" xmlns:cx5="http://schemas.microsoft.com/office/drawing/2016/5/11/chartex" xmlns:cx6="http://schemas.microsoft.com/office/drawing/2016/5/12/chartex" xmlns:cx7="http://schemas.microsoft.com/office/drawing/2016/5/13/chartex" xmlns:cx8="http://schemas.microsoft.com/office/drawing/2016/5/14/chartex" xmlns:mc="http://schemas.openxmlformats.org/markup-compatibility/2006" xmlns:aink="http://schemas.microsoft.com/office/drawing/2016/ink" xmlns:am3d="http://schemas.microsoft.com/office/drawing/2017/model3d" xmlns:o="urn:schemas-microsoft-com:office:office" xmlns:oel="http://schemas.microsoft.com/office/2019/extlst" xmlns:r="http://schemas.openxmlformats.org/officeDocument/2006/relationships" xmlns:m="http://schemas.openxmlformats.org/officeDocument/2006/math" xmlns:v="urn:schemas-microsoft-com:vml" xmlns:wp14="http://schemas.microsoft.com/office/word/2010/wordprocessingDrawing" xmlns:wp="http://schemas.openxmlformats.org/drawingml/2006/wordprocessingDrawing" xmlns:w10="urn:schemas-microsoft-com:office:word" xmlns:w="http://schemas.openxmlformats.org/wordprocessingml/2006/main" xmlns:w14="http://schemas.microsoft.com/office/word/2010/wordml" xmlns:w15="http://schemas.microsoft.com/office/word/2012/wordml" xmlns:w16cex="http://schemas.microsoft.com/office/word/2018/wordml/cex" xmlns:w16cid="http://schemas.microsoft.com/office/word/2016/wordml/cid" xmlns:w16="http://schemas.microsoft.com/office/word/2018/wordml" xmlns:w16du="http://schemas.microsoft.com/office/word/2023/wordml/word16du" xmlns:w16sdtdh="http://schemas.microsoft.com/office/word/2020/wordml/sdtdatahash" xmlns:w16se="http://schemas.microsoft.com/office/word/2015/wordml/symex" xmlns:wpg="http://schemas.microsoft.com/office/word/2010/wordprocessingGroup" xmlns:wpi="http://schemas.microsoft.com/office/word/2010/wordprocessingInk" xmlns:wne="http://schemas.microsoft.com/office/word/2006/wordml" xmlns:wps="http://schemas.microsoft.com/office/word/2010/wordprocessingShape" mc:Ignorable="w14 w15 w16se w16cid w16 w16cex w16sdtdh w16du wp14">
+<w:footnotes xmlns:wpc="http://schemas.microsoft.com/office/word/2010/wordprocessingCanvas" xmlns:cx="http://schemas.microsoft.com/office/drawing/2014/chartex" xmlns:cx1="http://schemas.microsoft.com/office/drawing/2015/9/8/chartex" xmlns:cx2="http://schemas.microsoft.com/office/drawing/2015/10/21/chartex" xmlns:cx3="http://schemas.microsoft.com/office/drawing/2016/5/9/chartex" xmlns:cx4="http://schemas.microsoft.com/office/drawing/2016/5/10/chartex" xmlns:cx5="http://schemas.microsoft.com/office/drawing/2016/5/11/chartex" xmlns:cx6="http://schemas.microsoft.com/office/drawing/2016/5/12/chartex" xmlns:cx7="http://schemas.microsoft.com/office/drawing/2016/5/13/chartex" xmlns:cx8="http://schemas.microsoft.com/office/drawing/2016/5/14/chartex" xmlns:mc="http://schemas.openxmlformats.org/markup-compatibility/2006" xmlns:aink="http://schemas.microsoft.com/office/drawing/2016/ink" xmlns:am3d="http://schemas.microsoft.com/office/drawing/2017/model3d" xmlns:o="urn:schemas-microsoft-com:office:office" xmlns:oel="http://schemas.microsoft.com/office/2019/extlst" xmlns:r="http://schemas.openxmlformats.org/officeDocument/2006/relationships" xmlns:m="http://schemas.openxmlformats.org/officeDocument/2006/math" xmlns:v="urn:schemas-microsoft-com:vml" xmlns:wp14="http://schemas.microsoft.com/office/word/2010/wordprocessingDrawing" xmlns:wp="http://schemas.openxmlformats.org/drawingml/2006/wordprocessingDrawing" xmlns:w10="urn:schemas-microsoft-com:office:word" xmlns:w="http://schemas.openxmlformats.org/wordprocessingml/2006/main" xmlns:w14="http://schemas.microsoft.com/office/word/2010/wordml" xmlns:w15="http://schemas.microsoft.com/office/word/2012/wordml" xmlns:w16cex="http://schemas.microsoft.com/office/word/2018/wordml/cex" xmlns:w16cid="http://schemas.microsoft.com/office/word/2016/wordml/cid" xmlns:w16="http://schemas.microsoft.com/office/word/2018/wordml" xmlns:w16du="http://schemas.microsoft.com/office/word/2023/wordml/word16du" xmlns:w16sdtdh="http://schemas.microsoft.com/office/word/2020/wordml/sdtdatahash" xmlns:w16sdtfl="http://schemas.microsoft.com/office/word/2024/wordml/sdtformatlock" xmlns:w16se="http://schemas.microsoft.com/office/word/2015/wordml/symex" xmlns:wpg="http://schemas.microsoft.com/office/word/2010/wordprocessingGroup" xmlns:wpi="http://schemas.microsoft.com/office/word/2010/wordprocessingInk" xmlns:wne="http://schemas.microsoft.com/office/word/2006/wordml" xmlns:wps="http://schemas.microsoft.com/office/word/2010/wordprocessingShape" mc:Ignorable="w14 w15 w16se w16cid w16 w16cex w16sdtdh w16sdtfl w16du wp14">
   <w:footnote w:type="separator" w:id="-1">
     <w:p>
+      <w:pPr>
+        <w:rPr>
+          <w:rFonts w:hint="eastAsia"/>
+        </w:rPr>
+      </w:pPr>
       <w:r>
         <w:separator/>
       </w:r>
@@ -7548,6 +6960,11 @@
   </w:footnote>
   <w:footnote w:type="continuationSeparator" w:id="0">
     <w:p>
+      <w:pPr>
+        <w:rPr>
+          <w:rFonts w:hint="eastAsia"/>
+        </w:rPr>
+      </w:pPr>
       <w:r>
         <w:continuationSeparator/>
       </w:r>
@@ -7557,11 +6974,14 @@
 </file>
 
 <file path=word/header1.xml><?xml version="1.0" encoding="utf-8"?>
-<w:hdr xmlns:wpc="http://schemas.microsoft.com/office/word/2010/wordprocessingCanvas" xmlns:cx="http://schemas.microsoft.com/office/drawing/2014/chartex" xmlns:cx1="http://schemas.microsoft.com/office/drawing/2015/9/8/chartex" xmlns:cx2="http://schemas.microsoft.com/office/drawing/2015/10/21/chartex" xmlns:cx3="http://schemas.microsoft.com/office/drawing/2016/5/9/chartex" xmlns:cx4="http://schemas.microsoft.com/office/drawing/2016/5/10/chartex" xmlns:cx5="http://schemas.microsoft.com/office/drawing/2016/5/11/chartex" xmlns:cx6="http://schemas.microsoft.com/office/drawing/2016/5/12/chartex" xmlns:cx7="http://schemas.microsoft.com/office/drawing/2016/5/13/chartex" xmlns:cx8="http://schemas.microsoft.com/office/drawing/2016/5/14/chartex" xmlns:mc="http://schemas.openxmlformats.org/markup-compatibility/2006" xmlns:aink="http://schemas.microsoft.com/office/drawing/2016/ink" xmlns:am3d="http://schemas.microsoft.com/office/drawing/2017/model3d" xmlns:o="urn:schemas-microsoft-com:office:office" xmlns:oel="http://schemas.microsoft.com/office/2019/extlst" xmlns:r="http://schemas.openxmlformats.org/officeDocument/2006/relationships" xmlns:m="http://schemas.openxmlformats.org/officeDocument/2006/math" xmlns:v="urn:schemas-microsoft-com:vml" xmlns:wp14="http://schemas.microsoft.com/office/word/2010/wordprocessingDrawing" xmlns:wp="http://schemas.openxmlformats.org/drawingml/2006/wordprocessingDrawing" xmlns:w10="urn:schemas-microsoft-com:office:word" xmlns:w="http://schemas.openxmlformats.org/wordprocessingml/2006/main" xmlns:w14="http://schemas.microsoft.com/office/word/2010/wordml" xmlns:w15="http://schemas.microsoft.com/office/word/2012/wordml" xmlns:w16cex="http://schemas.microsoft.com/office/word/2018/wordml/cex" xmlns:w16cid="http://schemas.microsoft.com/office/word/2016/wordml/cid" xmlns:w16="http://schemas.microsoft.com/office/word/2018/wordml" xmlns:w16du="http://schemas.microsoft.com/office/word/2023/wordml/word16du" xmlns:w16sdtdh="http://schemas.microsoft.com/office/word/2020/wordml/sdtdatahash" xmlns:w16se="http://schemas.microsoft.com/office/word/2015/wordml/symex" xmlns:wpg="http://schemas.microsoft.com/office/word/2010/wordprocessingGroup" xmlns:wpi="http://schemas.microsoft.com/office/word/2010/wordprocessingInk" xmlns:wne="http://schemas.microsoft.com/office/word/2006/wordml" xmlns:wps="http://schemas.microsoft.com/office/word/2010/wordprocessingShape" mc:Ignorable="w14 w15 w16se w16cid w16 w16cex w16sdtdh w16du wp14">
+<w:hdr xmlns:wpc="http://schemas.microsoft.com/office/word/2010/wordprocessingCanvas" xmlns:cx="http://schemas.microsoft.com/office/drawing/2014/chartex" xmlns:cx1="http://schemas.microsoft.com/office/drawing/2015/9/8/chartex" xmlns:cx2="http://schemas.microsoft.com/office/drawing/2015/10/21/chartex" xmlns:cx3="http://schemas.microsoft.com/office/drawing/2016/5/9/chartex" xmlns:cx4="http://schemas.microsoft.com/office/drawing/2016/5/10/chartex" xmlns:cx5="http://schemas.microsoft.com/office/drawing/2016/5/11/chartex" xmlns:cx6="http://schemas.microsoft.com/office/drawing/2016/5/12/chartex" xmlns:cx7="http://schemas.microsoft.com/office/drawing/2016/5/13/chartex" xmlns:cx8="http://schemas.microsoft.com/office/drawing/2016/5/14/chartex" xmlns:mc="http://schemas.openxmlformats.org/markup-compatibility/2006" xmlns:aink="http://schemas.microsoft.com/office/drawing/2016/ink" xmlns:am3d="http://schemas.microsoft.com/office/drawing/2017/model3d" xmlns:o="urn:schemas-microsoft-com:office:office" xmlns:oel="http://schemas.microsoft.com/office/2019/extlst" xmlns:r="http://schemas.openxmlformats.org/officeDocument/2006/relationships" xmlns:m="http://schemas.openxmlformats.org/officeDocument/2006/math" xmlns:v="urn:schemas-microsoft-com:vml" xmlns:wp14="http://schemas.microsoft.com/office/word/2010/wordprocessingDrawing" xmlns:wp="http://schemas.openxmlformats.org/drawingml/2006/wordprocessingDrawing" xmlns:w10="urn:schemas-microsoft-com:office:word" xmlns:w="http://schemas.openxmlformats.org/wordprocessingml/2006/main" xmlns:w14="http://schemas.microsoft.com/office/word/2010/wordml" xmlns:w15="http://schemas.microsoft.com/office/word/2012/wordml" xmlns:w16cex="http://schemas.microsoft.com/office/word/2018/wordml/cex" xmlns:w16cid="http://schemas.microsoft.com/office/word/2016/wordml/cid" xmlns:w16="http://schemas.microsoft.com/office/word/2018/wordml" xmlns:w16du="http://schemas.microsoft.com/office/word/2023/wordml/word16du" xmlns:w16sdtdh="http://schemas.microsoft.com/office/word/2020/wordml/sdtdatahash" xmlns:w16sdtfl="http://schemas.microsoft.com/office/word/2024/wordml/sdtformatlock" xmlns:w16se="http://schemas.microsoft.com/office/word/2015/wordml/symex" xmlns:wpg="http://schemas.microsoft.com/office/word/2010/wordprocessingGroup" xmlns:wpi="http://schemas.microsoft.com/office/word/2010/wordprocessingInk" xmlns:wne="http://schemas.microsoft.com/office/word/2006/wordml" xmlns:wps="http://schemas.microsoft.com/office/word/2010/wordprocessingShape" mc:Ignorable="w14 w15 w16se w16cid w16 w16cex w16sdtdh w16sdtfl w16du wp14">
   <w:p>
     <w:pPr>
       <w:spacing w:line="360" w:lineRule="auto"/>
       <w:jc w:val="center"/>
+      <w:rPr>
+        <w:rFonts w:hint="eastAsia"/>
+      </w:rPr>
     </w:pPr>
     <w:r>
       <w:rPr>
@@ -7579,7 +6999,7 @@
 </file>
 
 <file path=word/numbering.xml><?xml version="1.0" encoding="utf-8"?>
-<w:numbering xmlns:wpc="http://schemas.microsoft.com/office/word/2010/wordprocessingCanvas" xmlns:cx="http://schemas.microsoft.com/office/drawing/2014/chartex" xmlns:cx1="http://schemas.microsoft.com/office/drawing/2015/9/8/chartex" xmlns:cx2="http://schemas.microsoft.com/office/drawing/2015/10/21/chartex" xmlns:cx3="http://schemas.microsoft.com/office/drawing/2016/5/9/chartex" xmlns:cx4="http://schemas.microsoft.com/office/drawing/2016/5/10/chartex" xmlns:cx5="http://schemas.microsoft.com/office/drawing/2016/5/11/chartex" xmlns:cx6="http://schemas.microsoft.com/office/drawing/2016/5/12/chartex" xmlns:cx7="http://schemas.microsoft.com/office/drawing/2016/5/13/chartex" xmlns:cx8="http://schemas.microsoft.com/office/drawing/2016/5/14/chartex" xmlns:mc="http://schemas.openxmlformats.org/markup-compatibility/2006" xmlns:aink="http://schemas.microsoft.com/office/drawing/2016/ink" xmlns:am3d="http://schemas.microsoft.com/office/drawing/2017/model3d" xmlns:o="urn:schemas-microsoft-com:office:office" xmlns:oel="http://schemas.microsoft.com/office/2019/extlst" xmlns:r="http://schemas.openxmlformats.org/officeDocument/2006/relationships" xmlns:m="http://schemas.openxmlformats.org/officeDocument/2006/math" xmlns:v="urn:schemas-microsoft-com:vml" xmlns:wp14="http://schemas.microsoft.com/office/word/2010/wordprocessingDrawing" xmlns:wp="http://schemas.openxmlformats.org/drawingml/2006/wordprocessingDrawing" xmlns:w10="urn:schemas-microsoft-com:office:word" xmlns:w="http://schemas.openxmlformats.org/wordprocessingml/2006/main" xmlns:w14="http://schemas.microsoft.com/office/word/2010/wordml" xmlns:w15="http://schemas.microsoft.com/office/word/2012/wordml" xmlns:w16cex="http://schemas.microsoft.com/office/word/2018/wordml/cex" xmlns:w16cid="http://schemas.microsoft.com/office/word/2016/wordml/cid" xmlns:w16="http://schemas.microsoft.com/office/word/2018/wordml" xmlns:w16du="http://schemas.microsoft.com/office/word/2023/wordml/word16du" xmlns:w16sdtdh="http://schemas.microsoft.com/office/word/2020/wordml/sdtdatahash" xmlns:w16se="http://schemas.microsoft.com/office/word/2015/wordml/symex" xmlns:wpg="http://schemas.microsoft.com/office/word/2010/wordprocessingGroup" xmlns:wpi="http://schemas.microsoft.com/office/word/2010/wordprocessingInk" xmlns:wne="http://schemas.microsoft.com/office/word/2006/wordml" xmlns:wps="http://schemas.microsoft.com/office/word/2010/wordprocessingShape" mc:Ignorable="w14 w15 w16se w16cid w16 w16cex w16sdtdh w16du wp14">
+<w:numbering xmlns:wpc="http://schemas.microsoft.com/office/word/2010/wordprocessingCanvas" xmlns:cx="http://schemas.microsoft.com/office/drawing/2014/chartex" xmlns:cx1="http://schemas.microsoft.com/office/drawing/2015/9/8/chartex" xmlns:cx2="http://schemas.microsoft.com/office/drawing/2015/10/21/chartex" xmlns:cx3="http://schemas.microsoft.com/office/drawing/2016/5/9/chartex" xmlns:cx4="http://schemas.microsoft.com/office/drawing/2016/5/10/chartex" xmlns:cx5="http://schemas.microsoft.com/office/drawing/2016/5/11/chartex" xmlns:cx6="http://schemas.microsoft.com/office/drawing/2016/5/12/chartex" xmlns:cx7="http://schemas.microsoft.com/office/drawing/2016/5/13/chartex" xmlns:cx8="http://schemas.microsoft.com/office/drawing/2016/5/14/chartex" xmlns:mc="http://schemas.openxmlformats.org/markup-compatibility/2006" xmlns:aink="http://schemas.microsoft.com/office/drawing/2016/ink" xmlns:am3d="http://schemas.microsoft.com/office/drawing/2017/model3d" xmlns:o="urn:schemas-microsoft-com:office:office" xmlns:oel="http://schemas.microsoft.com/office/2019/extlst" xmlns:r="http://schemas.openxmlformats.org/officeDocument/2006/relationships" xmlns:m="http://schemas.openxmlformats.org/officeDocument/2006/math" xmlns:v="urn:schemas-microsoft-com:vml" xmlns:wp14="http://schemas.microsoft.com/office/word/2010/wordprocessingDrawing" xmlns:wp="http://schemas.openxmlformats.org/drawingml/2006/wordprocessingDrawing" xmlns:w10="urn:schemas-microsoft-com:office:word" xmlns:w="http://schemas.openxmlformats.org/wordprocessingml/2006/main" xmlns:w14="http://schemas.microsoft.com/office/word/2010/wordml" xmlns:w15="http://schemas.microsoft.com/office/word/2012/wordml" xmlns:w16cex="http://schemas.microsoft.com/office/word/2018/wordml/cex" xmlns:w16cid="http://schemas.microsoft.com/office/word/2016/wordml/cid" xmlns:w16="http://schemas.microsoft.com/office/word/2018/wordml" xmlns:w16du="http://schemas.microsoft.com/office/word/2023/wordml/word16du" xmlns:w16sdtdh="http://schemas.microsoft.com/office/word/2020/wordml/sdtdatahash" xmlns:w16sdtfl="http://schemas.microsoft.com/office/word/2024/wordml/sdtformatlock" xmlns:w16se="http://schemas.microsoft.com/office/word/2015/wordml/symex" xmlns:wpg="http://schemas.microsoft.com/office/word/2010/wordprocessingGroup" xmlns:wpi="http://schemas.microsoft.com/office/word/2010/wordprocessingInk" xmlns:wne="http://schemas.microsoft.com/office/word/2006/wordml" xmlns:wps="http://schemas.microsoft.com/office/word/2010/wordprocessingShape" mc:Ignorable="w14 w15 w16se w16cid w16 w16cex w16sdtdh w16sdtfl w16du wp14">
   <w:abstractNum w:abstractNumId="0" w15:restartNumberingAfterBreak="0">
     <w:nsid w:val="849681CA"/>
     <w:multiLevelType w:val="singleLevel"/>
@@ -7760,7 +7180,7 @@
 </file>
 
 <file path=word/styles.xml><?xml version="1.0" encoding="utf-8"?>
-<w:styles xmlns:mc="http://schemas.openxmlformats.org/markup-compatibility/2006" xmlns:r="http://schemas.openxmlformats.org/officeDocument/2006/relationships" xmlns:w="http://schemas.openxmlformats.org/wordprocessingml/2006/main" xmlns:w14="http://schemas.microsoft.com/office/word/2010/wordml" xmlns:w15="http://schemas.microsoft.com/office/word/2012/wordml" xmlns:w16cex="http://schemas.microsoft.com/office/word/2018/wordml/cex" xmlns:w16cid="http://schemas.microsoft.com/office/word/2016/wordml/cid" xmlns:w16="http://schemas.microsoft.com/office/word/2018/wordml" xmlns:w16du="http://schemas.microsoft.com/office/word/2023/wordml/word16du" xmlns:w16sdtdh="http://schemas.microsoft.com/office/word/2020/wordml/sdtdatahash" xmlns:w16se="http://schemas.microsoft.com/office/word/2015/wordml/symex" mc:Ignorable="w14 w15 w16se w16cid w16 w16cex w16sdtdh w16du">
+<w:styles xmlns:mc="http://schemas.openxmlformats.org/markup-compatibility/2006" xmlns:r="http://schemas.openxmlformats.org/officeDocument/2006/relationships" xmlns:w="http://schemas.openxmlformats.org/wordprocessingml/2006/main" xmlns:w14="http://schemas.microsoft.com/office/word/2010/wordml" xmlns:w15="http://schemas.microsoft.com/office/word/2012/wordml" xmlns:w16cex="http://schemas.microsoft.com/office/word/2018/wordml/cex" xmlns:w16cid="http://schemas.microsoft.com/office/word/2016/wordml/cid" xmlns:w16="http://schemas.microsoft.com/office/word/2018/wordml" xmlns:w16du="http://schemas.microsoft.com/office/word/2023/wordml/word16du" xmlns:w16sdtdh="http://schemas.microsoft.com/office/word/2020/wordml/sdtdatahash" xmlns:w16sdtfl="http://schemas.microsoft.com/office/word/2024/wordml/sdtformatlock" xmlns:w16se="http://schemas.microsoft.com/office/word/2015/wordml/symex" mc:Ignorable="w14 w15 w16se w16cid w16 w16cex w16sdtdh w16sdtfl w16du">
   <w:docDefaults>
     <w:rPrDefault>
       <w:rPr>

</xml_diff>